<commit_message>
Updated extra work upto week 7
</commit_message>
<xml_diff>
--- a/NLP EXTRAWORK.docx
+++ b/NLP EXTRAWORK.docx
@@ -1,6 +1,6 @@
 
 <file path=word/document.xml><?xml version="1.0" encoding="utf-8"?>
-<w:document xmlns:wpc="http://schemas.microsoft.com/office/word/2010/wordprocessingCanvas" xmlns:cx="http://schemas.microsoft.com/office/drawing/2014/chartex" xmlns:cx1="http://schemas.microsoft.com/office/drawing/2015/9/8/chartex" xmlns:mc="http://schemas.openxmlformats.org/markup-compatibility/2006" xmlns:o="urn:schemas-microsoft-com:office:office" xmlns:r="http://schemas.openxmlformats.org/officeDocument/2006/relationships" xmlns:m="http://schemas.openxmlformats.org/officeDocument/2006/math" xmlns:v="urn:schemas-microsoft-com:vml" xmlns:wp14="http://schemas.microsoft.com/office/word/2010/wordprocessingDrawing" xmlns:wp="http://schemas.openxmlformats.org/drawingml/2006/wordprocessingDrawing" xmlns:w10="urn:schemas-microsoft-com:office:word" xmlns:w="http://schemas.openxmlformats.org/wordprocessingml/2006/main" xmlns:w14="http://schemas.microsoft.com/office/word/2010/wordml" xmlns:w15="http://schemas.microsoft.com/office/word/2012/wordml" xmlns:w16se="http://schemas.microsoft.com/office/word/2015/wordml/symex" xmlns:wpg="http://schemas.microsoft.com/office/word/2010/wordprocessingGroup" xmlns:wpi="http://schemas.microsoft.com/office/word/2010/wordprocessingInk" xmlns:wne="http://schemas.microsoft.com/office/word/2006/wordml" xmlns:wps="http://schemas.microsoft.com/office/word/2010/wordprocessingShape" mc:Ignorable="w14 w15 w16se wp14">
+<w:document xmlns:wpc="http://schemas.microsoft.com/office/word/2010/wordprocessingCanvas" xmlns:cx="http://schemas.microsoft.com/office/drawing/2014/chartex" xmlns:cx1="http://schemas.microsoft.com/office/drawing/2015/9/8/chartex" xmlns:cx2="http://schemas.microsoft.com/office/drawing/2015/10/21/chartex" xmlns:cx3="http://schemas.microsoft.com/office/drawing/2016/5/9/chartex" xmlns:cx4="http://schemas.microsoft.com/office/drawing/2016/5/10/chartex" xmlns:cx5="http://schemas.microsoft.com/office/drawing/2016/5/11/chartex" xmlns:cx6="http://schemas.microsoft.com/office/drawing/2016/5/12/chartex" xmlns:cx7="http://schemas.microsoft.com/office/drawing/2016/5/13/chartex" xmlns:cx8="http://schemas.microsoft.com/office/drawing/2016/5/14/chartex" xmlns:mc="http://schemas.openxmlformats.org/markup-compatibility/2006" xmlns:aink="http://schemas.microsoft.com/office/drawing/2016/ink" xmlns:am3d="http://schemas.microsoft.com/office/drawing/2017/model3d" xmlns:o="urn:schemas-microsoft-com:office:office" xmlns:oel="http://schemas.microsoft.com/office/2019/extlst" xmlns:r="http://schemas.openxmlformats.org/officeDocument/2006/relationships" xmlns:m="http://schemas.openxmlformats.org/officeDocument/2006/math" xmlns:v="urn:schemas-microsoft-com:vml" xmlns:wp14="http://schemas.microsoft.com/office/word/2010/wordprocessingDrawing" xmlns:wp="http://schemas.openxmlformats.org/drawingml/2006/wordprocessingDrawing" xmlns:w10="urn:schemas-microsoft-com:office:word" xmlns:w="http://schemas.openxmlformats.org/wordprocessingml/2006/main" xmlns:w14="http://schemas.microsoft.com/office/word/2010/wordml" xmlns:w15="http://schemas.microsoft.com/office/word/2012/wordml" xmlns:w16cex="http://schemas.microsoft.com/office/word/2018/wordml/cex" xmlns:w16cid="http://schemas.microsoft.com/office/word/2016/wordml/cid" xmlns:w16="http://schemas.microsoft.com/office/word/2018/wordml" xmlns:w16du="http://schemas.microsoft.com/office/word/2023/wordml/word16du" xmlns:w16sdtdh="http://schemas.microsoft.com/office/word/2020/wordml/sdtdatahash" xmlns:w16sdtfl="http://schemas.microsoft.com/office/word/2024/wordml/sdtformatlock" xmlns:w16se="http://schemas.microsoft.com/office/word/2015/wordml/symex" xmlns:wpg="http://schemas.microsoft.com/office/word/2010/wordprocessingGroup" xmlns:wpi="http://schemas.microsoft.com/office/word/2010/wordprocessingInk" xmlns:wne="http://schemas.microsoft.com/office/word/2006/wordml" xmlns:wps="http://schemas.microsoft.com/office/word/2010/wordprocessingShape" mc:Ignorable="w14 w15 w16se w16cid w16 w16cex w16sdtdh w16sdtfl w16du wp14">
   <w:body>
     <w:p>
       <w:pPr>
@@ -75,7 +75,7 @@
           <w:sz w:val="24"/>
           <w:szCs w:val="24"/>
         </w:rPr>
-        <w:t xml:space="preserve">Student Name: Faith </w:t>
+        <w:t xml:space="preserve">Student Name: Faith Wanja </w:t>
       </w:r>
       <w:proofErr w:type="spellStart"/>
       <w:r>
@@ -84,16 +84,110 @@
           <w:sz w:val="24"/>
           <w:szCs w:val="24"/>
         </w:rPr>
-        <w:t>Wanja</w:t>
+        <w:t>Gichure</w:t>
       </w:r>
       <w:proofErr w:type="spellEnd"/>
-      <w:r>
-        <w:rPr>
-          <w:rFonts w:ascii="Times New Roman" w:hAnsi="Times New Roman" w:cs="Times New Roman"/>
-          <w:sz w:val="24"/>
-          <w:szCs w:val="24"/>
-        </w:rPr>
-        <w:t xml:space="preserve"> </w:t>
+    </w:p>
+    <w:p>
+      <w:pPr>
+        <w:rPr>
+          <w:rFonts w:ascii="Times New Roman" w:hAnsi="Times New Roman" w:cs="Times New Roman"/>
+          <w:sz w:val="24"/>
+          <w:szCs w:val="24"/>
+        </w:rPr>
+      </w:pPr>
+      <w:r>
+        <w:rPr>
+          <w:rFonts w:ascii="Times New Roman" w:hAnsi="Times New Roman" w:cs="Times New Roman"/>
+          <w:sz w:val="24"/>
+          <w:szCs w:val="24"/>
+        </w:rPr>
+        <w:t>Admission Number: BSCCS/2024/31978</w:t>
+      </w:r>
+    </w:p>
+    <w:p>
+      <w:pPr>
+        <w:rPr>
+          <w:rFonts w:ascii="Times New Roman" w:hAnsi="Times New Roman" w:cs="Times New Roman"/>
+          <w:sz w:val="24"/>
+          <w:szCs w:val="24"/>
+        </w:rPr>
+      </w:pPr>
+      <w:r>
+        <w:rPr>
+          <w:rFonts w:ascii="Times New Roman" w:hAnsi="Times New Roman" w:cs="Times New Roman"/>
+          <w:sz w:val="24"/>
+          <w:szCs w:val="24"/>
+        </w:rPr>
+        <w:t>Unit Code: BIT4133</w:t>
+      </w:r>
+    </w:p>
+    <w:p>
+      <w:pPr>
+        <w:rPr>
+          <w:rFonts w:ascii="Times New Roman" w:hAnsi="Times New Roman" w:cs="Times New Roman"/>
+          <w:sz w:val="24"/>
+          <w:szCs w:val="24"/>
+        </w:rPr>
+      </w:pPr>
+      <w:r>
+        <w:rPr>
+          <w:rFonts w:ascii="Times New Roman" w:hAnsi="Times New Roman" w:cs="Times New Roman"/>
+          <w:sz w:val="24"/>
+          <w:szCs w:val="24"/>
+        </w:rPr>
+        <w:t>Unit Name: Natural Language Processing with Deep Learning</w:t>
+      </w:r>
+    </w:p>
+    <w:p>
+      <w:pPr>
+        <w:rPr>
+          <w:rFonts w:ascii="Times New Roman" w:hAnsi="Times New Roman" w:cs="Times New Roman"/>
+          <w:sz w:val="24"/>
+          <w:szCs w:val="24"/>
+        </w:rPr>
+      </w:pPr>
+      <w:r>
+        <w:rPr>
+          <w:rFonts w:ascii="Times New Roman" w:hAnsi="Times New Roman" w:cs="Times New Roman"/>
+          <w:sz w:val="24"/>
+          <w:szCs w:val="24"/>
+        </w:rPr>
+        <w:t>NLP Extra Work</w:t>
+      </w:r>
+    </w:p>
+    <w:p>
+      <w:pPr>
+        <w:rPr>
+          <w:rFonts w:ascii="Times New Roman" w:hAnsi="Times New Roman" w:cs="Times New Roman"/>
+          <w:sz w:val="24"/>
+          <w:szCs w:val="24"/>
+        </w:rPr>
+      </w:pPr>
+      <w:r>
+        <w:rPr>
+          <w:rFonts w:ascii="Times New Roman" w:hAnsi="Times New Roman" w:cs="Times New Roman"/>
+          <w:sz w:val="24"/>
+          <w:szCs w:val="24"/>
+        </w:rPr>
+        <w:t>NLP Project Title: SMS Spam Detection System</w:t>
+      </w:r>
+    </w:p>
+    <w:p>
+      <w:pPr>
+        <w:rPr>
+          <w:rFonts w:ascii="Times New Roman" w:hAnsi="Times New Roman" w:cs="Times New Roman"/>
+          <w:sz w:val="24"/>
+          <w:szCs w:val="24"/>
+        </w:rPr>
+      </w:pPr>
+      <w:r>
+        <w:rPr>
+          <w:rFonts w:ascii="Times New Roman" w:hAnsi="Times New Roman" w:cs="Times New Roman"/>
+          <w:sz w:val="24"/>
+          <w:szCs w:val="24"/>
+        </w:rPr>
+        <w:t xml:space="preserve">Technologies Used: Python, NLTK, Scikit-learn, Google </w:t>
       </w:r>
       <w:proofErr w:type="spellStart"/>
       <w:r>
@@ -102,159 +196,17 @@
           <w:sz w:val="24"/>
           <w:szCs w:val="24"/>
         </w:rPr>
-        <w:t>Gichure</w:t>
+        <w:t>Colab</w:t>
       </w:r>
       <w:proofErr w:type="spellEnd"/>
-    </w:p>
-    <w:p>
-      <w:pPr>
-        <w:rPr>
-          <w:rFonts w:ascii="Times New Roman" w:hAnsi="Times New Roman" w:cs="Times New Roman"/>
-          <w:sz w:val="24"/>
-          <w:szCs w:val="24"/>
-        </w:rPr>
-      </w:pPr>
-      <w:r>
-        <w:rPr>
-          <w:rFonts w:ascii="Times New Roman" w:hAnsi="Times New Roman" w:cs="Times New Roman"/>
-          <w:sz w:val="24"/>
-          <w:szCs w:val="24"/>
-        </w:rPr>
-        <w:t>Admission Number: BSCCS/2024/31978</w:t>
-      </w:r>
-    </w:p>
-    <w:p>
-      <w:pPr>
-        <w:rPr>
-          <w:rFonts w:ascii="Times New Roman" w:hAnsi="Times New Roman" w:cs="Times New Roman"/>
-          <w:sz w:val="24"/>
-          <w:szCs w:val="24"/>
-        </w:rPr>
-      </w:pPr>
-      <w:r>
-        <w:rPr>
-          <w:rFonts w:ascii="Times New Roman" w:hAnsi="Times New Roman" w:cs="Times New Roman"/>
-          <w:sz w:val="24"/>
-          <w:szCs w:val="24"/>
-        </w:rPr>
-        <w:t>Unit Code: BIT4133</w:t>
-      </w:r>
-    </w:p>
-    <w:p>
-      <w:pPr>
-        <w:rPr>
-          <w:rFonts w:ascii="Times New Roman" w:hAnsi="Times New Roman" w:cs="Times New Roman"/>
-          <w:sz w:val="24"/>
-          <w:szCs w:val="24"/>
-        </w:rPr>
-      </w:pPr>
-      <w:r>
-        <w:rPr>
-          <w:rFonts w:ascii="Times New Roman" w:hAnsi="Times New Roman" w:cs="Times New Roman"/>
-          <w:sz w:val="24"/>
-          <w:szCs w:val="24"/>
-        </w:rPr>
-        <w:t>Unit Name: Natural Language Processing with Deep Learning</w:t>
-      </w:r>
-    </w:p>
-    <w:p>
-      <w:pPr>
-        <w:rPr>
-          <w:rFonts w:ascii="Times New Roman" w:hAnsi="Times New Roman" w:cs="Times New Roman"/>
-          <w:sz w:val="24"/>
-          <w:szCs w:val="24"/>
-        </w:rPr>
-      </w:pPr>
-      <w:r>
-        <w:rPr>
-          <w:rFonts w:ascii="Times New Roman" w:hAnsi="Times New Roman" w:cs="Times New Roman"/>
-          <w:sz w:val="24"/>
-          <w:szCs w:val="24"/>
-        </w:rPr>
-        <w:t>NLP Extra Work</w:t>
-      </w:r>
-      <w:bookmarkStart w:id="0" w:name="_GoBack"/>
-      <w:bookmarkEnd w:id="0"/>
-    </w:p>
-    <w:p>
-      <w:pPr>
-        <w:rPr>
-          <w:rFonts w:ascii="Times New Roman" w:hAnsi="Times New Roman" w:cs="Times New Roman"/>
-          <w:sz w:val="24"/>
-          <w:szCs w:val="24"/>
-        </w:rPr>
-      </w:pPr>
-      <w:r>
-        <w:rPr>
-          <w:rFonts w:ascii="Times New Roman" w:hAnsi="Times New Roman" w:cs="Times New Roman"/>
-          <w:sz w:val="24"/>
-          <w:szCs w:val="24"/>
-        </w:rPr>
-        <w:t>NLP Project Title: SMS Spam Detection System</w:t>
-      </w:r>
-    </w:p>
-    <w:p>
-      <w:pPr>
-        <w:rPr>
-          <w:rFonts w:ascii="Times New Roman" w:hAnsi="Times New Roman" w:cs="Times New Roman"/>
-          <w:sz w:val="24"/>
-          <w:szCs w:val="24"/>
-        </w:rPr>
-      </w:pPr>
-      <w:r>
-        <w:rPr>
-          <w:rFonts w:ascii="Times New Roman" w:hAnsi="Times New Roman" w:cs="Times New Roman"/>
-          <w:sz w:val="24"/>
-          <w:szCs w:val="24"/>
-        </w:rPr>
-        <w:t xml:space="preserve">Technologies Used: Python, NLTK, </w:t>
-      </w:r>
-      <w:proofErr w:type="spellStart"/>
-      <w:r>
-        <w:rPr>
-          <w:rFonts w:ascii="Times New Roman" w:hAnsi="Times New Roman" w:cs="Times New Roman"/>
-          <w:sz w:val="24"/>
-          <w:szCs w:val="24"/>
-        </w:rPr>
-        <w:t>Scikit</w:t>
-      </w:r>
-      <w:proofErr w:type="spellEnd"/>
-      <w:r>
-        <w:rPr>
-          <w:rFonts w:ascii="Times New Roman" w:hAnsi="Times New Roman" w:cs="Times New Roman"/>
-          <w:sz w:val="24"/>
-          <w:szCs w:val="24"/>
-        </w:rPr>
-        <w:t xml:space="preserve">-learn, Google </w:t>
-      </w:r>
-      <w:proofErr w:type="spellStart"/>
-      <w:r>
-        <w:rPr>
-          <w:rFonts w:ascii="Times New Roman" w:hAnsi="Times New Roman" w:cs="Times New Roman"/>
-          <w:sz w:val="24"/>
-          <w:szCs w:val="24"/>
-        </w:rPr>
-        <w:t>Colab</w:t>
-      </w:r>
-      <w:proofErr w:type="spellEnd"/>
-      <w:r>
-        <w:rPr>
-          <w:rFonts w:ascii="Times New Roman" w:hAnsi="Times New Roman" w:cs="Times New Roman"/>
-          <w:sz w:val="24"/>
-          <w:szCs w:val="24"/>
-        </w:rPr>
-        <w:t xml:space="preserve">, Pandas, </w:t>
-      </w:r>
-      <w:proofErr w:type="spellStart"/>
-      <w:r>
-        <w:rPr>
-          <w:rFonts w:ascii="Times New Roman" w:hAnsi="Times New Roman" w:cs="Times New Roman"/>
-          <w:sz w:val="24"/>
-          <w:szCs w:val="24"/>
-        </w:rPr>
-        <w:t>Matplotlib</w:t>
-      </w:r>
-      <w:proofErr w:type="spellEnd"/>
+      <w:r>
+        <w:rPr>
+          <w:rFonts w:ascii="Times New Roman" w:hAnsi="Times New Roman" w:cs="Times New Roman"/>
+          <w:sz w:val="24"/>
+          <w:szCs w:val="24"/>
+        </w:rPr>
+        <w:t>, Pandas, Matplotlib</w:t>
+      </w:r>
     </w:p>
     <w:p>
       <w:pPr>
@@ -485,6 +437,11 @@
             <w:rPr>
               <w:rFonts w:eastAsiaTheme="minorEastAsia"/>
               <w:noProof/>
+              <w:kern w:val="2"/>
+              <w:sz w:val="24"/>
+              <w:szCs w:val="24"/>
+              <w:lang w:val="en-KE" w:eastAsia="en-KE"/>
+              <w14:ligatures w14:val="standardContextual"/>
             </w:rPr>
           </w:pPr>
           <w:r>
@@ -496,7 +453,7 @@
           <w:r>
             <w:fldChar w:fldCharType="separate"/>
           </w:r>
-          <w:hyperlink w:anchor="_Toc230952843" w:history="1">
+          <w:hyperlink w:anchor="_Toc232646203" w:history="1">
             <w:r>
               <w:rPr>
                 <w:rStyle w:val="Hyperlink"/>
@@ -504,7 +461,7 @@
                 <w:b/>
                 <w:noProof/>
               </w:rPr>
-              <w:t>EXTRA WORK SECTION 1</w:t>
+              <w:t>EXTRA WORK SECTION 1 WEEK I &amp; 2</w:t>
             </w:r>
             <w:r>
               <w:rPr>
@@ -525,7 +482,7 @@
                 <w:noProof/>
                 <w:webHidden/>
               </w:rPr>
-              <w:instrText xml:space="preserve"> PAGEREF _Toc230952843 \h </w:instrText>
+              <w:instrText xml:space="preserve"> PAGEREF _Toc232646203 \h </w:instrText>
             </w:r>
             <w:r>
               <w:rPr>
@@ -565,9 +522,14 @@
             <w:rPr>
               <w:rFonts w:eastAsiaTheme="minorEastAsia"/>
               <w:noProof/>
+              <w:kern w:val="2"/>
+              <w:sz w:val="24"/>
+              <w:szCs w:val="24"/>
+              <w:lang w:val="en-KE" w:eastAsia="en-KE"/>
+              <w14:ligatures w14:val="standardContextual"/>
             </w:rPr>
           </w:pPr>
-          <w:hyperlink w:anchor="_Toc230952844" w:history="1">
+          <w:hyperlink w:anchor="_Toc232646204" w:history="1">
             <w:r>
               <w:rPr>
                 <w:rStyle w:val="Hyperlink"/>
@@ -595,7 +557,7 @@
                 <w:noProof/>
                 <w:webHidden/>
               </w:rPr>
-              <w:instrText xml:space="preserve"> PAGEREF _Toc230952844 \h </w:instrText>
+              <w:instrText xml:space="preserve"> PAGEREF _Toc232646204 \h </w:instrText>
             </w:r>
             <w:r>
               <w:rPr>
@@ -635,9 +597,14 @@
             <w:rPr>
               <w:rFonts w:eastAsiaTheme="minorEastAsia"/>
               <w:noProof/>
+              <w:kern w:val="2"/>
+              <w:sz w:val="24"/>
+              <w:szCs w:val="24"/>
+              <w:lang w:val="en-KE" w:eastAsia="en-KE"/>
+              <w14:ligatures w14:val="standardContextual"/>
             </w:rPr>
           </w:pPr>
-          <w:hyperlink w:anchor="_Toc230952845" w:history="1">
+          <w:hyperlink w:anchor="_Toc232646205" w:history="1">
             <w:r>
               <w:rPr>
                 <w:rStyle w:val="Hyperlink"/>
@@ -665,7 +632,7 @@
                 <w:noProof/>
                 <w:webHidden/>
               </w:rPr>
-              <w:instrText xml:space="preserve"> PAGEREF _Toc230952845 \h </w:instrText>
+              <w:instrText xml:space="preserve"> PAGEREF _Toc232646205 \h </w:instrText>
             </w:r>
             <w:r>
               <w:rPr>
@@ -705,9 +672,14 @@
             <w:rPr>
               <w:rFonts w:eastAsiaTheme="minorEastAsia"/>
               <w:noProof/>
+              <w:kern w:val="2"/>
+              <w:sz w:val="24"/>
+              <w:szCs w:val="24"/>
+              <w:lang w:val="en-KE" w:eastAsia="en-KE"/>
+              <w14:ligatures w14:val="standardContextual"/>
             </w:rPr>
           </w:pPr>
-          <w:hyperlink w:anchor="_Toc230952846" w:history="1">
+          <w:hyperlink w:anchor="_Toc232646206" w:history="1">
             <w:r>
               <w:rPr>
                 <w:rStyle w:val="Hyperlink"/>
@@ -735,7 +707,7 @@
                 <w:noProof/>
                 <w:webHidden/>
               </w:rPr>
-              <w:instrText xml:space="preserve"> PAGEREF _Toc230952846 \h </w:instrText>
+              <w:instrText xml:space="preserve"> PAGEREF _Toc232646206 \h </w:instrText>
             </w:r>
             <w:r>
               <w:rPr>
@@ -775,9 +747,14 @@
             <w:rPr>
               <w:rFonts w:eastAsiaTheme="minorEastAsia"/>
               <w:noProof/>
+              <w:kern w:val="2"/>
+              <w:sz w:val="24"/>
+              <w:szCs w:val="24"/>
+              <w:lang w:val="en-KE" w:eastAsia="en-KE"/>
+              <w14:ligatures w14:val="standardContextual"/>
             </w:rPr>
           </w:pPr>
-          <w:hyperlink w:anchor="_Toc230952847" w:history="1">
+          <w:hyperlink w:anchor="_Toc232646207" w:history="1">
             <w:r>
               <w:rPr>
                 <w:rStyle w:val="Hyperlink"/>
@@ -805,7 +782,7 @@
                 <w:noProof/>
                 <w:webHidden/>
               </w:rPr>
-              <w:instrText xml:space="preserve"> PAGEREF _Toc230952847 \h </w:instrText>
+              <w:instrText xml:space="preserve"> PAGEREF _Toc232646207 \h </w:instrText>
             </w:r>
             <w:r>
               <w:rPr>
@@ -845,9 +822,14 @@
             <w:rPr>
               <w:rFonts w:eastAsiaTheme="minorEastAsia"/>
               <w:noProof/>
+              <w:kern w:val="2"/>
+              <w:sz w:val="24"/>
+              <w:szCs w:val="24"/>
+              <w:lang w:val="en-KE" w:eastAsia="en-KE"/>
+              <w14:ligatures w14:val="standardContextual"/>
             </w:rPr>
           </w:pPr>
-          <w:hyperlink w:anchor="_Toc230952848" w:history="1">
+          <w:hyperlink w:anchor="_Toc232646208" w:history="1">
             <w:r>
               <w:rPr>
                 <w:rStyle w:val="Hyperlink"/>
@@ -875,7 +857,7 @@
                 <w:noProof/>
                 <w:webHidden/>
               </w:rPr>
-              <w:instrText xml:space="preserve"> PAGEREF _Toc230952848 \h </w:instrText>
+              <w:instrText xml:space="preserve"> PAGEREF _Toc232646208 \h </w:instrText>
             </w:r>
             <w:r>
               <w:rPr>
@@ -915,9 +897,14 @@
             <w:rPr>
               <w:rFonts w:eastAsiaTheme="minorEastAsia"/>
               <w:noProof/>
+              <w:kern w:val="2"/>
+              <w:sz w:val="24"/>
+              <w:szCs w:val="24"/>
+              <w:lang w:val="en-KE" w:eastAsia="en-KE"/>
+              <w14:ligatures w14:val="standardContextual"/>
             </w:rPr>
           </w:pPr>
-          <w:hyperlink w:anchor="_Toc230952849" w:history="1">
+          <w:hyperlink w:anchor="_Toc232646209" w:history="1">
             <w:r>
               <w:rPr>
                 <w:rStyle w:val="Hyperlink"/>
@@ -925,7 +912,7 @@
                 <w:b/>
                 <w:noProof/>
               </w:rPr>
-              <w:t>EXTRAWORK SECTION 2</w:t>
+              <w:t>EXTRAWORK SECTION 2 WEEK 3 &amp; 2</w:t>
             </w:r>
             <w:r>
               <w:rPr>
@@ -946,7 +933,7 @@
                 <w:noProof/>
                 <w:webHidden/>
               </w:rPr>
-              <w:instrText xml:space="preserve"> PAGEREF _Toc230952849 \h </w:instrText>
+              <w:instrText xml:space="preserve"> PAGEREF _Toc232646209 \h </w:instrText>
             </w:r>
             <w:r>
               <w:rPr>
@@ -986,9 +973,14 @@
             <w:rPr>
               <w:rFonts w:eastAsiaTheme="minorEastAsia"/>
               <w:noProof/>
+              <w:kern w:val="2"/>
+              <w:sz w:val="24"/>
+              <w:szCs w:val="24"/>
+              <w:lang w:val="en-KE" w:eastAsia="en-KE"/>
+              <w14:ligatures w14:val="standardContextual"/>
             </w:rPr>
           </w:pPr>
-          <w:hyperlink w:anchor="_Toc230952850" w:history="1">
+          <w:hyperlink w:anchor="_Toc232646210" w:history="1">
             <w:r>
               <w:rPr>
                 <w:rStyle w:val="Hyperlink"/>
@@ -1016,7 +1008,7 @@
                 <w:noProof/>
                 <w:webHidden/>
               </w:rPr>
-              <w:instrText xml:space="preserve"> PAGEREF _Toc230952850 \h </w:instrText>
+              <w:instrText xml:space="preserve"> PAGEREF _Toc232646210 \h </w:instrText>
             </w:r>
             <w:r>
               <w:rPr>
@@ -1056,9 +1048,14 @@
             <w:rPr>
               <w:rFonts w:eastAsiaTheme="minorEastAsia"/>
               <w:noProof/>
+              <w:kern w:val="2"/>
+              <w:sz w:val="24"/>
+              <w:szCs w:val="24"/>
+              <w:lang w:val="en-KE" w:eastAsia="en-KE"/>
+              <w14:ligatures w14:val="standardContextual"/>
             </w:rPr>
           </w:pPr>
-          <w:hyperlink w:anchor="_Toc230952851" w:history="1">
+          <w:hyperlink w:anchor="_Toc232646211" w:history="1">
             <w:r>
               <w:rPr>
                 <w:rStyle w:val="Hyperlink"/>
@@ -1086,7 +1083,7 @@
                 <w:noProof/>
                 <w:webHidden/>
               </w:rPr>
-              <w:instrText xml:space="preserve"> PAGEREF _Toc230952851 \h </w:instrText>
+              <w:instrText xml:space="preserve"> PAGEREF _Toc232646211 \h </w:instrText>
             </w:r>
             <w:r>
               <w:rPr>
@@ -1126,9 +1123,14 @@
             <w:rPr>
               <w:rFonts w:eastAsiaTheme="minorEastAsia"/>
               <w:noProof/>
+              <w:kern w:val="2"/>
+              <w:sz w:val="24"/>
+              <w:szCs w:val="24"/>
+              <w:lang w:val="en-KE" w:eastAsia="en-KE"/>
+              <w14:ligatures w14:val="standardContextual"/>
             </w:rPr>
           </w:pPr>
-          <w:hyperlink w:anchor="_Toc230952852" w:history="1">
+          <w:hyperlink w:anchor="_Toc232646212" w:history="1">
             <w:r>
               <w:rPr>
                 <w:rStyle w:val="Hyperlink"/>
@@ -1156,7 +1158,7 @@
                 <w:noProof/>
                 <w:webHidden/>
               </w:rPr>
-              <w:instrText xml:space="preserve"> PAGEREF _Toc230952852 \h </w:instrText>
+              <w:instrText xml:space="preserve"> PAGEREF _Toc232646212 \h </w:instrText>
             </w:r>
             <w:r>
               <w:rPr>
@@ -1196,9 +1198,14 @@
             <w:rPr>
               <w:rFonts w:eastAsiaTheme="minorEastAsia"/>
               <w:noProof/>
+              <w:kern w:val="2"/>
+              <w:sz w:val="24"/>
+              <w:szCs w:val="24"/>
+              <w:lang w:val="en-KE" w:eastAsia="en-KE"/>
+              <w14:ligatures w14:val="standardContextual"/>
             </w:rPr>
           </w:pPr>
-          <w:hyperlink w:anchor="_Toc230952853" w:history="1">
+          <w:hyperlink w:anchor="_Toc232646213" w:history="1">
             <w:r>
               <w:rPr>
                 <w:rStyle w:val="Hyperlink"/>
@@ -1234,7 +1241,7 @@
                 <w:noProof/>
                 <w:webHidden/>
               </w:rPr>
-              <w:instrText xml:space="preserve"> PAGEREF _Toc230952853 \h </w:instrText>
+              <w:instrText xml:space="preserve"> PAGEREF _Toc232646213 \h </w:instrText>
             </w:r>
             <w:r>
               <w:rPr>
@@ -1274,9 +1281,14 @@
             <w:rPr>
               <w:rFonts w:eastAsiaTheme="minorEastAsia"/>
               <w:noProof/>
+              <w:kern w:val="2"/>
+              <w:sz w:val="24"/>
+              <w:szCs w:val="24"/>
+              <w:lang w:val="en-KE" w:eastAsia="en-KE"/>
+              <w14:ligatures w14:val="standardContextual"/>
             </w:rPr>
           </w:pPr>
-          <w:hyperlink w:anchor="_Toc230952854" w:history="1">
+          <w:hyperlink w:anchor="_Toc232646214" w:history="1">
             <w:r>
               <w:rPr>
                 <w:rStyle w:val="Hyperlink"/>
@@ -1304,7 +1316,7 @@
                 <w:noProof/>
                 <w:webHidden/>
               </w:rPr>
-              <w:instrText xml:space="preserve"> PAGEREF _Toc230952854 \h </w:instrText>
+              <w:instrText xml:space="preserve"> PAGEREF _Toc232646214 \h </w:instrText>
             </w:r>
             <w:r>
               <w:rPr>
@@ -1344,9 +1356,14 @@
             <w:rPr>
               <w:rFonts w:eastAsiaTheme="minorEastAsia"/>
               <w:noProof/>
+              <w:kern w:val="2"/>
+              <w:sz w:val="24"/>
+              <w:szCs w:val="24"/>
+              <w:lang w:val="en-KE" w:eastAsia="en-KE"/>
+              <w14:ligatures w14:val="standardContextual"/>
             </w:rPr>
           </w:pPr>
-          <w:hyperlink w:anchor="_Toc230952855" w:history="1">
+          <w:hyperlink w:anchor="_Toc232646215" w:history="1">
             <w:r>
               <w:rPr>
                 <w:rStyle w:val="Hyperlink"/>
@@ -1354,7 +1371,7 @@
                 <w:b/>
                 <w:noProof/>
               </w:rPr>
-              <w:t>EXTRAWORK SECTION 3</w:t>
+              <w:t>EXTRAWORK SECTION 3 WEEK 4</w:t>
             </w:r>
             <w:r>
               <w:rPr>
@@ -1375,7 +1392,7 @@
                 <w:noProof/>
                 <w:webHidden/>
               </w:rPr>
-              <w:instrText xml:space="preserve"> PAGEREF _Toc230952855 \h </w:instrText>
+              <w:instrText xml:space="preserve"> PAGEREF _Toc232646215 \h </w:instrText>
             </w:r>
             <w:r>
               <w:rPr>
@@ -1415,9 +1432,14 @@
             <w:rPr>
               <w:rFonts w:eastAsiaTheme="minorEastAsia"/>
               <w:noProof/>
+              <w:kern w:val="2"/>
+              <w:sz w:val="24"/>
+              <w:szCs w:val="24"/>
+              <w:lang w:val="en-KE" w:eastAsia="en-KE"/>
+              <w14:ligatures w14:val="standardContextual"/>
             </w:rPr>
           </w:pPr>
-          <w:hyperlink w:anchor="_Toc230952856" w:history="1">
+          <w:hyperlink w:anchor="_Toc232646216" w:history="1">
             <w:r>
               <w:rPr>
                 <w:rStyle w:val="Hyperlink"/>
@@ -1445,7 +1467,7 @@
                 <w:noProof/>
                 <w:webHidden/>
               </w:rPr>
-              <w:instrText xml:space="preserve"> PAGEREF _Toc230952856 \h </w:instrText>
+              <w:instrText xml:space="preserve"> PAGEREF _Toc232646216 \h </w:instrText>
             </w:r>
             <w:r>
               <w:rPr>
@@ -1485,9 +1507,14 @@
             <w:rPr>
               <w:rFonts w:eastAsiaTheme="minorEastAsia"/>
               <w:noProof/>
+              <w:kern w:val="2"/>
+              <w:sz w:val="24"/>
+              <w:szCs w:val="24"/>
+              <w:lang w:val="en-KE" w:eastAsia="en-KE"/>
+              <w14:ligatures w14:val="standardContextual"/>
             </w:rPr>
           </w:pPr>
-          <w:hyperlink w:anchor="_Toc230952857" w:history="1">
+          <w:hyperlink w:anchor="_Toc232646217" w:history="1">
             <w:r>
               <w:rPr>
                 <w:rStyle w:val="Hyperlink"/>
@@ -1515,7 +1542,7 @@
                 <w:noProof/>
                 <w:webHidden/>
               </w:rPr>
-              <w:instrText xml:space="preserve"> PAGEREF _Toc230952857 \h </w:instrText>
+              <w:instrText xml:space="preserve"> PAGEREF _Toc232646217 \h </w:instrText>
             </w:r>
             <w:r>
               <w:rPr>
@@ -1555,9 +1582,14 @@
             <w:rPr>
               <w:rFonts w:eastAsiaTheme="minorEastAsia"/>
               <w:noProof/>
+              <w:kern w:val="2"/>
+              <w:sz w:val="24"/>
+              <w:szCs w:val="24"/>
+              <w:lang w:val="en-KE" w:eastAsia="en-KE"/>
+              <w14:ligatures w14:val="standardContextual"/>
             </w:rPr>
           </w:pPr>
-          <w:hyperlink w:anchor="_Toc230952858" w:history="1">
+          <w:hyperlink w:anchor="_Toc232646218" w:history="1">
             <w:r>
               <w:rPr>
                 <w:rStyle w:val="Hyperlink"/>
@@ -1585,7 +1617,7 @@
                 <w:noProof/>
                 <w:webHidden/>
               </w:rPr>
-              <w:instrText xml:space="preserve"> PAGEREF _Toc230952858 \h </w:instrText>
+              <w:instrText xml:space="preserve"> PAGEREF _Toc232646218 \h </w:instrText>
             </w:r>
             <w:r>
               <w:rPr>
@@ -1625,9 +1657,14 @@
             <w:rPr>
               <w:rFonts w:eastAsiaTheme="minorEastAsia"/>
               <w:noProof/>
+              <w:kern w:val="2"/>
+              <w:sz w:val="24"/>
+              <w:szCs w:val="24"/>
+              <w:lang w:val="en-KE" w:eastAsia="en-KE"/>
+              <w14:ligatures w14:val="standardContextual"/>
             </w:rPr>
           </w:pPr>
-          <w:hyperlink w:anchor="_Toc230952859" w:history="1">
+          <w:hyperlink w:anchor="_Toc232646219" w:history="1">
             <w:r>
               <w:rPr>
                 <w:rStyle w:val="Hyperlink"/>
@@ -1655,7 +1692,7 @@
                 <w:noProof/>
                 <w:webHidden/>
               </w:rPr>
-              <w:instrText xml:space="preserve"> PAGEREF _Toc230952859 \h </w:instrText>
+              <w:instrText xml:space="preserve"> PAGEREF _Toc232646219 \h </w:instrText>
             </w:r>
             <w:r>
               <w:rPr>
@@ -1695,9 +1732,14 @@
             <w:rPr>
               <w:rFonts w:eastAsiaTheme="minorEastAsia"/>
               <w:noProof/>
+              <w:kern w:val="2"/>
+              <w:sz w:val="24"/>
+              <w:szCs w:val="24"/>
+              <w:lang w:val="en-KE" w:eastAsia="en-KE"/>
+              <w14:ligatures w14:val="standardContextual"/>
             </w:rPr>
           </w:pPr>
-          <w:hyperlink w:anchor="_Toc230952860" w:history="1">
+          <w:hyperlink w:anchor="_Toc232646220" w:history="1">
             <w:r>
               <w:rPr>
                 <w:rStyle w:val="Hyperlink"/>
@@ -1725,7 +1767,7 @@
                 <w:noProof/>
                 <w:webHidden/>
               </w:rPr>
-              <w:instrText xml:space="preserve"> PAGEREF _Toc230952860 \h </w:instrText>
+              <w:instrText xml:space="preserve"> PAGEREF _Toc232646220 \h </w:instrText>
             </w:r>
             <w:r>
               <w:rPr>
@@ -1765,9 +1807,14 @@
             <w:rPr>
               <w:rFonts w:eastAsiaTheme="minorEastAsia"/>
               <w:noProof/>
+              <w:kern w:val="2"/>
+              <w:sz w:val="24"/>
+              <w:szCs w:val="24"/>
+              <w:lang w:val="en-KE" w:eastAsia="en-KE"/>
+              <w14:ligatures w14:val="standardContextual"/>
             </w:rPr>
           </w:pPr>
-          <w:hyperlink w:anchor="_Toc230952861" w:history="1">
+          <w:hyperlink w:anchor="_Toc232646221" w:history="1">
             <w:r>
               <w:rPr>
                 <w:rStyle w:val="Hyperlink"/>
@@ -1775,7 +1822,7 @@
                 <w:b/>
                 <w:noProof/>
               </w:rPr>
-              <w:t>EXTRAWORK SECTION 4</w:t>
+              <w:t>EXTRAWORK SECTION 4 WEEK 5</w:t>
             </w:r>
             <w:r>
               <w:rPr>
@@ -1796,7 +1843,7 @@
                 <w:noProof/>
                 <w:webHidden/>
               </w:rPr>
-              <w:instrText xml:space="preserve"> PAGEREF _Toc230952861 \h </w:instrText>
+              <w:instrText xml:space="preserve"> PAGEREF _Toc232646221 \h </w:instrText>
             </w:r>
             <w:r>
               <w:rPr>
@@ -1836,9 +1883,14 @@
             <w:rPr>
               <w:rFonts w:eastAsiaTheme="minorEastAsia"/>
               <w:noProof/>
+              <w:kern w:val="2"/>
+              <w:sz w:val="24"/>
+              <w:szCs w:val="24"/>
+              <w:lang w:val="en-KE" w:eastAsia="en-KE"/>
+              <w14:ligatures w14:val="standardContextual"/>
             </w:rPr>
           </w:pPr>
-          <w:hyperlink w:anchor="_Toc230952862" w:history="1">
+          <w:hyperlink w:anchor="_Toc232646222" w:history="1">
             <w:r>
               <w:rPr>
                 <w:rStyle w:val="Hyperlink"/>
@@ -1866,7 +1918,7 @@
                 <w:noProof/>
                 <w:webHidden/>
               </w:rPr>
-              <w:instrText xml:space="preserve"> PAGEREF _Toc230952862 \h </w:instrText>
+              <w:instrText xml:space="preserve"> PAGEREF _Toc232646222 \h </w:instrText>
             </w:r>
             <w:r>
               <w:rPr>
@@ -1906,9 +1958,14 @@
             <w:rPr>
               <w:rFonts w:eastAsiaTheme="minorEastAsia"/>
               <w:noProof/>
+              <w:kern w:val="2"/>
+              <w:sz w:val="24"/>
+              <w:szCs w:val="24"/>
+              <w:lang w:val="en-KE" w:eastAsia="en-KE"/>
+              <w14:ligatures w14:val="standardContextual"/>
             </w:rPr>
           </w:pPr>
-          <w:hyperlink w:anchor="_Toc230952863" w:history="1">
+          <w:hyperlink w:anchor="_Toc232646223" w:history="1">
             <w:r>
               <w:rPr>
                 <w:rStyle w:val="Hyperlink"/>
@@ -1936,7 +1993,7 @@
                 <w:noProof/>
                 <w:webHidden/>
               </w:rPr>
-              <w:instrText xml:space="preserve"> PAGEREF _Toc230952863 \h </w:instrText>
+              <w:instrText xml:space="preserve"> PAGEREF _Toc232646223 \h </w:instrText>
             </w:r>
             <w:r>
               <w:rPr>
@@ -1976,9 +2033,14 @@
             <w:rPr>
               <w:rFonts w:eastAsiaTheme="minorEastAsia"/>
               <w:noProof/>
+              <w:kern w:val="2"/>
+              <w:sz w:val="24"/>
+              <w:szCs w:val="24"/>
+              <w:lang w:val="en-KE" w:eastAsia="en-KE"/>
+              <w14:ligatures w14:val="standardContextual"/>
             </w:rPr>
           </w:pPr>
-          <w:hyperlink w:anchor="_Toc230952864" w:history="1">
+          <w:hyperlink w:anchor="_Toc232646224" w:history="1">
             <w:r>
               <w:rPr>
                 <w:rStyle w:val="Hyperlink"/>
@@ -2006,7 +2068,7 @@
                 <w:noProof/>
                 <w:webHidden/>
               </w:rPr>
-              <w:instrText xml:space="preserve"> PAGEREF _Toc230952864 \h </w:instrText>
+              <w:instrText xml:space="preserve"> PAGEREF _Toc232646224 \h </w:instrText>
             </w:r>
             <w:r>
               <w:rPr>
@@ -2046,9 +2108,14 @@
             <w:rPr>
               <w:rFonts w:eastAsiaTheme="minorEastAsia"/>
               <w:noProof/>
+              <w:kern w:val="2"/>
+              <w:sz w:val="24"/>
+              <w:szCs w:val="24"/>
+              <w:lang w:val="en-KE" w:eastAsia="en-KE"/>
+              <w14:ligatures w14:val="standardContextual"/>
             </w:rPr>
           </w:pPr>
-          <w:hyperlink w:anchor="_Toc230952865" w:history="1">
+          <w:hyperlink w:anchor="_Toc232646225" w:history="1">
             <w:r>
               <w:rPr>
                 <w:rStyle w:val="Hyperlink"/>
@@ -2076,7 +2143,7 @@
                 <w:noProof/>
                 <w:webHidden/>
               </w:rPr>
-              <w:instrText xml:space="preserve"> PAGEREF _Toc230952865 \h </w:instrText>
+              <w:instrText xml:space="preserve"> PAGEREF _Toc232646225 \h </w:instrText>
             </w:r>
             <w:r>
               <w:rPr>
@@ -2097,6 +2164,458 @@
                 <w:webHidden/>
               </w:rPr>
               <w:t>14</w:t>
+            </w:r>
+            <w:r>
+              <w:rPr>
+                <w:noProof/>
+                <w:webHidden/>
+              </w:rPr>
+              <w:fldChar w:fldCharType="end"/>
+            </w:r>
+          </w:hyperlink>
+        </w:p>
+        <w:p>
+          <w:pPr>
+            <w:pStyle w:val="TOC1"/>
+            <w:tabs>
+              <w:tab w:val="right" w:leader="dot" w:pos="9350"/>
+            </w:tabs>
+            <w:rPr>
+              <w:rFonts w:eastAsiaTheme="minorEastAsia"/>
+              <w:noProof/>
+              <w:kern w:val="2"/>
+              <w:sz w:val="24"/>
+              <w:szCs w:val="24"/>
+              <w:lang w:val="en-KE" w:eastAsia="en-KE"/>
+              <w14:ligatures w14:val="standardContextual"/>
+            </w:rPr>
+          </w:pPr>
+          <w:hyperlink w:anchor="_Toc232646226" w:history="1">
+            <w:r>
+              <w:rPr>
+                <w:rStyle w:val="Hyperlink"/>
+                <w:rFonts w:ascii="Times New Roman" w:hAnsi="Times New Roman" w:cs="Times New Roman"/>
+                <w:b/>
+                <w:bCs/>
+                <w:noProof/>
+              </w:rPr>
+              <w:t>EXTRA WORK WEEK SECTION 5 WEEK 6 AND 7</w:t>
+            </w:r>
+            <w:r>
+              <w:rPr>
+                <w:noProof/>
+                <w:webHidden/>
+              </w:rPr>
+              <w:tab/>
+            </w:r>
+            <w:r>
+              <w:rPr>
+                <w:noProof/>
+                <w:webHidden/>
+              </w:rPr>
+              <w:fldChar w:fldCharType="begin"/>
+            </w:r>
+            <w:r>
+              <w:rPr>
+                <w:noProof/>
+                <w:webHidden/>
+              </w:rPr>
+              <w:instrText xml:space="preserve"> PAGEREF _Toc232646226 \h </w:instrText>
+            </w:r>
+            <w:r>
+              <w:rPr>
+                <w:noProof/>
+                <w:webHidden/>
+              </w:rPr>
+            </w:r>
+            <w:r>
+              <w:rPr>
+                <w:noProof/>
+                <w:webHidden/>
+              </w:rPr>
+              <w:fldChar w:fldCharType="separate"/>
+            </w:r>
+            <w:r>
+              <w:rPr>
+                <w:noProof/>
+                <w:webHidden/>
+              </w:rPr>
+              <w:t>15</w:t>
+            </w:r>
+            <w:r>
+              <w:rPr>
+                <w:noProof/>
+                <w:webHidden/>
+              </w:rPr>
+              <w:fldChar w:fldCharType="end"/>
+            </w:r>
+          </w:hyperlink>
+        </w:p>
+        <w:p>
+          <w:pPr>
+            <w:pStyle w:val="TOC2"/>
+            <w:tabs>
+              <w:tab w:val="right" w:leader="dot" w:pos="9350"/>
+            </w:tabs>
+            <w:rPr>
+              <w:rFonts w:eastAsiaTheme="minorEastAsia"/>
+              <w:noProof/>
+              <w:kern w:val="2"/>
+              <w:sz w:val="24"/>
+              <w:szCs w:val="24"/>
+              <w:lang w:val="en-KE" w:eastAsia="en-KE"/>
+              <w14:ligatures w14:val="standardContextual"/>
+            </w:rPr>
+          </w:pPr>
+          <w:hyperlink w:anchor="_Toc232646227" w:history="1">
+            <w:r>
+              <w:rPr>
+                <w:rStyle w:val="Hyperlink"/>
+                <w:rFonts w:ascii="Times New Roman" w:hAnsi="Times New Roman" w:cs="Times New Roman"/>
+                <w:noProof/>
+              </w:rPr>
+              <w:t>Fig 1= Word2Vec vs FastText vs GloVe</w:t>
+            </w:r>
+            <w:r>
+              <w:rPr>
+                <w:noProof/>
+                <w:webHidden/>
+              </w:rPr>
+              <w:tab/>
+            </w:r>
+            <w:r>
+              <w:rPr>
+                <w:noProof/>
+                <w:webHidden/>
+              </w:rPr>
+              <w:fldChar w:fldCharType="begin"/>
+            </w:r>
+            <w:r>
+              <w:rPr>
+                <w:noProof/>
+                <w:webHidden/>
+              </w:rPr>
+              <w:instrText xml:space="preserve"> PAGEREF _Toc232646227 \h </w:instrText>
+            </w:r>
+            <w:r>
+              <w:rPr>
+                <w:noProof/>
+                <w:webHidden/>
+              </w:rPr>
+            </w:r>
+            <w:r>
+              <w:rPr>
+                <w:noProof/>
+                <w:webHidden/>
+              </w:rPr>
+              <w:fldChar w:fldCharType="separate"/>
+            </w:r>
+            <w:r>
+              <w:rPr>
+                <w:noProof/>
+                <w:webHidden/>
+              </w:rPr>
+              <w:t>15</w:t>
+            </w:r>
+            <w:r>
+              <w:rPr>
+                <w:noProof/>
+                <w:webHidden/>
+              </w:rPr>
+              <w:fldChar w:fldCharType="end"/>
+            </w:r>
+          </w:hyperlink>
+        </w:p>
+        <w:p>
+          <w:pPr>
+            <w:pStyle w:val="TOC2"/>
+            <w:tabs>
+              <w:tab w:val="right" w:leader="dot" w:pos="9350"/>
+            </w:tabs>
+            <w:rPr>
+              <w:rFonts w:eastAsiaTheme="minorEastAsia"/>
+              <w:noProof/>
+              <w:kern w:val="2"/>
+              <w:sz w:val="24"/>
+              <w:szCs w:val="24"/>
+              <w:lang w:val="en-KE" w:eastAsia="en-KE"/>
+              <w14:ligatures w14:val="standardContextual"/>
+            </w:rPr>
+          </w:pPr>
+          <w:hyperlink w:anchor="_Toc232646228" w:history="1">
+            <w:r>
+              <w:rPr>
+                <w:rStyle w:val="Hyperlink"/>
+                <w:rFonts w:ascii="Times New Roman" w:hAnsi="Times New Roman" w:cs="Times New Roman"/>
+                <w:noProof/>
+              </w:rPr>
+              <w:t>Fig 2= Word Analogy Output</w:t>
+            </w:r>
+            <w:r>
+              <w:rPr>
+                <w:noProof/>
+                <w:webHidden/>
+              </w:rPr>
+              <w:tab/>
+            </w:r>
+            <w:r>
+              <w:rPr>
+                <w:noProof/>
+                <w:webHidden/>
+              </w:rPr>
+              <w:fldChar w:fldCharType="begin"/>
+            </w:r>
+            <w:r>
+              <w:rPr>
+                <w:noProof/>
+                <w:webHidden/>
+              </w:rPr>
+              <w:instrText xml:space="preserve"> PAGEREF _Toc232646228 \h </w:instrText>
+            </w:r>
+            <w:r>
+              <w:rPr>
+                <w:noProof/>
+                <w:webHidden/>
+              </w:rPr>
+            </w:r>
+            <w:r>
+              <w:rPr>
+                <w:noProof/>
+                <w:webHidden/>
+              </w:rPr>
+              <w:fldChar w:fldCharType="separate"/>
+            </w:r>
+            <w:r>
+              <w:rPr>
+                <w:noProof/>
+                <w:webHidden/>
+              </w:rPr>
+              <w:t>16</w:t>
+            </w:r>
+            <w:r>
+              <w:rPr>
+                <w:noProof/>
+                <w:webHidden/>
+              </w:rPr>
+              <w:fldChar w:fldCharType="end"/>
+            </w:r>
+          </w:hyperlink>
+        </w:p>
+        <w:p>
+          <w:pPr>
+            <w:pStyle w:val="TOC2"/>
+            <w:tabs>
+              <w:tab w:val="right" w:leader="dot" w:pos="9350"/>
+            </w:tabs>
+            <w:rPr>
+              <w:rFonts w:eastAsiaTheme="minorEastAsia"/>
+              <w:noProof/>
+              <w:kern w:val="2"/>
+              <w:sz w:val="24"/>
+              <w:szCs w:val="24"/>
+              <w:lang w:val="en-KE" w:eastAsia="en-KE"/>
+              <w14:ligatures w14:val="standardContextual"/>
+            </w:rPr>
+          </w:pPr>
+          <w:hyperlink w:anchor="_Toc232646229" w:history="1">
+            <w:r>
+              <w:rPr>
+                <w:rStyle w:val="Hyperlink"/>
+                <w:rFonts w:ascii="Times New Roman" w:hAnsi="Times New Roman" w:cs="Times New Roman"/>
+                <w:noProof/>
+              </w:rPr>
+              <w:t>Fig 3- Embedding-Based Sentiment Classifier</w:t>
+            </w:r>
+            <w:r>
+              <w:rPr>
+                <w:noProof/>
+                <w:webHidden/>
+              </w:rPr>
+              <w:tab/>
+            </w:r>
+            <w:r>
+              <w:rPr>
+                <w:noProof/>
+                <w:webHidden/>
+              </w:rPr>
+              <w:fldChar w:fldCharType="begin"/>
+            </w:r>
+            <w:r>
+              <w:rPr>
+                <w:noProof/>
+                <w:webHidden/>
+              </w:rPr>
+              <w:instrText xml:space="preserve"> PAGEREF _Toc232646229 \h </w:instrText>
+            </w:r>
+            <w:r>
+              <w:rPr>
+                <w:noProof/>
+                <w:webHidden/>
+              </w:rPr>
+            </w:r>
+            <w:r>
+              <w:rPr>
+                <w:noProof/>
+                <w:webHidden/>
+              </w:rPr>
+              <w:fldChar w:fldCharType="separate"/>
+            </w:r>
+            <w:r>
+              <w:rPr>
+                <w:noProof/>
+                <w:webHidden/>
+              </w:rPr>
+              <w:t>16</w:t>
+            </w:r>
+            <w:r>
+              <w:rPr>
+                <w:noProof/>
+                <w:webHidden/>
+              </w:rPr>
+              <w:fldChar w:fldCharType="end"/>
+            </w:r>
+          </w:hyperlink>
+        </w:p>
+        <w:p>
+          <w:pPr>
+            <w:pStyle w:val="TOC2"/>
+            <w:tabs>
+              <w:tab w:val="right" w:leader="dot" w:pos="9350"/>
+            </w:tabs>
+            <w:rPr>
+              <w:rFonts w:eastAsiaTheme="minorEastAsia"/>
+              <w:noProof/>
+              <w:kern w:val="2"/>
+              <w:sz w:val="24"/>
+              <w:szCs w:val="24"/>
+              <w:lang w:val="en-KE" w:eastAsia="en-KE"/>
+              <w14:ligatures w14:val="standardContextual"/>
+            </w:rPr>
+          </w:pPr>
+          <w:hyperlink w:anchor="_Toc232646230" w:history="1">
+            <w:r>
+              <w:rPr>
+                <w:rStyle w:val="Hyperlink"/>
+                <w:rFonts w:ascii="Times New Roman" w:hAnsi="Times New Roman" w:cs="Times New Roman"/>
+                <w:noProof/>
+              </w:rPr>
+              <w:t>Fig 4- RNN vs LSTM Comparison</w:t>
+            </w:r>
+            <w:r>
+              <w:rPr>
+                <w:noProof/>
+                <w:webHidden/>
+              </w:rPr>
+              <w:tab/>
+            </w:r>
+            <w:r>
+              <w:rPr>
+                <w:noProof/>
+                <w:webHidden/>
+              </w:rPr>
+              <w:fldChar w:fldCharType="begin"/>
+            </w:r>
+            <w:r>
+              <w:rPr>
+                <w:noProof/>
+                <w:webHidden/>
+              </w:rPr>
+              <w:instrText xml:space="preserve"> PAGEREF _Toc232646230 \h </w:instrText>
+            </w:r>
+            <w:r>
+              <w:rPr>
+                <w:noProof/>
+                <w:webHidden/>
+              </w:rPr>
+            </w:r>
+            <w:r>
+              <w:rPr>
+                <w:noProof/>
+                <w:webHidden/>
+              </w:rPr>
+              <w:fldChar w:fldCharType="separate"/>
+            </w:r>
+            <w:r>
+              <w:rPr>
+                <w:noProof/>
+                <w:webHidden/>
+              </w:rPr>
+              <w:t>16</w:t>
+            </w:r>
+            <w:r>
+              <w:rPr>
+                <w:noProof/>
+                <w:webHidden/>
+              </w:rPr>
+              <w:fldChar w:fldCharType="end"/>
+            </w:r>
+          </w:hyperlink>
+        </w:p>
+        <w:p>
+          <w:pPr>
+            <w:pStyle w:val="TOC2"/>
+            <w:tabs>
+              <w:tab w:val="right" w:leader="dot" w:pos="9350"/>
+            </w:tabs>
+            <w:rPr>
+              <w:rFonts w:eastAsiaTheme="minorEastAsia"/>
+              <w:noProof/>
+              <w:kern w:val="2"/>
+              <w:sz w:val="24"/>
+              <w:szCs w:val="24"/>
+              <w:lang w:val="en-KE" w:eastAsia="en-KE"/>
+              <w14:ligatures w14:val="standardContextual"/>
+            </w:rPr>
+          </w:pPr>
+          <w:hyperlink w:anchor="_Toc232646231" w:history="1">
+            <w:r>
+              <w:rPr>
+                <w:rStyle w:val="Hyperlink"/>
+                <w:rFonts w:ascii="Times New Roman" w:hAnsi="Times New Roman" w:cs="Times New Roman"/>
+                <w:noProof/>
+              </w:rPr>
+              <w:t>SUMMARY</w:t>
+            </w:r>
+            <w:r>
+              <w:rPr>
+                <w:noProof/>
+                <w:webHidden/>
+              </w:rPr>
+              <w:tab/>
+            </w:r>
+            <w:r>
+              <w:rPr>
+                <w:noProof/>
+                <w:webHidden/>
+              </w:rPr>
+              <w:fldChar w:fldCharType="begin"/>
+            </w:r>
+            <w:r>
+              <w:rPr>
+                <w:noProof/>
+                <w:webHidden/>
+              </w:rPr>
+              <w:instrText xml:space="preserve"> PAGEREF _Toc232646231 \h </w:instrText>
+            </w:r>
+            <w:r>
+              <w:rPr>
+                <w:noProof/>
+                <w:webHidden/>
+              </w:rPr>
+            </w:r>
+            <w:r>
+              <w:rPr>
+                <w:noProof/>
+                <w:webHidden/>
+              </w:rPr>
+              <w:fldChar w:fldCharType="separate"/>
+            </w:r>
+            <w:r>
+              <w:rPr>
+                <w:noProof/>
+                <w:webHidden/>
+              </w:rPr>
+              <w:t>16</w:t>
             </w:r>
             <w:r>
               <w:rPr>
@@ -2193,7 +2712,7 @@
           <w:szCs w:val="28"/>
         </w:rPr>
       </w:pPr>
-      <w:bookmarkStart w:id="1" w:name="_Toc230952843"/>
+      <w:bookmarkStart w:id="0" w:name="_Toc232646203"/>
       <w:r>
         <w:rPr>
           <w:rFonts w:ascii="Times New Roman" w:hAnsi="Times New Roman" w:cs="Times New Roman"/>
@@ -2202,10 +2721,19 @@
           <w:sz w:val="28"/>
           <w:szCs w:val="28"/>
         </w:rPr>
-        <w:lastRenderedPageBreak/>
         <w:t>EXTRA WORK SECTION 1</w:t>
       </w:r>
-      <w:bookmarkEnd w:id="1"/>
+      <w:r>
+        <w:rPr>
+          <w:rFonts w:ascii="Times New Roman" w:hAnsi="Times New Roman" w:cs="Times New Roman"/>
+          <w:b/>
+          <w:color w:val="auto"/>
+          <w:sz w:val="28"/>
+          <w:szCs w:val="28"/>
+        </w:rPr>
+        <w:t xml:space="preserve"> WEEK I &amp; 2</w:t>
+      </w:r>
+      <w:bookmarkEnd w:id="0"/>
     </w:p>
     <w:p>
       <w:pPr>
@@ -2278,7 +2806,7 @@
           <w:szCs w:val="24"/>
         </w:rPr>
       </w:pPr>
-      <w:bookmarkStart w:id="2" w:name="_Toc230952844"/>
+      <w:bookmarkStart w:id="1" w:name="_Toc232646204"/>
       <w:r>
         <w:rPr>
           <w:rFonts w:ascii="Times New Roman" w:hAnsi="Times New Roman" w:cs="Times New Roman"/>
@@ -2289,7 +2817,7 @@
         <w:lastRenderedPageBreak/>
         <w:t>Fig 1- Stemming Output (Porter Stemmer)</w:t>
       </w:r>
-      <w:bookmarkEnd w:id="2"/>
+      <w:bookmarkEnd w:id="1"/>
     </w:p>
     <w:p>
       <w:pPr>
@@ -2353,7 +2881,7 @@
           <w:szCs w:val="24"/>
         </w:rPr>
       </w:pPr>
-      <w:bookmarkStart w:id="3" w:name="_Toc230952845"/>
+      <w:bookmarkStart w:id="2" w:name="_Toc232646205"/>
       <w:r>
         <w:rPr>
           <w:rFonts w:ascii="Times New Roman" w:hAnsi="Times New Roman" w:cs="Times New Roman"/>
@@ -2364,7 +2892,7 @@
         <w:lastRenderedPageBreak/>
         <w:t>Fig 2- Stemming Output (Snowball Stemmer)</w:t>
       </w:r>
-      <w:bookmarkEnd w:id="3"/>
+      <w:bookmarkEnd w:id="2"/>
     </w:p>
     <w:p>
       <w:pPr>
@@ -2428,7 +2956,7 @@
           <w:szCs w:val="24"/>
         </w:rPr>
       </w:pPr>
-      <w:bookmarkStart w:id="4" w:name="_Toc230952846"/>
+      <w:bookmarkStart w:id="3" w:name="_Toc232646206"/>
       <w:r>
         <w:rPr>
           <w:rFonts w:ascii="Times New Roman" w:hAnsi="Times New Roman" w:cs="Times New Roman"/>
@@ -2438,7 +2966,7 @@
         </w:rPr>
         <w:t>Fig 3- Lemmatization</w:t>
       </w:r>
-      <w:bookmarkEnd w:id="4"/>
+      <w:bookmarkEnd w:id="3"/>
     </w:p>
     <w:p>
       <w:pPr>
@@ -2502,7 +3030,7 @@
           <w:szCs w:val="24"/>
         </w:rPr>
       </w:pPr>
-      <w:bookmarkStart w:id="5" w:name="_Toc230952847"/>
+      <w:bookmarkStart w:id="4" w:name="_Toc232646207"/>
       <w:r>
         <w:rPr>
           <w:rFonts w:ascii="Times New Roman" w:hAnsi="Times New Roman" w:cs="Times New Roman"/>
@@ -2512,7 +3040,7 @@
         </w:rPr>
         <w:t>Fig 4- Stemming vs Lemmatization comparison</w:t>
       </w:r>
-      <w:bookmarkEnd w:id="5"/>
+      <w:bookmarkEnd w:id="4"/>
     </w:p>
     <w:p>
       <w:pPr>
@@ -2533,7 +3061,7 @@
           <w:szCs w:val="24"/>
         </w:rPr>
       </w:pPr>
-      <w:bookmarkStart w:id="6" w:name="_Toc230952848"/>
+      <w:bookmarkStart w:id="5" w:name="_Toc232646208"/>
       <w:r>
         <w:rPr>
           <w:rFonts w:ascii="Times New Roman" w:hAnsi="Times New Roman" w:cs="Times New Roman"/>
@@ -2544,7 +3072,7 @@
         <w:lastRenderedPageBreak/>
         <w:t>SUMMARY</w:t>
       </w:r>
-      <w:bookmarkEnd w:id="6"/>
+      <w:bookmarkEnd w:id="5"/>
     </w:p>
     <w:p>
       <w:pPr>
@@ -2790,7 +3318,7 @@
           <w:szCs w:val="28"/>
         </w:rPr>
       </w:pPr>
-      <w:bookmarkStart w:id="7" w:name="_Toc230952849"/>
+      <w:bookmarkStart w:id="6" w:name="_Toc232646209"/>
       <w:r>
         <w:rPr>
           <w:rFonts w:ascii="Times New Roman" w:hAnsi="Times New Roman" w:cs="Times New Roman"/>
@@ -2802,7 +3330,17 @@
         <w:lastRenderedPageBreak/>
         <w:t>EXTRAWORK SECTION 2</w:t>
       </w:r>
-      <w:bookmarkEnd w:id="7"/>
+      <w:r>
+        <w:rPr>
+          <w:rFonts w:ascii="Times New Roman" w:hAnsi="Times New Roman" w:cs="Times New Roman"/>
+          <w:b/>
+          <w:color w:val="auto"/>
+          <w:sz w:val="28"/>
+          <w:szCs w:val="28"/>
+        </w:rPr>
+        <w:t xml:space="preserve"> WEEK 3 &amp; 2</w:t>
+      </w:r>
+      <w:bookmarkEnd w:id="6"/>
     </w:p>
     <w:p>
       <w:pPr>
@@ -2866,7 +3404,7 @@
           <w:szCs w:val="24"/>
         </w:rPr>
       </w:pPr>
-      <w:bookmarkStart w:id="8" w:name="_Toc230952850"/>
+      <w:bookmarkStart w:id="7" w:name="_Toc232646210"/>
       <w:r>
         <w:rPr>
           <w:rFonts w:ascii="Times New Roman" w:hAnsi="Times New Roman" w:cs="Times New Roman"/>
@@ -2876,7 +3414,7 @@
         </w:rPr>
         <w:t>Fig 1- Basic word frequency counter</w:t>
       </w:r>
-      <w:bookmarkEnd w:id="8"/>
+      <w:bookmarkEnd w:id="7"/>
     </w:p>
     <w:p/>
     <w:p>
@@ -2941,7 +3479,7 @@
           <w:szCs w:val="24"/>
         </w:rPr>
       </w:pPr>
-      <w:bookmarkStart w:id="9" w:name="_Toc230952851"/>
+      <w:bookmarkStart w:id="8" w:name="_Toc232646211"/>
       <w:r>
         <w:rPr>
           <w:rFonts w:ascii="Times New Roman" w:hAnsi="Times New Roman" w:cs="Times New Roman"/>
@@ -2952,7 +3490,7 @@
         <w:lastRenderedPageBreak/>
         <w:t>Fig 2- Word frequency bar chart</w:t>
       </w:r>
-      <w:bookmarkEnd w:id="9"/>
+      <w:bookmarkEnd w:id="8"/>
     </w:p>
     <w:p>
       <w:pPr>
@@ -3016,7 +3554,7 @@
           <w:szCs w:val="24"/>
         </w:rPr>
       </w:pPr>
-      <w:bookmarkStart w:id="10" w:name="_Toc230952852"/>
+      <w:bookmarkStart w:id="9" w:name="_Toc232646212"/>
       <w:r>
         <w:rPr>
           <w:rFonts w:ascii="Times New Roman" w:hAnsi="Times New Roman" w:cs="Times New Roman"/>
@@ -3026,7 +3564,7 @@
         </w:rPr>
         <w:t>Fig 3- Word frequency bar chart</w:t>
       </w:r>
-      <w:bookmarkEnd w:id="10"/>
+      <w:bookmarkEnd w:id="9"/>
     </w:p>
     <w:p>
       <w:pPr>
@@ -3090,7 +3628,7 @@
           <w:szCs w:val="24"/>
         </w:rPr>
       </w:pPr>
-      <w:bookmarkStart w:id="11" w:name="_Toc230952853"/>
+      <w:bookmarkStart w:id="10" w:name="_Toc232646213"/>
       <w:r>
         <w:rPr>
           <w:rFonts w:ascii="Times New Roman" w:hAnsi="Times New Roman" w:cs="Times New Roman"/>
@@ -3110,7 +3648,7 @@
         </w:rPr>
         <w:t>spam vs ham word frequencies</w:t>
       </w:r>
-      <w:bookmarkEnd w:id="11"/>
+      <w:bookmarkEnd w:id="10"/>
     </w:p>
     <w:p>
       <w:pPr>
@@ -3133,7 +3671,7 @@
           <w:szCs w:val="24"/>
         </w:rPr>
       </w:pPr>
-      <w:bookmarkStart w:id="12" w:name="_Toc230952854"/>
+      <w:bookmarkStart w:id="11" w:name="_Toc232646214"/>
       <w:r>
         <w:rPr>
           <w:rFonts w:ascii="Times New Roman" w:eastAsia="Times New Roman" w:hAnsi="Times New Roman" w:cs="Times New Roman"/>
@@ -3143,7 +3681,7 @@
         </w:rPr>
         <w:t>SUMMARY</w:t>
       </w:r>
-      <w:bookmarkEnd w:id="12"/>
+      <w:bookmarkEnd w:id="11"/>
     </w:p>
     <w:p>
       <w:pPr>
@@ -3413,7 +3951,7 @@
           <w:szCs w:val="28"/>
         </w:rPr>
       </w:pPr>
-      <w:bookmarkStart w:id="13" w:name="_Toc230952855"/>
+      <w:bookmarkStart w:id="12" w:name="_Toc232646215"/>
       <w:r>
         <w:rPr>
           <w:rFonts w:ascii="Times New Roman" w:eastAsia="Times New Roman" w:hAnsi="Times New Roman" w:cs="Times New Roman"/>
@@ -3425,7 +3963,17 @@
         <w:lastRenderedPageBreak/>
         <w:t>EXTRAWORK SECTION 3</w:t>
       </w:r>
-      <w:bookmarkEnd w:id="13"/>
+      <w:r>
+        <w:rPr>
+          <w:rFonts w:ascii="Times New Roman" w:eastAsia="Times New Roman" w:hAnsi="Times New Roman" w:cs="Times New Roman"/>
+          <w:b/>
+          <w:color w:val="auto"/>
+          <w:sz w:val="28"/>
+          <w:szCs w:val="28"/>
+        </w:rPr>
+        <w:t xml:space="preserve"> WEEK 4</w:t>
+      </w:r>
+      <w:bookmarkEnd w:id="12"/>
     </w:p>
     <w:p>
       <w:pPr>
@@ -3491,7 +4039,7 @@
           <w:szCs w:val="24"/>
         </w:rPr>
       </w:pPr>
-      <w:bookmarkStart w:id="14" w:name="_Toc230952856"/>
+      <w:bookmarkStart w:id="13" w:name="_Toc232646216"/>
       <w:r>
         <w:rPr>
           <w:rFonts w:ascii="Times New Roman" w:eastAsia="Times New Roman" w:hAnsi="Times New Roman" w:cs="Times New Roman"/>
@@ -3519,7 +4067,7 @@
         </w:rPr>
         <w:t xml:space="preserve"> Sentence Structure Analysis</w:t>
       </w:r>
-      <w:bookmarkEnd w:id="14"/>
+      <w:bookmarkEnd w:id="13"/>
     </w:p>
     <w:p/>
     <w:p>
@@ -3586,7 +4134,7 @@
           <w:szCs w:val="24"/>
         </w:rPr>
       </w:pPr>
-      <w:bookmarkStart w:id="15" w:name="_Toc230952857"/>
+      <w:bookmarkStart w:id="14" w:name="_Toc232646217"/>
       <w:r>
         <w:rPr>
           <w:rFonts w:ascii="Times New Roman" w:eastAsia="Times New Roman" w:hAnsi="Times New Roman" w:cs="Times New Roman"/>
@@ -3597,7 +4145,7 @@
         <w:lastRenderedPageBreak/>
         <w:t>Fig 2- Semantics dealing with the meaning of words and sentences</w:t>
       </w:r>
-      <w:bookmarkEnd w:id="15"/>
+      <w:bookmarkEnd w:id="14"/>
     </w:p>
     <w:p>
       <w:pPr>
@@ -3661,7 +4209,7 @@
           <w:szCs w:val="24"/>
         </w:rPr>
       </w:pPr>
-      <w:bookmarkStart w:id="16" w:name="_Toc230952858"/>
+      <w:bookmarkStart w:id="15" w:name="_Toc232646218"/>
       <w:r>
         <w:rPr>
           <w:rFonts w:ascii="Times New Roman" w:hAnsi="Times New Roman" w:cs="Times New Roman"/>
@@ -3672,7 +4220,7 @@
         <w:lastRenderedPageBreak/>
         <w:t>Fig 3-Fragmantics understanding intended meaning from context</w:t>
       </w:r>
-      <w:bookmarkEnd w:id="16"/>
+      <w:bookmarkEnd w:id="15"/>
     </w:p>
     <w:p>
       <w:pPr>
@@ -3736,7 +4284,7 @@
           <w:szCs w:val="24"/>
         </w:rPr>
       </w:pPr>
-      <w:bookmarkStart w:id="17" w:name="_Toc230952859"/>
+      <w:bookmarkStart w:id="16" w:name="_Toc232646219"/>
       <w:r>
         <w:rPr>
           <w:rFonts w:ascii="Times New Roman" w:hAnsi="Times New Roman" w:cs="Times New Roman"/>
@@ -3756,91 +4304,55 @@
         </w:rPr>
         <w:t>Fragmatics</w:t>
       </w:r>
+      <w:bookmarkEnd w:id="16"/>
+      <w:proofErr w:type="spellEnd"/>
+    </w:p>
+    <w:p>
+      <w:pPr>
+        <w:rPr>
+          <w:rFonts w:ascii="Times New Roman" w:hAnsi="Times New Roman" w:cs="Times New Roman"/>
+          <w:sz w:val="24"/>
+          <w:szCs w:val="24"/>
+        </w:rPr>
+      </w:pPr>
+    </w:p>
+    <w:p>
+      <w:pPr>
+        <w:pStyle w:val="Heading2"/>
+        <w:rPr>
+          <w:rFonts w:ascii="Times New Roman" w:hAnsi="Times New Roman" w:cs="Times New Roman"/>
+          <w:color w:val="auto"/>
+          <w:sz w:val="24"/>
+          <w:szCs w:val="24"/>
+        </w:rPr>
+      </w:pPr>
+      <w:bookmarkStart w:id="17" w:name="_Toc232646220"/>
+      <w:r>
+        <w:rPr>
+          <w:rFonts w:ascii="Times New Roman" w:hAnsi="Times New Roman" w:cs="Times New Roman"/>
+          <w:color w:val="auto"/>
+          <w:sz w:val="24"/>
+          <w:szCs w:val="24"/>
+        </w:rPr>
+        <w:t>SUMMARY</w:t>
+      </w:r>
       <w:bookmarkEnd w:id="17"/>
-      <w:proofErr w:type="spellEnd"/>
-    </w:p>
-    <w:p>
-      <w:pPr>
-        <w:rPr>
-          <w:rFonts w:ascii="Times New Roman" w:hAnsi="Times New Roman" w:cs="Times New Roman"/>
-          <w:sz w:val="24"/>
-          <w:szCs w:val="24"/>
-        </w:rPr>
-      </w:pPr>
-    </w:p>
-    <w:p>
-      <w:pPr>
-        <w:pStyle w:val="Heading2"/>
-        <w:rPr>
-          <w:rFonts w:ascii="Times New Roman" w:hAnsi="Times New Roman" w:cs="Times New Roman"/>
-          <w:color w:val="auto"/>
-          <w:sz w:val="24"/>
-          <w:szCs w:val="24"/>
-        </w:rPr>
-      </w:pPr>
-      <w:bookmarkStart w:id="18" w:name="_Toc230952860"/>
-      <w:r>
-        <w:rPr>
-          <w:rFonts w:ascii="Times New Roman" w:hAnsi="Times New Roman" w:cs="Times New Roman"/>
-          <w:color w:val="auto"/>
-          <w:sz w:val="24"/>
-          <w:szCs w:val="24"/>
-        </w:rPr>
-        <w:t>SUMMARY</w:t>
-      </w:r>
-      <w:bookmarkEnd w:id="18"/>
-    </w:p>
-    <w:p>
-      <w:pPr>
-        <w:rPr>
-          <w:rFonts w:ascii="Times New Roman" w:hAnsi="Times New Roman" w:cs="Times New Roman"/>
-          <w:sz w:val="24"/>
-          <w:szCs w:val="24"/>
-        </w:rPr>
-      </w:pPr>
-      <w:r>
-        <w:rPr>
-          <w:rFonts w:ascii="Times New Roman" w:hAnsi="Times New Roman" w:cs="Times New Roman"/>
-          <w:sz w:val="24"/>
-          <w:szCs w:val="24"/>
-        </w:rPr>
-        <w:t xml:space="preserve">Fig 1: syntax analysis, Fig 2: POS tagging, the grammatical structure of correct sentences vs scrambled incorrect sentences. The semantics of Fig 2 is illustrated by the fact that the term bank has different meanings in the computer world, and that computer programs must use their context to choose the appropriate meaning, which is the most difficult aspect of semantic analysis. In Fig. 3 pragmatics are explained by using real examples and revealing the difference between what is actually said and what is actually meant. Fig 4 takes all three parts and applies them to one sentence. The ability of modern AI </w:t>
-      </w:r>
-      <w:proofErr w:type="spellStart"/>
-      <w:r>
-        <w:rPr>
-          <w:rFonts w:ascii="Times New Roman" w:hAnsi="Times New Roman" w:cs="Times New Roman"/>
-          <w:sz w:val="24"/>
-          <w:szCs w:val="24"/>
-        </w:rPr>
-        <w:t>chatbots</w:t>
-      </w:r>
-      <w:proofErr w:type="spellEnd"/>
-      <w:r>
-        <w:rPr>
-          <w:rFonts w:ascii="Times New Roman" w:hAnsi="Times New Roman" w:cs="Times New Roman"/>
-          <w:sz w:val="24"/>
-          <w:szCs w:val="24"/>
-        </w:rPr>
-        <w:t xml:space="preserve"> like </w:t>
-      </w:r>
-      <w:proofErr w:type="spellStart"/>
-      <w:r>
-        <w:rPr>
-          <w:rFonts w:ascii="Times New Roman" w:hAnsi="Times New Roman" w:cs="Times New Roman"/>
-          <w:sz w:val="24"/>
-          <w:szCs w:val="24"/>
-        </w:rPr>
-        <w:t>ChatGPT</w:t>
-      </w:r>
-      <w:proofErr w:type="spellEnd"/>
-      <w:r>
-        <w:rPr>
-          <w:rFonts w:ascii="Times New Roman" w:hAnsi="Times New Roman" w:cs="Times New Roman"/>
-          <w:sz w:val="24"/>
-          <w:szCs w:val="24"/>
-        </w:rPr>
-        <w:t xml:space="preserve"> to engage in intelligent conversations is a result of comprehending the syntax, semantics, and pragmatics.</w:t>
+    </w:p>
+    <w:p>
+      <w:pPr>
+        <w:rPr>
+          <w:rFonts w:ascii="Times New Roman" w:hAnsi="Times New Roman" w:cs="Times New Roman"/>
+          <w:sz w:val="24"/>
+          <w:szCs w:val="24"/>
+        </w:rPr>
+      </w:pPr>
+      <w:r>
+        <w:rPr>
+          <w:rFonts w:ascii="Times New Roman" w:hAnsi="Times New Roman" w:cs="Times New Roman"/>
+          <w:sz w:val="24"/>
+          <w:szCs w:val="24"/>
+        </w:rPr>
+        <w:t>Fig 1: syntax analysis, Fig 2: POS tagging, the grammatical structure of correct sentences vs scrambled incorrect sentences. The semantics of Fig 2 is illustrated by the fact that the term bank has different meanings in the computer world, and that computer programs must use their context to choose the appropriate meaning, which is the most difficult aspect of semantic analysis. In Fig. 3 pragmatics are explained by using real examples and revealing the difference between what is actually said and what is actually meant. Fig 4 takes all three parts and applies them to one sentence. The ability of modern AI chatbots like ChatGPT to engage in intelligent conversations is a result of comprehending the syntax, semantics, and pragmatics.</w:t>
       </w:r>
     </w:p>
     <w:p>
@@ -3890,7 +4402,7 @@
           <w:szCs w:val="28"/>
         </w:rPr>
       </w:pPr>
-      <w:bookmarkStart w:id="19" w:name="_Toc230952861"/>
+      <w:bookmarkStart w:id="18" w:name="_Toc232646221"/>
       <w:r>
         <w:rPr>
           <w:rFonts w:ascii="Times New Roman" w:hAnsi="Times New Roman" w:cs="Times New Roman"/>
@@ -3902,7 +4414,17 @@
         <w:lastRenderedPageBreak/>
         <w:t>EXTRAWORK SECTION 4</w:t>
       </w:r>
-      <w:bookmarkEnd w:id="19"/>
+      <w:r>
+        <w:rPr>
+          <w:rFonts w:ascii="Times New Roman" w:hAnsi="Times New Roman" w:cs="Times New Roman"/>
+          <w:b/>
+          <w:color w:val="auto"/>
+          <w:sz w:val="28"/>
+          <w:szCs w:val="28"/>
+        </w:rPr>
+        <w:t xml:space="preserve"> WEEK 5</w:t>
+      </w:r>
+      <w:bookmarkEnd w:id="18"/>
     </w:p>
     <w:p>
       <w:pPr>
@@ -3966,7 +4488,7 @@
           <w:szCs w:val="24"/>
         </w:rPr>
       </w:pPr>
-      <w:bookmarkStart w:id="20" w:name="_Toc230952862"/>
+      <w:bookmarkStart w:id="19" w:name="_Toc232646222"/>
       <w:r>
         <w:rPr>
           <w:rFonts w:ascii="Times New Roman" w:hAnsi="Times New Roman" w:cs="Times New Roman"/>
@@ -3976,7 +4498,7 @@
         </w:rPr>
         <w:t>Fig 1- Syntactic Parsing Chunking Extracting Noun Phrases (NP) and Verb Phrases (VP)</w:t>
       </w:r>
-      <w:bookmarkEnd w:id="20"/>
+      <w:bookmarkEnd w:id="19"/>
     </w:p>
     <w:p/>
     <w:p>
@@ -4041,7 +4563,7 @@
           <w:szCs w:val="24"/>
         </w:rPr>
       </w:pPr>
-      <w:bookmarkStart w:id="21" w:name="_Toc230952863"/>
+      <w:bookmarkStart w:id="20" w:name="_Toc232646223"/>
       <w:r>
         <w:rPr>
           <w:rFonts w:ascii="Times New Roman" w:hAnsi="Times New Roman" w:cs="Times New Roman"/>
@@ -4052,7 +4574,7 @@
         <w:lastRenderedPageBreak/>
         <w:t>Fig 2- Dependency-Style Analysis understanding which words depend on which</w:t>
       </w:r>
-      <w:bookmarkEnd w:id="21"/>
+      <w:bookmarkEnd w:id="20"/>
     </w:p>
     <w:p>
       <w:pPr>
@@ -4116,7 +4638,7 @@
           <w:szCs w:val="24"/>
         </w:rPr>
       </w:pPr>
-      <w:bookmarkStart w:id="22" w:name="_Toc230952864"/>
+      <w:bookmarkStart w:id="21" w:name="_Toc232646224"/>
       <w:r>
         <w:rPr>
           <w:rFonts w:ascii="Times New Roman" w:hAnsi="Times New Roman" w:cs="Times New Roman"/>
@@ -4135,9 +4657,218 @@
         </w:rPr>
         <w:t>Semantic Similarity how similar are two sentences in meaning</w:t>
       </w:r>
+      <w:bookmarkEnd w:id="21"/>
+    </w:p>
+    <w:p/>
+    <w:p>
+      <w:pPr>
+        <w:pStyle w:val="Heading2"/>
+        <w:rPr>
+          <w:rFonts w:ascii="Times New Roman" w:hAnsi="Times New Roman" w:cs="Times New Roman"/>
+          <w:color w:val="auto"/>
+          <w:sz w:val="24"/>
+          <w:szCs w:val="24"/>
+        </w:rPr>
+      </w:pPr>
+      <w:bookmarkStart w:id="22" w:name="_Toc232646225"/>
+      <w:r>
+        <w:rPr>
+          <w:rFonts w:ascii="Times New Roman" w:hAnsi="Times New Roman" w:cs="Times New Roman"/>
+          <w:color w:val="auto"/>
+          <w:sz w:val="24"/>
+          <w:szCs w:val="24"/>
+        </w:rPr>
+        <w:t>SUMMARY</w:t>
+      </w:r>
       <w:bookmarkEnd w:id="22"/>
     </w:p>
-    <w:p/>
+    <w:p>
+      <w:pPr>
+        <w:rPr>
+          <w:rFonts w:ascii="Times New Roman" w:hAnsi="Times New Roman" w:cs="Times New Roman"/>
+          <w:sz w:val="24"/>
+          <w:szCs w:val="24"/>
+        </w:rPr>
+      </w:pPr>
+      <w:r>
+        <w:rPr>
+          <w:rFonts w:ascii="Times New Roman" w:hAnsi="Times New Roman" w:cs="Times New Roman"/>
+          <w:sz w:val="24"/>
+          <w:szCs w:val="24"/>
+        </w:rPr>
+        <w:t>The parser worked well in identifying noun phrases in sentences 5 from the text, as shown in Fig 1, by following the grammar rules on the POS tagged tokens. The dependency analysis is conducted on each sentence, separating the nouns, verbs, adjectives and adverbs, as shown in Fig 2, which helps to understand the structure of each sentence. Fig 3 shows semantic similarity as WordNet path similarity score: dog' and 'animal' had a high score while 'happy' and 'sad' had low score. This proves that meaning of words could be measured mathematically by computer. In machine translation and grammar checkers, syntactic parsing is used, and in search engines and recommendation systems, semantic similarity is used.</w:t>
+      </w:r>
+    </w:p>
+    <w:p>
+      <w:pPr>
+        <w:pStyle w:val="Heading1"/>
+        <w:rPr>
+          <w:rFonts w:ascii="Times New Roman" w:hAnsi="Times New Roman" w:cs="Times New Roman"/>
+          <w:b/>
+          <w:bCs/>
+          <w:color w:val="auto"/>
+          <w:sz w:val="28"/>
+          <w:szCs w:val="28"/>
+        </w:rPr>
+      </w:pPr>
+      <w:bookmarkStart w:id="23" w:name="_Toc232646226"/>
+      <w:r>
+        <w:rPr>
+          <w:rFonts w:ascii="Times New Roman" w:hAnsi="Times New Roman" w:cs="Times New Roman"/>
+          <w:b/>
+          <w:bCs/>
+          <w:color w:val="auto"/>
+          <w:sz w:val="28"/>
+          <w:szCs w:val="28"/>
+        </w:rPr>
+        <w:lastRenderedPageBreak/>
+        <w:t>EXTRA WORK WEEK SECTION 5</w:t>
+      </w:r>
+      <w:r>
+        <w:rPr>
+          <w:rFonts w:ascii="Times New Roman" w:hAnsi="Times New Roman" w:cs="Times New Roman"/>
+          <w:b/>
+          <w:bCs/>
+          <w:color w:val="auto"/>
+          <w:sz w:val="28"/>
+          <w:szCs w:val="28"/>
+        </w:rPr>
+        <w:t xml:space="preserve"> WEEK 6 AND 7</w:t>
+      </w:r>
+      <w:bookmarkEnd w:id="23"/>
+    </w:p>
+    <w:p>
+      <w:pPr>
+        <w:rPr>
+          <w:rFonts w:ascii="Times New Roman" w:hAnsi="Times New Roman" w:cs="Times New Roman"/>
+          <w:sz w:val="24"/>
+          <w:szCs w:val="24"/>
+          <w:lang w:val="en-KE"/>
+        </w:rPr>
+      </w:pPr>
+      <w:r>
+        <w:rPr>
+          <w:rFonts w:ascii="Times New Roman" w:hAnsi="Times New Roman" w:cs="Times New Roman"/>
+          <w:sz w:val="24"/>
+          <w:szCs w:val="24"/>
+          <w:lang w:val="en-KE"/>
+        </w:rPr>
+        <w:drawing>
+          <wp:inline distT="0" distB="0" distL="0" distR="0" wp14:anchorId="13A92AA9" wp14:editId="22367B07">
+            <wp:extent cx="5943600" cy="2202180"/>
+            <wp:effectExtent l="0" t="0" r="0" b="7620"/>
+            <wp:docPr id="250780580" name="Picture 1"/>
+            <wp:cNvGraphicFramePr>
+              <a:graphicFrameLocks xmlns:a="http://schemas.openxmlformats.org/drawingml/2006/main" noChangeAspect="1"/>
+            </wp:cNvGraphicFramePr>
+            <a:graphic xmlns:a="http://schemas.openxmlformats.org/drawingml/2006/main">
+              <a:graphicData uri="http://schemas.openxmlformats.org/drawingml/2006/picture">
+                <pic:pic xmlns:pic="http://schemas.openxmlformats.org/drawingml/2006/picture">
+                  <pic:nvPicPr>
+                    <pic:cNvPr id="0" name="Picture 1"/>
+                    <pic:cNvPicPr>
+                      <a:picLocks noChangeAspect="1" noChangeArrowheads="1"/>
+                    </pic:cNvPicPr>
+                  </pic:nvPicPr>
+                  <pic:blipFill>
+                    <a:blip r:embed="rId21" cstate="print">
+                      <a:extLst>
+                        <a:ext uri="{28A0092B-C50C-407E-A947-70E740481C1C}">
+                          <a14:useLocalDpi xmlns:a14="http://schemas.microsoft.com/office/drawing/2010/main" val="0"/>
+                        </a:ext>
+                      </a:extLst>
+                    </a:blip>
+                    <a:srcRect/>
+                    <a:stretch>
+                      <a:fillRect/>
+                    </a:stretch>
+                  </pic:blipFill>
+                  <pic:spPr bwMode="auto">
+                    <a:xfrm>
+                      <a:off x="0" y="0"/>
+                      <a:ext cx="5943600" cy="2202180"/>
+                    </a:xfrm>
+                    <a:prstGeom prst="rect">
+                      <a:avLst/>
+                    </a:prstGeom>
+                    <a:noFill/>
+                    <a:ln>
+                      <a:noFill/>
+                    </a:ln>
+                  </pic:spPr>
+                </pic:pic>
+              </a:graphicData>
+            </a:graphic>
+          </wp:inline>
+        </w:drawing>
+      </w:r>
+    </w:p>
+    <w:p>
+      <w:pPr>
+        <w:rPr>
+          <w:rFonts w:ascii="Times New Roman" w:hAnsi="Times New Roman" w:cs="Times New Roman"/>
+          <w:sz w:val="24"/>
+          <w:szCs w:val="24"/>
+          <w:lang w:val="en-KE"/>
+        </w:rPr>
+      </w:pPr>
+      <w:r>
+        <w:rPr>
+          <w:rFonts w:ascii="Times New Roman" w:hAnsi="Times New Roman" w:cs="Times New Roman"/>
+          <w:sz w:val="24"/>
+          <w:szCs w:val="24"/>
+          <w:lang w:val="en-KE"/>
+        </w:rPr>
+        <w:drawing>
+          <wp:inline distT="0" distB="0" distL="0" distR="0" wp14:anchorId="31007DA8" wp14:editId="0C0E78A1">
+            <wp:extent cx="5943600" cy="2168525"/>
+            <wp:effectExtent l="0" t="0" r="0" b="3175"/>
+            <wp:docPr id="716230217" name="Picture 2"/>
+            <wp:cNvGraphicFramePr>
+              <a:graphicFrameLocks xmlns:a="http://schemas.openxmlformats.org/drawingml/2006/main" noChangeAspect="1"/>
+            </wp:cNvGraphicFramePr>
+            <a:graphic xmlns:a="http://schemas.openxmlformats.org/drawingml/2006/main">
+              <a:graphicData uri="http://schemas.openxmlformats.org/drawingml/2006/picture">
+                <pic:pic xmlns:pic="http://schemas.openxmlformats.org/drawingml/2006/picture">
+                  <pic:nvPicPr>
+                    <pic:cNvPr id="0" name="Picture 3"/>
+                    <pic:cNvPicPr>
+                      <a:picLocks noChangeAspect="1" noChangeArrowheads="1"/>
+                    </pic:cNvPicPr>
+                  </pic:nvPicPr>
+                  <pic:blipFill>
+                    <a:blip r:embed="rId22" cstate="print">
+                      <a:extLst>
+                        <a:ext uri="{28A0092B-C50C-407E-A947-70E740481C1C}">
+                          <a14:useLocalDpi xmlns:a14="http://schemas.microsoft.com/office/drawing/2010/main" val="0"/>
+                        </a:ext>
+                      </a:extLst>
+                    </a:blip>
+                    <a:srcRect/>
+                    <a:stretch>
+                      <a:fillRect/>
+                    </a:stretch>
+                  </pic:blipFill>
+                  <pic:spPr bwMode="auto">
+                    <a:xfrm>
+                      <a:off x="0" y="0"/>
+                      <a:ext cx="5943600" cy="2168525"/>
+                    </a:xfrm>
+                    <a:prstGeom prst="rect">
+                      <a:avLst/>
+                    </a:prstGeom>
+                    <a:noFill/>
+                    <a:ln>
+                      <a:noFill/>
+                    </a:ln>
+                  </pic:spPr>
+                </pic:pic>
+              </a:graphicData>
+            </a:graphic>
+          </wp:inline>
+        </w:drawing>
+      </w:r>
+    </w:p>
     <w:p>
       <w:pPr>
         <w:pStyle w:val="Heading2"/>
@@ -4148,7 +4879,415 @@
           <w:szCs w:val="24"/>
         </w:rPr>
       </w:pPr>
-      <w:bookmarkStart w:id="23" w:name="_Toc230952865"/>
+      <w:bookmarkStart w:id="24" w:name="_Toc232646227"/>
+      <w:r>
+        <w:rPr>
+          <w:rFonts w:ascii="Times New Roman" w:hAnsi="Times New Roman" w:cs="Times New Roman"/>
+          <w:color w:val="auto"/>
+          <w:sz w:val="24"/>
+          <w:szCs w:val="24"/>
+        </w:rPr>
+        <w:t>Fig 1</w:t>
+      </w:r>
+      <w:r>
+        <w:rPr>
+          <w:rFonts w:ascii="Times New Roman" w:hAnsi="Times New Roman" w:cs="Times New Roman"/>
+          <w:color w:val="auto"/>
+          <w:sz w:val="24"/>
+          <w:szCs w:val="24"/>
+        </w:rPr>
+        <w:t>=</w:t>
+      </w:r>
+      <w:r>
+        <w:rPr>
+          <w:rFonts w:ascii="Times New Roman" w:hAnsi="Times New Roman" w:cs="Times New Roman"/>
+          <w:color w:val="auto"/>
+          <w:sz w:val="24"/>
+          <w:szCs w:val="24"/>
+        </w:rPr>
+        <w:t xml:space="preserve"> Word2Vec vs </w:t>
+      </w:r>
+      <w:proofErr w:type="spellStart"/>
+      <w:r>
+        <w:rPr>
+          <w:rFonts w:ascii="Times New Roman" w:hAnsi="Times New Roman" w:cs="Times New Roman"/>
+          <w:color w:val="auto"/>
+          <w:sz w:val="24"/>
+          <w:szCs w:val="24"/>
+        </w:rPr>
+        <w:t>FastText</w:t>
+      </w:r>
+      <w:proofErr w:type="spellEnd"/>
+      <w:r>
+        <w:rPr>
+          <w:rFonts w:ascii="Times New Roman" w:hAnsi="Times New Roman" w:cs="Times New Roman"/>
+          <w:color w:val="auto"/>
+          <w:sz w:val="24"/>
+          <w:szCs w:val="24"/>
+        </w:rPr>
+        <w:t xml:space="preserve"> vs </w:t>
+      </w:r>
+      <w:proofErr w:type="spellStart"/>
+      <w:r>
+        <w:rPr>
+          <w:rFonts w:ascii="Times New Roman" w:hAnsi="Times New Roman" w:cs="Times New Roman"/>
+          <w:color w:val="auto"/>
+          <w:sz w:val="24"/>
+          <w:szCs w:val="24"/>
+        </w:rPr>
+        <w:t>GloV</w:t>
+      </w:r>
+      <w:r>
+        <w:rPr>
+          <w:rFonts w:ascii="Times New Roman" w:hAnsi="Times New Roman" w:cs="Times New Roman"/>
+          <w:color w:val="auto"/>
+          <w:sz w:val="24"/>
+          <w:szCs w:val="24"/>
+        </w:rPr>
+        <w:t>e</w:t>
+      </w:r>
+      <w:bookmarkEnd w:id="24"/>
+      <w:proofErr w:type="spellEnd"/>
+    </w:p>
+    <w:p>
+      <w:pPr>
+        <w:rPr>
+          <w:rFonts w:ascii="Times New Roman" w:hAnsi="Times New Roman" w:cs="Times New Roman"/>
+          <w:sz w:val="24"/>
+          <w:szCs w:val="24"/>
+          <w:lang w:val="en-KE"/>
+        </w:rPr>
+      </w:pPr>
+      <w:r>
+        <w:rPr>
+          <w:rFonts w:ascii="Times New Roman" w:hAnsi="Times New Roman" w:cs="Times New Roman"/>
+          <w:sz w:val="24"/>
+          <w:szCs w:val="24"/>
+          <w:lang w:val="en-KE"/>
+        </w:rPr>
+        <w:drawing>
+          <wp:inline distT="0" distB="0" distL="0" distR="0" wp14:anchorId="79CC6DD5" wp14:editId="5B133CC0">
+            <wp:extent cx="5943600" cy="2740660"/>
+            <wp:effectExtent l="0" t="0" r="0" b="2540"/>
+            <wp:docPr id="1388501270" name="Picture 3"/>
+            <wp:cNvGraphicFramePr>
+              <a:graphicFrameLocks xmlns:a="http://schemas.openxmlformats.org/drawingml/2006/main" noChangeAspect="1"/>
+            </wp:cNvGraphicFramePr>
+            <a:graphic xmlns:a="http://schemas.openxmlformats.org/drawingml/2006/main">
+              <a:graphicData uri="http://schemas.openxmlformats.org/drawingml/2006/picture">
+                <pic:pic xmlns:pic="http://schemas.openxmlformats.org/drawingml/2006/picture">
+                  <pic:nvPicPr>
+                    <pic:cNvPr id="0" name="Picture 5"/>
+                    <pic:cNvPicPr>
+                      <a:picLocks noChangeAspect="1" noChangeArrowheads="1"/>
+                    </pic:cNvPicPr>
+                  </pic:nvPicPr>
+                  <pic:blipFill>
+                    <a:blip r:embed="rId23" cstate="print">
+                      <a:extLst>
+                        <a:ext uri="{28A0092B-C50C-407E-A947-70E740481C1C}">
+                          <a14:useLocalDpi xmlns:a14="http://schemas.microsoft.com/office/drawing/2010/main" val="0"/>
+                        </a:ext>
+                      </a:extLst>
+                    </a:blip>
+                    <a:srcRect/>
+                    <a:stretch>
+                      <a:fillRect/>
+                    </a:stretch>
+                  </pic:blipFill>
+                  <pic:spPr bwMode="auto">
+                    <a:xfrm>
+                      <a:off x="0" y="0"/>
+                      <a:ext cx="5943600" cy="2740660"/>
+                    </a:xfrm>
+                    <a:prstGeom prst="rect">
+                      <a:avLst/>
+                    </a:prstGeom>
+                    <a:noFill/>
+                    <a:ln>
+                      <a:noFill/>
+                    </a:ln>
+                  </pic:spPr>
+                </pic:pic>
+              </a:graphicData>
+            </a:graphic>
+          </wp:inline>
+        </w:drawing>
+      </w:r>
+    </w:p>
+    <w:p>
+      <w:pPr>
+        <w:pStyle w:val="Heading2"/>
+        <w:rPr>
+          <w:rFonts w:ascii="Times New Roman" w:hAnsi="Times New Roman" w:cs="Times New Roman"/>
+          <w:color w:val="auto"/>
+          <w:sz w:val="24"/>
+          <w:szCs w:val="24"/>
+        </w:rPr>
+      </w:pPr>
+      <w:bookmarkStart w:id="25" w:name="_Toc232646228"/>
+      <w:r>
+        <w:rPr>
+          <w:rFonts w:ascii="Times New Roman" w:hAnsi="Times New Roman" w:cs="Times New Roman"/>
+          <w:color w:val="auto"/>
+          <w:sz w:val="24"/>
+          <w:szCs w:val="24"/>
+        </w:rPr>
+        <w:lastRenderedPageBreak/>
+        <w:t>Fig 2</w:t>
+      </w:r>
+      <w:r>
+        <w:rPr>
+          <w:rFonts w:ascii="Times New Roman" w:hAnsi="Times New Roman" w:cs="Times New Roman"/>
+          <w:color w:val="auto"/>
+          <w:sz w:val="24"/>
+          <w:szCs w:val="24"/>
+        </w:rPr>
+        <w:t>=</w:t>
+      </w:r>
+      <w:r>
+        <w:rPr>
+          <w:rFonts w:ascii="Times New Roman" w:hAnsi="Times New Roman" w:cs="Times New Roman"/>
+          <w:color w:val="auto"/>
+          <w:sz w:val="24"/>
+          <w:szCs w:val="24"/>
+        </w:rPr>
+        <w:t xml:space="preserve"> Word Analogy Output</w:t>
+      </w:r>
+      <w:bookmarkEnd w:id="25"/>
+    </w:p>
+    <w:p>
+      <w:pPr>
+        <w:rPr>
+          <w:rFonts w:ascii="Times New Roman" w:hAnsi="Times New Roman" w:cs="Times New Roman"/>
+          <w:sz w:val="24"/>
+          <w:szCs w:val="24"/>
+          <w:lang w:val="en-KE"/>
+        </w:rPr>
+      </w:pPr>
+      <w:r>
+        <w:rPr>
+          <w:rFonts w:ascii="Times New Roman" w:hAnsi="Times New Roman" w:cs="Times New Roman"/>
+          <w:sz w:val="24"/>
+          <w:szCs w:val="24"/>
+          <w:lang w:val="en-KE"/>
+        </w:rPr>
+        <w:drawing>
+          <wp:inline distT="0" distB="0" distL="0" distR="0" wp14:anchorId="73C4BD35" wp14:editId="675061B0">
+            <wp:extent cx="5943600" cy="3448685"/>
+            <wp:effectExtent l="0" t="0" r="0" b="0"/>
+            <wp:docPr id="743186473" name="Picture 4"/>
+            <wp:cNvGraphicFramePr>
+              <a:graphicFrameLocks xmlns:a="http://schemas.openxmlformats.org/drawingml/2006/main" noChangeAspect="1"/>
+            </wp:cNvGraphicFramePr>
+            <a:graphic xmlns:a="http://schemas.openxmlformats.org/drawingml/2006/main">
+              <a:graphicData uri="http://schemas.openxmlformats.org/drawingml/2006/picture">
+                <pic:pic xmlns:pic="http://schemas.openxmlformats.org/drawingml/2006/picture">
+                  <pic:nvPicPr>
+                    <pic:cNvPr id="0" name="Picture 7"/>
+                    <pic:cNvPicPr>
+                      <a:picLocks noChangeAspect="1" noChangeArrowheads="1"/>
+                    </pic:cNvPicPr>
+                  </pic:nvPicPr>
+                  <pic:blipFill>
+                    <a:blip r:embed="rId24">
+                      <a:extLst>
+                        <a:ext uri="{28A0092B-C50C-407E-A947-70E740481C1C}">
+                          <a14:useLocalDpi xmlns:a14="http://schemas.microsoft.com/office/drawing/2010/main" val="0"/>
+                        </a:ext>
+                      </a:extLst>
+                    </a:blip>
+                    <a:srcRect/>
+                    <a:stretch>
+                      <a:fillRect/>
+                    </a:stretch>
+                  </pic:blipFill>
+                  <pic:spPr bwMode="auto">
+                    <a:xfrm>
+                      <a:off x="0" y="0"/>
+                      <a:ext cx="5943600" cy="3448685"/>
+                    </a:xfrm>
+                    <a:prstGeom prst="rect">
+                      <a:avLst/>
+                    </a:prstGeom>
+                    <a:noFill/>
+                    <a:ln>
+                      <a:noFill/>
+                    </a:ln>
+                  </pic:spPr>
+                </pic:pic>
+              </a:graphicData>
+            </a:graphic>
+          </wp:inline>
+        </w:drawing>
+      </w:r>
+    </w:p>
+    <w:p>
+      <w:pPr>
+        <w:pStyle w:val="Heading2"/>
+        <w:rPr>
+          <w:rFonts w:ascii="Times New Roman" w:hAnsi="Times New Roman" w:cs="Times New Roman"/>
+          <w:color w:val="auto"/>
+          <w:sz w:val="24"/>
+          <w:szCs w:val="24"/>
+        </w:rPr>
+      </w:pPr>
+      <w:bookmarkStart w:id="26" w:name="_Toc232646229"/>
+      <w:r>
+        <w:rPr>
+          <w:rFonts w:ascii="Times New Roman" w:hAnsi="Times New Roman" w:cs="Times New Roman"/>
+          <w:color w:val="auto"/>
+          <w:sz w:val="24"/>
+          <w:szCs w:val="24"/>
+        </w:rPr>
+        <w:t>Fig 3</w:t>
+      </w:r>
+      <w:r>
+        <w:rPr>
+          <w:rFonts w:ascii="Times New Roman" w:hAnsi="Times New Roman" w:cs="Times New Roman"/>
+          <w:color w:val="auto"/>
+          <w:sz w:val="24"/>
+          <w:szCs w:val="24"/>
+        </w:rPr>
+        <w:t>-</w:t>
+      </w:r>
+      <w:r>
+        <w:rPr>
+          <w:rFonts w:ascii="Times New Roman" w:hAnsi="Times New Roman" w:cs="Times New Roman"/>
+          <w:color w:val="auto"/>
+          <w:sz w:val="24"/>
+          <w:szCs w:val="24"/>
+        </w:rPr>
+        <w:t xml:space="preserve"> Embedding-Based Sentiment Classifier</w:t>
+      </w:r>
+      <w:bookmarkEnd w:id="26"/>
+    </w:p>
+    <w:p>
+      <w:pPr>
+        <w:rPr>
+          <w:rFonts w:ascii="Times New Roman" w:hAnsi="Times New Roman" w:cs="Times New Roman"/>
+          <w:sz w:val="24"/>
+          <w:szCs w:val="24"/>
+          <w:lang w:val="en-KE"/>
+        </w:rPr>
+      </w:pPr>
+      <w:r>
+        <w:rPr>
+          <w:rFonts w:ascii="Times New Roman" w:hAnsi="Times New Roman" w:cs="Times New Roman"/>
+          <w:sz w:val="24"/>
+          <w:szCs w:val="24"/>
+          <w:lang w:val="en-KE"/>
+        </w:rPr>
+        <w:drawing>
+          <wp:inline distT="0" distB="0" distL="0" distR="0" wp14:anchorId="3DD9358D" wp14:editId="22A6262C">
+            <wp:extent cx="5943600" cy="2533015"/>
+            <wp:effectExtent l="0" t="0" r="0" b="635"/>
+            <wp:docPr id="825131349" name="Picture 5"/>
+            <wp:cNvGraphicFramePr>
+              <a:graphicFrameLocks xmlns:a="http://schemas.openxmlformats.org/drawingml/2006/main" noChangeAspect="1"/>
+            </wp:cNvGraphicFramePr>
+            <a:graphic xmlns:a="http://schemas.openxmlformats.org/drawingml/2006/main">
+              <a:graphicData uri="http://schemas.openxmlformats.org/drawingml/2006/picture">
+                <pic:pic xmlns:pic="http://schemas.openxmlformats.org/drawingml/2006/picture">
+                  <pic:nvPicPr>
+                    <pic:cNvPr id="0" name="Picture 9"/>
+                    <pic:cNvPicPr>
+                      <a:picLocks noChangeAspect="1" noChangeArrowheads="1"/>
+                    </pic:cNvPicPr>
+                  </pic:nvPicPr>
+                  <pic:blipFill>
+                    <a:blip r:embed="rId25" cstate="print">
+                      <a:extLst>
+                        <a:ext uri="{28A0092B-C50C-407E-A947-70E740481C1C}">
+                          <a14:useLocalDpi xmlns:a14="http://schemas.microsoft.com/office/drawing/2010/main" val="0"/>
+                        </a:ext>
+                      </a:extLst>
+                    </a:blip>
+                    <a:srcRect/>
+                    <a:stretch>
+                      <a:fillRect/>
+                    </a:stretch>
+                  </pic:blipFill>
+                  <pic:spPr bwMode="auto">
+                    <a:xfrm>
+                      <a:off x="0" y="0"/>
+                      <a:ext cx="5943600" cy="2533015"/>
+                    </a:xfrm>
+                    <a:prstGeom prst="rect">
+                      <a:avLst/>
+                    </a:prstGeom>
+                    <a:noFill/>
+                    <a:ln>
+                      <a:noFill/>
+                    </a:ln>
+                  </pic:spPr>
+                </pic:pic>
+              </a:graphicData>
+            </a:graphic>
+          </wp:inline>
+        </w:drawing>
+      </w:r>
+    </w:p>
+    <w:p>
+      <w:pPr>
+        <w:pStyle w:val="Heading2"/>
+        <w:rPr>
+          <w:rFonts w:ascii="Times New Roman" w:hAnsi="Times New Roman" w:cs="Times New Roman"/>
+          <w:color w:val="auto"/>
+          <w:sz w:val="24"/>
+          <w:szCs w:val="24"/>
+        </w:rPr>
+      </w:pPr>
+      <w:bookmarkStart w:id="27" w:name="_Toc232646230"/>
+      <w:r>
+        <w:rPr>
+          <w:rFonts w:ascii="Times New Roman" w:hAnsi="Times New Roman" w:cs="Times New Roman"/>
+          <w:color w:val="auto"/>
+          <w:sz w:val="24"/>
+          <w:szCs w:val="24"/>
+        </w:rPr>
+        <w:t>Fig 4</w:t>
+      </w:r>
+      <w:r>
+        <w:rPr>
+          <w:rFonts w:ascii="Times New Roman" w:hAnsi="Times New Roman" w:cs="Times New Roman"/>
+          <w:color w:val="auto"/>
+          <w:sz w:val="24"/>
+          <w:szCs w:val="24"/>
+        </w:rPr>
+        <w:t>-</w:t>
+      </w:r>
+      <w:r>
+        <w:rPr>
+          <w:rFonts w:ascii="Times New Roman" w:hAnsi="Times New Roman" w:cs="Times New Roman"/>
+          <w:color w:val="auto"/>
+          <w:sz w:val="24"/>
+          <w:szCs w:val="24"/>
+        </w:rPr>
+        <w:t xml:space="preserve"> RNN vs LSTM Comparison</w:t>
+      </w:r>
+      <w:bookmarkEnd w:id="27"/>
+    </w:p>
+    <w:p>
+      <w:pPr>
+        <w:rPr>
+          <w:rFonts w:ascii="Times New Roman" w:hAnsi="Times New Roman" w:cs="Times New Roman"/>
+          <w:sz w:val="24"/>
+          <w:szCs w:val="24"/>
+        </w:rPr>
+      </w:pPr>
+    </w:p>
+    <w:p>
+      <w:pPr>
+        <w:pStyle w:val="Heading2"/>
+        <w:rPr>
+          <w:rFonts w:ascii="Times New Roman" w:hAnsi="Times New Roman" w:cs="Times New Roman"/>
+          <w:color w:val="auto"/>
+          <w:sz w:val="24"/>
+          <w:szCs w:val="24"/>
+        </w:rPr>
+      </w:pPr>
+      <w:bookmarkStart w:id="28" w:name="_Toc232646231"/>
       <w:r>
         <w:rPr>
           <w:rFonts w:ascii="Times New Roman" w:hAnsi="Times New Roman" w:cs="Times New Roman"/>
@@ -4158,33 +5297,123 @@
         </w:rPr>
         <w:t>SUMMARY</w:t>
       </w:r>
-      <w:bookmarkEnd w:id="23"/>
-    </w:p>
-    <w:p>
-      <w:pPr>
-        <w:rPr>
-          <w:rFonts w:ascii="Times New Roman" w:hAnsi="Times New Roman" w:cs="Times New Roman"/>
-          <w:sz w:val="24"/>
-          <w:szCs w:val="24"/>
-        </w:rPr>
-      </w:pPr>
-      <w:r>
-        <w:rPr>
-          <w:rFonts w:ascii="Times New Roman" w:hAnsi="Times New Roman" w:cs="Times New Roman"/>
-          <w:sz w:val="24"/>
-          <w:szCs w:val="24"/>
-        </w:rPr>
-        <w:t>The parser worked well in identifying noun phrases in sentences 5 from the text, as shown in Fig 1, by following the grammar rules on the POS tagged tokens. The dependency analysis is conducted on each sentence, separating the nouns, verbs, adjectives and adverbs, as shown in Fig 2, which helps to understand the structure of each sentence. Fig 3 shows semantic similarity as WordNet path similarity score: dog' and 'animal' had a high score while 'happy' and 'sad' had low score. This proves that meaning of words could be measured mathematically by computer. In machine translation and grammar checkers, syntactic parsing is used, and in search engines and recommendation systems, semantic similarity is used.</w:t>
-      </w:r>
-    </w:p>
-    <w:p>
-      <w:pPr>
-        <w:rPr>
-          <w:rFonts w:ascii="Times New Roman" w:hAnsi="Times New Roman" w:cs="Times New Roman"/>
-          <w:sz w:val="24"/>
-          <w:szCs w:val="24"/>
-        </w:rPr>
-      </w:pPr>
+      <w:bookmarkEnd w:id="28"/>
+    </w:p>
+    <w:p>
+      <w:pPr>
+        <w:rPr>
+          <w:rFonts w:ascii="Times New Roman" w:hAnsi="Times New Roman" w:cs="Times New Roman"/>
+          <w:sz w:val="24"/>
+          <w:szCs w:val="24"/>
+        </w:rPr>
+      </w:pPr>
+      <w:r>
+        <w:rPr>
+          <w:rFonts w:ascii="Times New Roman" w:hAnsi="Times New Roman" w:cs="Times New Roman"/>
+          <w:sz w:val="24"/>
+          <w:szCs w:val="24"/>
+        </w:rPr>
+        <w:t xml:space="preserve">These four additional tasks compared Word2Vec with </w:t>
+      </w:r>
+      <w:proofErr w:type="spellStart"/>
+      <w:r>
+        <w:rPr>
+          <w:rFonts w:ascii="Times New Roman" w:hAnsi="Times New Roman" w:cs="Times New Roman"/>
+          <w:sz w:val="24"/>
+          <w:szCs w:val="24"/>
+        </w:rPr>
+        <w:t>FastText</w:t>
+      </w:r>
+      <w:proofErr w:type="spellEnd"/>
+      <w:r>
+        <w:rPr>
+          <w:rFonts w:ascii="Times New Roman" w:hAnsi="Times New Roman" w:cs="Times New Roman"/>
+          <w:sz w:val="24"/>
+          <w:szCs w:val="24"/>
+        </w:rPr>
+        <w:t xml:space="preserve"> and pre-trained </w:t>
+      </w:r>
+      <w:proofErr w:type="spellStart"/>
+      <w:r>
+        <w:rPr>
+          <w:rFonts w:ascii="Times New Roman" w:hAnsi="Times New Roman" w:cs="Times New Roman"/>
+          <w:sz w:val="24"/>
+          <w:szCs w:val="24"/>
+        </w:rPr>
+        <w:t>GloVe</w:t>
+      </w:r>
+      <w:proofErr w:type="spellEnd"/>
+      <w:r>
+        <w:rPr>
+          <w:rFonts w:ascii="Times New Roman" w:hAnsi="Times New Roman" w:cs="Times New Roman"/>
+          <w:sz w:val="24"/>
+          <w:szCs w:val="24"/>
+        </w:rPr>
+        <w:t xml:space="preserve"> embeddings and then applied them practically: </w:t>
+      </w:r>
+      <w:proofErr w:type="spellStart"/>
+      <w:r>
+        <w:rPr>
+          <w:rFonts w:ascii="Times New Roman" w:hAnsi="Times New Roman" w:cs="Times New Roman"/>
+          <w:sz w:val="24"/>
+          <w:szCs w:val="24"/>
+        </w:rPr>
+        <w:t>FastText</w:t>
+      </w:r>
+      <w:proofErr w:type="spellEnd"/>
+      <w:r>
+        <w:rPr>
+          <w:rFonts w:ascii="Times New Roman" w:hAnsi="Times New Roman" w:cs="Times New Roman"/>
+          <w:sz w:val="24"/>
+          <w:szCs w:val="24"/>
+        </w:rPr>
+        <w:t xml:space="preserve"> was able to represent an unseen word using sub-word units, where Word2Vec would have thrown a </w:t>
+      </w:r>
+      <w:proofErr w:type="spellStart"/>
+      <w:r>
+        <w:rPr>
+          <w:rFonts w:ascii="Times New Roman" w:hAnsi="Times New Roman" w:cs="Times New Roman"/>
+          <w:sz w:val="24"/>
+          <w:szCs w:val="24"/>
+        </w:rPr>
+        <w:t>KeyError</w:t>
+      </w:r>
+      <w:proofErr w:type="spellEnd"/>
+      <w:r>
+        <w:rPr>
+          <w:rFonts w:ascii="Times New Roman" w:hAnsi="Times New Roman" w:cs="Times New Roman"/>
+          <w:sz w:val="24"/>
+          <w:szCs w:val="24"/>
+        </w:rPr>
+        <w:t xml:space="preserve"> on the unseen word, proving to be the better embedding method for rare or new words compared to the other options; A sentiment classifier was rebuilt using averaged Word2Vec vectors, using only 20 dimensions </w:t>
+      </w:r>
+      <w:r>
+        <w:rPr>
+          <w:rFonts w:ascii="Times New Roman" w:hAnsi="Times New Roman" w:cs="Times New Roman"/>
+          <w:sz w:val="24"/>
+          <w:szCs w:val="24"/>
+        </w:rPr>
+        <w:lastRenderedPageBreak/>
+        <w:t xml:space="preserve">as opposed to 10,000 for TF-IDF, demonstrating that it captures meaning in the same way; </w:t>
+      </w:r>
+      <w:proofErr w:type="spellStart"/>
+      <w:r>
+        <w:rPr>
+          <w:rFonts w:ascii="Times New Roman" w:hAnsi="Times New Roman" w:cs="Times New Roman"/>
+          <w:sz w:val="24"/>
+          <w:szCs w:val="24"/>
+        </w:rPr>
+        <w:t>SimpleRNN</w:t>
+      </w:r>
+      <w:proofErr w:type="spellEnd"/>
+      <w:r>
+        <w:rPr>
+          <w:rFonts w:ascii="Times New Roman" w:hAnsi="Times New Roman" w:cs="Times New Roman"/>
+          <w:sz w:val="24"/>
+          <w:szCs w:val="24"/>
+        </w:rPr>
+        <w:t xml:space="preserve"> and LSTM were trained side by side, showing how the gating mechanism of LSTMs solves the vanishing gradient problem of simple RNNs.</w:t>
+      </w:r>
     </w:p>
     <w:sectPr>
       <w:pgSz w:w="12240" w:h="15840"/>
@@ -4197,7 +5426,7 @@
 </file>
 
 <file path=word/styles.xml><?xml version="1.0" encoding="utf-8"?>
-<w:styles xmlns:mc="http://schemas.openxmlformats.org/markup-compatibility/2006" xmlns:r="http://schemas.openxmlformats.org/officeDocument/2006/relationships" xmlns:w="http://schemas.openxmlformats.org/wordprocessingml/2006/main" xmlns:w14="http://schemas.microsoft.com/office/word/2010/wordml" xmlns:w15="http://schemas.microsoft.com/office/word/2012/wordml" xmlns:w16se="http://schemas.microsoft.com/office/word/2015/wordml/symex" mc:Ignorable="w14 w15 w16se">
+<w:styles xmlns:mc="http://schemas.openxmlformats.org/markup-compatibility/2006" xmlns:r="http://schemas.openxmlformats.org/officeDocument/2006/relationships" xmlns:w="http://schemas.openxmlformats.org/wordprocessingml/2006/main" xmlns:w14="http://schemas.microsoft.com/office/word/2010/wordml" xmlns:w15="http://schemas.microsoft.com/office/word/2012/wordml" xmlns:w16cex="http://schemas.microsoft.com/office/word/2018/wordml/cex" xmlns:w16cid="http://schemas.microsoft.com/office/word/2016/wordml/cid" xmlns:w16="http://schemas.microsoft.com/office/word/2018/wordml" xmlns:w16du="http://schemas.microsoft.com/office/word/2023/wordml/word16du" xmlns:w16sdtdh="http://schemas.microsoft.com/office/word/2020/wordml/sdtdatahash" xmlns:w16sdtfl="http://schemas.microsoft.com/office/word/2024/wordml/sdtformatlock" xmlns:w16se="http://schemas.microsoft.com/office/word/2015/wordml/symex" mc:Ignorable="w14 w15 w16se w16cid w16 w16cex w16sdtdh w16sdtfl w16du">
   <w:docDefaults>
     <w:rPrDefault>
       <w:rPr>
@@ -4213,7 +5442,7 @@
       </w:pPr>
     </w:pPrDefault>
   </w:docDefaults>
-  <w:latentStyles w:defLockedState="0" w:defUIPriority="99" w:defSemiHidden="0" w:defUnhideWhenUsed="0" w:defQFormat="0" w:count="371">
+  <w:latentStyles w:defLockedState="0" w:defUIPriority="99" w:defSemiHidden="0" w:defUnhideWhenUsed="0" w:defQFormat="0" w:count="376">
     <w:lsdException w:name="Normal" w:uiPriority="0" w:qFormat="1"/>
     <w:lsdException w:name="heading 1" w:uiPriority="9" w:qFormat="1"/>
     <w:lsdException w:name="heading 2" w:semiHidden="1" w:uiPriority="9" w:unhideWhenUsed="1" w:qFormat="1"/>
@@ -4585,6 +5814,11 @@
     <w:lsdException w:name="List Table 5 Dark Accent 6" w:uiPriority="50"/>
     <w:lsdException w:name="List Table 6 Colorful Accent 6" w:uiPriority="51"/>
     <w:lsdException w:name="List Table 7 Colorful Accent 6" w:uiPriority="52"/>
+    <w:lsdException w:name="Mention" w:semiHidden="1" w:unhideWhenUsed="1"/>
+    <w:lsdException w:name="Smart Hyperlink" w:semiHidden="1" w:unhideWhenUsed="1"/>
+    <w:lsdException w:name="Hashtag" w:semiHidden="1" w:unhideWhenUsed="1"/>
+    <w:lsdException w:name="Unresolved Mention" w:semiHidden="1" w:unhideWhenUsed="1"/>
+    <w:lsdException w:name="Smart Link" w:semiHidden="1" w:unhideWhenUsed="1"/>
   </w:latentStyles>
   <w:style w:type="paragraph" w:default="1" w:styleId="Normal">
     <w:name w:val="Normal"/>
@@ -4637,7 +5871,6 @@
   <w:style w:type="character" w:default="1" w:styleId="DefaultParagraphFont">
     <w:name w:val="Default Paragraph Font"/>
     <w:uiPriority w:val="1"/>
-    <w:semiHidden/>
     <w:unhideWhenUsed/>
   </w:style>
   <w:style w:type="table" w:default="1" w:styleId="TableNormal">

</xml_diff>

<commit_message>
Updated extrawork upto week 8
</commit_message>
<xml_diff>
--- a/NLP EXTRAWORK.docx
+++ b/NLP EXTRAWORK.docx
@@ -453,7 +453,7 @@
           <w:r>
             <w:fldChar w:fldCharType="separate"/>
           </w:r>
-          <w:hyperlink w:anchor="_Toc232646203" w:history="1">
+          <w:hyperlink w:anchor="_Toc233319111" w:history="1">
             <w:r>
               <w:rPr>
                 <w:rStyle w:val="Hyperlink"/>
@@ -482,7 +482,7 @@
                 <w:noProof/>
                 <w:webHidden/>
               </w:rPr>
-              <w:instrText xml:space="preserve"> PAGEREF _Toc232646203 \h </w:instrText>
+              <w:instrText xml:space="preserve"> PAGEREF _Toc233319111 \h </w:instrText>
             </w:r>
             <w:r>
               <w:rPr>
@@ -529,7 +529,7 @@
               <w14:ligatures w14:val="standardContextual"/>
             </w:rPr>
           </w:pPr>
-          <w:hyperlink w:anchor="_Toc232646204" w:history="1">
+          <w:hyperlink w:anchor="_Toc233319112" w:history="1">
             <w:r>
               <w:rPr>
                 <w:rStyle w:val="Hyperlink"/>
@@ -557,7 +557,7 @@
                 <w:noProof/>
                 <w:webHidden/>
               </w:rPr>
-              <w:instrText xml:space="preserve"> PAGEREF _Toc232646204 \h </w:instrText>
+              <w:instrText xml:space="preserve"> PAGEREF _Toc233319112 \h </w:instrText>
             </w:r>
             <w:r>
               <w:rPr>
@@ -577,7 +577,7 @@
                 <w:noProof/>
                 <w:webHidden/>
               </w:rPr>
-              <w:t>4</w:t>
+              <w:t>5</w:t>
             </w:r>
             <w:r>
               <w:rPr>
@@ -604,7 +604,7 @@
               <w14:ligatures w14:val="standardContextual"/>
             </w:rPr>
           </w:pPr>
-          <w:hyperlink w:anchor="_Toc232646205" w:history="1">
+          <w:hyperlink w:anchor="_Toc233319113" w:history="1">
             <w:r>
               <w:rPr>
                 <w:rStyle w:val="Hyperlink"/>
@@ -632,7 +632,7 @@
                 <w:noProof/>
                 <w:webHidden/>
               </w:rPr>
-              <w:instrText xml:space="preserve"> PAGEREF _Toc232646205 \h </w:instrText>
+              <w:instrText xml:space="preserve"> PAGEREF _Toc233319113 \h </w:instrText>
             </w:r>
             <w:r>
               <w:rPr>
@@ -652,7 +652,7 @@
                 <w:noProof/>
                 <w:webHidden/>
               </w:rPr>
-              <w:t>5</w:t>
+              <w:t>6</w:t>
             </w:r>
             <w:r>
               <w:rPr>
@@ -679,7 +679,7 @@
               <w14:ligatures w14:val="standardContextual"/>
             </w:rPr>
           </w:pPr>
-          <w:hyperlink w:anchor="_Toc232646206" w:history="1">
+          <w:hyperlink w:anchor="_Toc233319114" w:history="1">
             <w:r>
               <w:rPr>
                 <w:rStyle w:val="Hyperlink"/>
@@ -707,7 +707,7 @@
                 <w:noProof/>
                 <w:webHidden/>
               </w:rPr>
-              <w:instrText xml:space="preserve"> PAGEREF _Toc232646206 \h </w:instrText>
+              <w:instrText xml:space="preserve"> PAGEREF _Toc233319114 \h </w:instrText>
             </w:r>
             <w:r>
               <w:rPr>
@@ -727,7 +727,7 @@
                 <w:noProof/>
                 <w:webHidden/>
               </w:rPr>
-              <w:t>5</w:t>
+              <w:t>6</w:t>
             </w:r>
             <w:r>
               <w:rPr>
@@ -754,7 +754,7 @@
               <w14:ligatures w14:val="standardContextual"/>
             </w:rPr>
           </w:pPr>
-          <w:hyperlink w:anchor="_Toc232646207" w:history="1">
+          <w:hyperlink w:anchor="_Toc233319115" w:history="1">
             <w:r>
               <w:rPr>
                 <w:rStyle w:val="Hyperlink"/>
@@ -782,7 +782,7 @@
                 <w:noProof/>
                 <w:webHidden/>
               </w:rPr>
-              <w:instrText xml:space="preserve"> PAGEREF _Toc232646207 \h </w:instrText>
+              <w:instrText xml:space="preserve"> PAGEREF _Toc233319115 \h </w:instrText>
             </w:r>
             <w:r>
               <w:rPr>
@@ -802,7 +802,7 @@
                 <w:noProof/>
                 <w:webHidden/>
               </w:rPr>
-              <w:t>5</w:t>
+              <w:t>6</w:t>
             </w:r>
             <w:r>
               <w:rPr>
@@ -829,7 +829,7 @@
               <w14:ligatures w14:val="standardContextual"/>
             </w:rPr>
           </w:pPr>
-          <w:hyperlink w:anchor="_Toc232646208" w:history="1">
+          <w:hyperlink w:anchor="_Toc233319116" w:history="1">
             <w:r>
               <w:rPr>
                 <w:rStyle w:val="Hyperlink"/>
@@ -857,7 +857,7 @@
                 <w:noProof/>
                 <w:webHidden/>
               </w:rPr>
-              <w:instrText xml:space="preserve"> PAGEREF _Toc232646208 \h </w:instrText>
+              <w:instrText xml:space="preserve"> PAGEREF _Toc233319116 \h </w:instrText>
             </w:r>
             <w:r>
               <w:rPr>
@@ -877,7 +877,7 @@
                 <w:noProof/>
                 <w:webHidden/>
               </w:rPr>
-              <w:t>6</w:t>
+              <w:t>7</w:t>
             </w:r>
             <w:r>
               <w:rPr>
@@ -904,7 +904,7 @@
               <w14:ligatures w14:val="standardContextual"/>
             </w:rPr>
           </w:pPr>
-          <w:hyperlink w:anchor="_Toc232646209" w:history="1">
+          <w:hyperlink w:anchor="_Toc233319117" w:history="1">
             <w:r>
               <w:rPr>
                 <w:rStyle w:val="Hyperlink"/>
@@ -933,7 +933,7 @@
                 <w:noProof/>
                 <w:webHidden/>
               </w:rPr>
-              <w:instrText xml:space="preserve"> PAGEREF _Toc232646209 \h </w:instrText>
+              <w:instrText xml:space="preserve"> PAGEREF _Toc233319117 \h </w:instrText>
             </w:r>
             <w:r>
               <w:rPr>
@@ -953,7 +953,7 @@
                 <w:noProof/>
                 <w:webHidden/>
               </w:rPr>
-              <w:t>7</w:t>
+              <w:t>8</w:t>
             </w:r>
             <w:r>
               <w:rPr>
@@ -980,7 +980,7 @@
               <w14:ligatures w14:val="standardContextual"/>
             </w:rPr>
           </w:pPr>
-          <w:hyperlink w:anchor="_Toc232646210" w:history="1">
+          <w:hyperlink w:anchor="_Toc233319118" w:history="1">
             <w:r>
               <w:rPr>
                 <w:rStyle w:val="Hyperlink"/>
@@ -1008,7 +1008,7 @@
                 <w:noProof/>
                 <w:webHidden/>
               </w:rPr>
-              <w:instrText xml:space="preserve"> PAGEREF _Toc232646210 \h </w:instrText>
+              <w:instrText xml:space="preserve"> PAGEREF _Toc233319118 \h </w:instrText>
             </w:r>
             <w:r>
               <w:rPr>
@@ -1028,7 +1028,7 @@
                 <w:noProof/>
                 <w:webHidden/>
               </w:rPr>
-              <w:t>7</w:t>
+              <w:t>8</w:t>
             </w:r>
             <w:r>
               <w:rPr>
@@ -1055,7 +1055,7 @@
               <w14:ligatures w14:val="standardContextual"/>
             </w:rPr>
           </w:pPr>
-          <w:hyperlink w:anchor="_Toc232646211" w:history="1">
+          <w:hyperlink w:anchor="_Toc233319119" w:history="1">
             <w:r>
               <w:rPr>
                 <w:rStyle w:val="Hyperlink"/>
@@ -1083,7 +1083,7 @@
                 <w:noProof/>
                 <w:webHidden/>
               </w:rPr>
-              <w:instrText xml:space="preserve"> PAGEREF _Toc232646211 \h </w:instrText>
+              <w:instrText xml:space="preserve"> PAGEREF _Toc233319119 \h </w:instrText>
             </w:r>
             <w:r>
               <w:rPr>
@@ -1103,7 +1103,7 @@
                 <w:noProof/>
                 <w:webHidden/>
               </w:rPr>
-              <w:t>8</w:t>
+              <w:t>9</w:t>
             </w:r>
             <w:r>
               <w:rPr>
@@ -1130,7 +1130,7 @@
               <w14:ligatures w14:val="standardContextual"/>
             </w:rPr>
           </w:pPr>
-          <w:hyperlink w:anchor="_Toc232646212" w:history="1">
+          <w:hyperlink w:anchor="_Toc233319120" w:history="1">
             <w:r>
               <w:rPr>
                 <w:rStyle w:val="Hyperlink"/>
@@ -1158,7 +1158,7 @@
                 <w:noProof/>
                 <w:webHidden/>
               </w:rPr>
-              <w:instrText xml:space="preserve"> PAGEREF _Toc232646212 \h </w:instrText>
+              <w:instrText xml:space="preserve"> PAGEREF _Toc233319120 \h </w:instrText>
             </w:r>
             <w:r>
               <w:rPr>
@@ -1178,7 +1178,7 @@
                 <w:noProof/>
                 <w:webHidden/>
               </w:rPr>
-              <w:t>8</w:t>
+              <w:t>9</w:t>
             </w:r>
             <w:r>
               <w:rPr>
@@ -1205,7 +1205,7 @@
               <w14:ligatures w14:val="standardContextual"/>
             </w:rPr>
           </w:pPr>
-          <w:hyperlink w:anchor="_Toc232646213" w:history="1">
+          <w:hyperlink w:anchor="_Toc233319121" w:history="1">
             <w:r>
               <w:rPr>
                 <w:rStyle w:val="Hyperlink"/>
@@ -1241,7 +1241,7 @@
                 <w:noProof/>
                 <w:webHidden/>
               </w:rPr>
-              <w:instrText xml:space="preserve"> PAGEREF _Toc232646213 \h </w:instrText>
+              <w:instrText xml:space="preserve"> PAGEREF _Toc233319121 \h </w:instrText>
             </w:r>
             <w:r>
               <w:rPr>
@@ -1261,7 +1261,7 @@
                 <w:noProof/>
                 <w:webHidden/>
               </w:rPr>
-              <w:t>9</w:t>
+              <w:t>10</w:t>
             </w:r>
             <w:r>
               <w:rPr>
@@ -1288,7 +1288,7 @@
               <w14:ligatures w14:val="standardContextual"/>
             </w:rPr>
           </w:pPr>
-          <w:hyperlink w:anchor="_Toc232646214" w:history="1">
+          <w:hyperlink w:anchor="_Toc233319122" w:history="1">
             <w:r>
               <w:rPr>
                 <w:rStyle w:val="Hyperlink"/>
@@ -1316,7 +1316,7 @@
                 <w:noProof/>
                 <w:webHidden/>
               </w:rPr>
-              <w:instrText xml:space="preserve"> PAGEREF _Toc232646214 \h </w:instrText>
+              <w:instrText xml:space="preserve"> PAGEREF _Toc233319122 \h </w:instrText>
             </w:r>
             <w:r>
               <w:rPr>
@@ -1336,7 +1336,7 @@
                 <w:noProof/>
                 <w:webHidden/>
               </w:rPr>
-              <w:t>9</w:t>
+              <w:t>10</w:t>
             </w:r>
             <w:r>
               <w:rPr>
@@ -1363,7 +1363,7 @@
               <w14:ligatures w14:val="standardContextual"/>
             </w:rPr>
           </w:pPr>
-          <w:hyperlink w:anchor="_Toc232646215" w:history="1">
+          <w:hyperlink w:anchor="_Toc233319123" w:history="1">
             <w:r>
               <w:rPr>
                 <w:rStyle w:val="Hyperlink"/>
@@ -1392,7 +1392,7 @@
                 <w:noProof/>
                 <w:webHidden/>
               </w:rPr>
-              <w:instrText xml:space="preserve"> PAGEREF _Toc232646215 \h </w:instrText>
+              <w:instrText xml:space="preserve"> PAGEREF _Toc233319123 \h </w:instrText>
             </w:r>
             <w:r>
               <w:rPr>
@@ -1412,7 +1412,7 @@
                 <w:noProof/>
                 <w:webHidden/>
               </w:rPr>
-              <w:t>10</w:t>
+              <w:t>11</w:t>
             </w:r>
             <w:r>
               <w:rPr>
@@ -1439,7 +1439,7 @@
               <w14:ligatures w14:val="standardContextual"/>
             </w:rPr>
           </w:pPr>
-          <w:hyperlink w:anchor="_Toc232646216" w:history="1">
+          <w:hyperlink w:anchor="_Toc233319124" w:history="1">
             <w:r>
               <w:rPr>
                 <w:rStyle w:val="Hyperlink"/>
@@ -1467,7 +1467,7 @@
                 <w:noProof/>
                 <w:webHidden/>
               </w:rPr>
-              <w:instrText xml:space="preserve"> PAGEREF _Toc232646216 \h </w:instrText>
+              <w:instrText xml:space="preserve"> PAGEREF _Toc233319124 \h </w:instrText>
             </w:r>
             <w:r>
               <w:rPr>
@@ -1487,7 +1487,7 @@
                 <w:noProof/>
                 <w:webHidden/>
               </w:rPr>
-              <w:t>10</w:t>
+              <w:t>11</w:t>
             </w:r>
             <w:r>
               <w:rPr>
@@ -1514,7 +1514,7 @@
               <w14:ligatures w14:val="standardContextual"/>
             </w:rPr>
           </w:pPr>
-          <w:hyperlink w:anchor="_Toc232646217" w:history="1">
+          <w:hyperlink w:anchor="_Toc233319125" w:history="1">
             <w:r>
               <w:rPr>
                 <w:rStyle w:val="Hyperlink"/>
@@ -1542,7 +1542,7 @@
                 <w:noProof/>
                 <w:webHidden/>
               </w:rPr>
-              <w:instrText xml:space="preserve"> PAGEREF _Toc232646217 \h </w:instrText>
+              <w:instrText xml:space="preserve"> PAGEREF _Toc233319125 \h </w:instrText>
             </w:r>
             <w:r>
               <w:rPr>
@@ -1562,7 +1562,7 @@
                 <w:noProof/>
                 <w:webHidden/>
               </w:rPr>
-              <w:t>11</w:t>
+              <w:t>12</w:t>
             </w:r>
             <w:r>
               <w:rPr>
@@ -1589,14 +1589,14 @@
               <w14:ligatures w14:val="standardContextual"/>
             </w:rPr>
           </w:pPr>
-          <w:hyperlink w:anchor="_Toc232646218" w:history="1">
+          <w:hyperlink w:anchor="_Toc233319126" w:history="1">
             <w:r>
               <w:rPr>
                 <w:rStyle w:val="Hyperlink"/>
                 <w:rFonts w:ascii="Times New Roman" w:hAnsi="Times New Roman" w:cs="Times New Roman"/>
                 <w:noProof/>
               </w:rPr>
-              <w:t>Fig 3-Fragmantics understanding intended meaning from context</w:t>
+              <w:t>Fig 3- Pragmatics understanding intended meaning from context</w:t>
             </w:r>
             <w:r>
               <w:rPr>
@@ -1617,7 +1617,7 @@
                 <w:noProof/>
                 <w:webHidden/>
               </w:rPr>
-              <w:instrText xml:space="preserve"> PAGEREF _Toc232646218 \h </w:instrText>
+              <w:instrText xml:space="preserve"> PAGEREF _Toc233319126 \h </w:instrText>
             </w:r>
             <w:r>
               <w:rPr>
@@ -1637,7 +1637,7 @@
                 <w:noProof/>
                 <w:webHidden/>
               </w:rPr>
-              <w:t>12</w:t>
+              <w:t>13</w:t>
             </w:r>
             <w:r>
               <w:rPr>
@@ -1664,14 +1664,14 @@
               <w14:ligatures w14:val="standardContextual"/>
             </w:rPr>
           </w:pPr>
-          <w:hyperlink w:anchor="_Toc232646219" w:history="1">
+          <w:hyperlink w:anchor="_Toc233319127" w:history="1">
             <w:r>
               <w:rPr>
                 <w:rStyle w:val="Hyperlink"/>
                 <w:rFonts w:ascii="Times New Roman" w:hAnsi="Times New Roman" w:cs="Times New Roman"/>
                 <w:noProof/>
               </w:rPr>
-              <w:t>Fig 4- Combination and comparison of syntax, semantics and Fragmatics</w:t>
+              <w:t>Fig 4- Combination and comparison of syntax, semantics and Pragmatics</w:t>
             </w:r>
             <w:r>
               <w:rPr>
@@ -1692,7 +1692,7 @@
                 <w:noProof/>
                 <w:webHidden/>
               </w:rPr>
-              <w:instrText xml:space="preserve"> PAGEREF _Toc232646219 \h </w:instrText>
+              <w:instrText xml:space="preserve"> PAGEREF _Toc233319127 \h </w:instrText>
             </w:r>
             <w:r>
               <w:rPr>
@@ -1712,7 +1712,7 @@
                 <w:noProof/>
                 <w:webHidden/>
               </w:rPr>
-              <w:t>12</w:t>
+              <w:t>13</w:t>
             </w:r>
             <w:r>
               <w:rPr>
@@ -1739,7 +1739,7 @@
               <w14:ligatures w14:val="standardContextual"/>
             </w:rPr>
           </w:pPr>
-          <w:hyperlink w:anchor="_Toc232646220" w:history="1">
+          <w:hyperlink w:anchor="_Toc233319128" w:history="1">
             <w:r>
               <w:rPr>
                 <w:rStyle w:val="Hyperlink"/>
@@ -1767,7 +1767,7 @@
                 <w:noProof/>
                 <w:webHidden/>
               </w:rPr>
-              <w:instrText xml:space="preserve"> PAGEREF _Toc232646220 \h </w:instrText>
+              <w:instrText xml:space="preserve"> PAGEREF _Toc233319128 \h </w:instrText>
             </w:r>
             <w:r>
               <w:rPr>
@@ -1787,7 +1787,7 @@
                 <w:noProof/>
                 <w:webHidden/>
               </w:rPr>
-              <w:t>12</w:t>
+              <w:t>13</w:t>
             </w:r>
             <w:r>
               <w:rPr>
@@ -1814,7 +1814,7 @@
               <w14:ligatures w14:val="standardContextual"/>
             </w:rPr>
           </w:pPr>
-          <w:hyperlink w:anchor="_Toc232646221" w:history="1">
+          <w:hyperlink w:anchor="_Toc233319129" w:history="1">
             <w:r>
               <w:rPr>
                 <w:rStyle w:val="Hyperlink"/>
@@ -1843,7 +1843,7 @@
                 <w:noProof/>
                 <w:webHidden/>
               </w:rPr>
-              <w:instrText xml:space="preserve"> PAGEREF _Toc232646221 \h </w:instrText>
+              <w:instrText xml:space="preserve"> PAGEREF _Toc233319129 \h </w:instrText>
             </w:r>
             <w:r>
               <w:rPr>
@@ -1863,7 +1863,7 @@
                 <w:noProof/>
                 <w:webHidden/>
               </w:rPr>
-              <w:t>13</w:t>
+              <w:t>14</w:t>
             </w:r>
             <w:r>
               <w:rPr>
@@ -1890,7 +1890,7 @@
               <w14:ligatures w14:val="standardContextual"/>
             </w:rPr>
           </w:pPr>
-          <w:hyperlink w:anchor="_Toc232646222" w:history="1">
+          <w:hyperlink w:anchor="_Toc233319130" w:history="1">
             <w:r>
               <w:rPr>
                 <w:rStyle w:val="Hyperlink"/>
@@ -1918,7 +1918,7 @@
                 <w:noProof/>
                 <w:webHidden/>
               </w:rPr>
-              <w:instrText xml:space="preserve"> PAGEREF _Toc232646222 \h </w:instrText>
+              <w:instrText xml:space="preserve"> PAGEREF _Toc233319130 \h </w:instrText>
             </w:r>
             <w:r>
               <w:rPr>
@@ -1938,7 +1938,7 @@
                 <w:noProof/>
                 <w:webHidden/>
               </w:rPr>
-              <w:t>13</w:t>
+              <w:t>14</w:t>
             </w:r>
             <w:r>
               <w:rPr>
@@ -1965,7 +1965,7 @@
               <w14:ligatures w14:val="standardContextual"/>
             </w:rPr>
           </w:pPr>
-          <w:hyperlink w:anchor="_Toc232646223" w:history="1">
+          <w:hyperlink w:anchor="_Toc233319131" w:history="1">
             <w:r>
               <w:rPr>
                 <w:rStyle w:val="Hyperlink"/>
@@ -1993,7 +1993,7 @@
                 <w:noProof/>
                 <w:webHidden/>
               </w:rPr>
-              <w:instrText xml:space="preserve"> PAGEREF _Toc232646223 \h </w:instrText>
+              <w:instrText xml:space="preserve"> PAGEREF _Toc233319131 \h </w:instrText>
             </w:r>
             <w:r>
               <w:rPr>
@@ -2013,7 +2013,7 @@
                 <w:noProof/>
                 <w:webHidden/>
               </w:rPr>
-              <w:t>14</w:t>
+              <w:t>15</w:t>
             </w:r>
             <w:r>
               <w:rPr>
@@ -2040,7 +2040,7 @@
               <w14:ligatures w14:val="standardContextual"/>
             </w:rPr>
           </w:pPr>
-          <w:hyperlink w:anchor="_Toc232646224" w:history="1">
+          <w:hyperlink w:anchor="_Toc233319132" w:history="1">
             <w:r>
               <w:rPr>
                 <w:rStyle w:val="Hyperlink"/>
@@ -2068,7 +2068,7 @@
                 <w:noProof/>
                 <w:webHidden/>
               </w:rPr>
-              <w:instrText xml:space="preserve"> PAGEREF _Toc232646224 \h </w:instrText>
+              <w:instrText xml:space="preserve"> PAGEREF _Toc233319132 \h </w:instrText>
             </w:r>
             <w:r>
               <w:rPr>
@@ -2088,7 +2088,7 @@
                 <w:noProof/>
                 <w:webHidden/>
               </w:rPr>
-              <w:t>14</w:t>
+              <w:t>15</w:t>
             </w:r>
             <w:r>
               <w:rPr>
@@ -2115,7 +2115,7 @@
               <w14:ligatures w14:val="standardContextual"/>
             </w:rPr>
           </w:pPr>
-          <w:hyperlink w:anchor="_Toc232646225" w:history="1">
+          <w:hyperlink w:anchor="_Toc233319133" w:history="1">
             <w:r>
               <w:rPr>
                 <w:rStyle w:val="Hyperlink"/>
@@ -2143,7 +2143,7 @@
                 <w:noProof/>
                 <w:webHidden/>
               </w:rPr>
-              <w:instrText xml:space="preserve"> PAGEREF _Toc232646225 \h </w:instrText>
+              <w:instrText xml:space="preserve"> PAGEREF _Toc233319133 \h </w:instrText>
             </w:r>
             <w:r>
               <w:rPr>
@@ -2163,7 +2163,7 @@
                 <w:noProof/>
                 <w:webHidden/>
               </w:rPr>
-              <w:t>14</w:t>
+              <w:t>15</w:t>
             </w:r>
             <w:r>
               <w:rPr>
@@ -2190,7 +2190,7 @@
               <w14:ligatures w14:val="standardContextual"/>
             </w:rPr>
           </w:pPr>
-          <w:hyperlink w:anchor="_Toc232646226" w:history="1">
+          <w:hyperlink w:anchor="_Toc233319134" w:history="1">
             <w:r>
               <w:rPr>
                 <w:rStyle w:val="Hyperlink"/>
@@ -2220,7 +2220,7 @@
                 <w:noProof/>
                 <w:webHidden/>
               </w:rPr>
-              <w:instrText xml:space="preserve"> PAGEREF _Toc232646226 \h </w:instrText>
+              <w:instrText xml:space="preserve"> PAGEREF _Toc233319134 \h </w:instrText>
             </w:r>
             <w:r>
               <w:rPr>
@@ -2240,7 +2240,7 @@
                 <w:noProof/>
                 <w:webHidden/>
               </w:rPr>
-              <w:t>15</w:t>
+              <w:t>16</w:t>
             </w:r>
             <w:r>
               <w:rPr>
@@ -2267,7 +2267,7 @@
               <w14:ligatures w14:val="standardContextual"/>
             </w:rPr>
           </w:pPr>
-          <w:hyperlink w:anchor="_Toc232646227" w:history="1">
+          <w:hyperlink w:anchor="_Toc233319135" w:history="1">
             <w:r>
               <w:rPr>
                 <w:rStyle w:val="Hyperlink"/>
@@ -2295,7 +2295,7 @@
                 <w:noProof/>
                 <w:webHidden/>
               </w:rPr>
-              <w:instrText xml:space="preserve"> PAGEREF _Toc232646227 \h </w:instrText>
+              <w:instrText xml:space="preserve"> PAGEREF _Toc233319135 \h </w:instrText>
             </w:r>
             <w:r>
               <w:rPr>
@@ -2315,7 +2315,7 @@
                 <w:noProof/>
                 <w:webHidden/>
               </w:rPr>
-              <w:t>15</w:t>
+              <w:t>16</w:t>
             </w:r>
             <w:r>
               <w:rPr>
@@ -2342,7 +2342,7 @@
               <w14:ligatures w14:val="standardContextual"/>
             </w:rPr>
           </w:pPr>
-          <w:hyperlink w:anchor="_Toc232646228" w:history="1">
+          <w:hyperlink w:anchor="_Toc233319136" w:history="1">
             <w:r>
               <w:rPr>
                 <w:rStyle w:val="Hyperlink"/>
@@ -2370,7 +2370,7 @@
                 <w:noProof/>
                 <w:webHidden/>
               </w:rPr>
-              <w:instrText xml:space="preserve"> PAGEREF _Toc232646228 \h </w:instrText>
+              <w:instrText xml:space="preserve"> PAGEREF _Toc233319136 \h </w:instrText>
             </w:r>
             <w:r>
               <w:rPr>
@@ -2390,7 +2390,7 @@
                 <w:noProof/>
                 <w:webHidden/>
               </w:rPr>
-              <w:t>16</w:t>
+              <w:t>17</w:t>
             </w:r>
             <w:r>
               <w:rPr>
@@ -2417,7 +2417,7 @@
               <w14:ligatures w14:val="standardContextual"/>
             </w:rPr>
           </w:pPr>
-          <w:hyperlink w:anchor="_Toc232646229" w:history="1">
+          <w:hyperlink w:anchor="_Toc233319137" w:history="1">
             <w:r>
               <w:rPr>
                 <w:rStyle w:val="Hyperlink"/>
@@ -2445,7 +2445,7 @@
                 <w:noProof/>
                 <w:webHidden/>
               </w:rPr>
-              <w:instrText xml:space="preserve"> PAGEREF _Toc232646229 \h </w:instrText>
+              <w:instrText xml:space="preserve"> PAGEREF _Toc233319137 \h </w:instrText>
             </w:r>
             <w:r>
               <w:rPr>
@@ -2465,7 +2465,7 @@
                 <w:noProof/>
                 <w:webHidden/>
               </w:rPr>
-              <w:t>16</w:t>
+              <w:t>17</w:t>
             </w:r>
             <w:r>
               <w:rPr>
@@ -2492,7 +2492,7 @@
               <w14:ligatures w14:val="standardContextual"/>
             </w:rPr>
           </w:pPr>
-          <w:hyperlink w:anchor="_Toc232646230" w:history="1">
+          <w:hyperlink w:anchor="_Toc233319138" w:history="1">
             <w:r>
               <w:rPr>
                 <w:rStyle w:val="Hyperlink"/>
@@ -2520,7 +2520,7 @@
                 <w:noProof/>
                 <w:webHidden/>
               </w:rPr>
-              <w:instrText xml:space="preserve"> PAGEREF _Toc232646230 \h </w:instrText>
+              <w:instrText xml:space="preserve"> PAGEREF _Toc233319138 \h </w:instrText>
             </w:r>
             <w:r>
               <w:rPr>
@@ -2540,7 +2540,7 @@
                 <w:noProof/>
                 <w:webHidden/>
               </w:rPr>
-              <w:t>16</w:t>
+              <w:t>17</w:t>
             </w:r>
             <w:r>
               <w:rPr>
@@ -2567,7 +2567,7 @@
               <w14:ligatures w14:val="standardContextual"/>
             </w:rPr>
           </w:pPr>
-          <w:hyperlink w:anchor="_Toc232646231" w:history="1">
+          <w:hyperlink w:anchor="_Toc233319139" w:history="1">
             <w:r>
               <w:rPr>
                 <w:rStyle w:val="Hyperlink"/>
@@ -2595,7 +2595,7 @@
                 <w:noProof/>
                 <w:webHidden/>
               </w:rPr>
-              <w:instrText xml:space="preserve"> PAGEREF _Toc232646231 \h </w:instrText>
+              <w:instrText xml:space="preserve"> PAGEREF _Toc233319139 \h </w:instrText>
             </w:r>
             <w:r>
               <w:rPr>
@@ -2615,7 +2615,459 @@
                 <w:noProof/>
                 <w:webHidden/>
               </w:rPr>
-              <w:t>16</w:t>
+              <w:t>17</w:t>
+            </w:r>
+            <w:r>
+              <w:rPr>
+                <w:noProof/>
+                <w:webHidden/>
+              </w:rPr>
+              <w:fldChar w:fldCharType="end"/>
+            </w:r>
+          </w:hyperlink>
+        </w:p>
+        <w:p>
+          <w:pPr>
+            <w:pStyle w:val="TOC1"/>
+            <w:tabs>
+              <w:tab w:val="right" w:leader="dot" w:pos="9350"/>
+            </w:tabs>
+            <w:rPr>
+              <w:rFonts w:eastAsiaTheme="minorEastAsia"/>
+              <w:noProof/>
+              <w:kern w:val="2"/>
+              <w:sz w:val="24"/>
+              <w:szCs w:val="24"/>
+              <w:lang w:val="en-KE" w:eastAsia="en-KE"/>
+              <w14:ligatures w14:val="standardContextual"/>
+            </w:rPr>
+          </w:pPr>
+          <w:hyperlink w:anchor="_Toc233319140" w:history="1">
+            <w:r>
+              <w:rPr>
+                <w:rStyle w:val="Hyperlink"/>
+                <w:rFonts w:ascii="Times New Roman" w:hAnsi="Times New Roman" w:cs="Times New Roman"/>
+                <w:b/>
+                <w:bCs/>
+                <w:noProof/>
+              </w:rPr>
+              <w:t>EXTRA WORK SECTION 6 WEEK 8</w:t>
+            </w:r>
+            <w:r>
+              <w:rPr>
+                <w:noProof/>
+                <w:webHidden/>
+              </w:rPr>
+              <w:tab/>
+            </w:r>
+            <w:r>
+              <w:rPr>
+                <w:noProof/>
+                <w:webHidden/>
+              </w:rPr>
+              <w:fldChar w:fldCharType="begin"/>
+            </w:r>
+            <w:r>
+              <w:rPr>
+                <w:noProof/>
+                <w:webHidden/>
+              </w:rPr>
+              <w:instrText xml:space="preserve"> PAGEREF _Toc233319140 \h </w:instrText>
+            </w:r>
+            <w:r>
+              <w:rPr>
+                <w:noProof/>
+                <w:webHidden/>
+              </w:rPr>
+            </w:r>
+            <w:r>
+              <w:rPr>
+                <w:noProof/>
+                <w:webHidden/>
+              </w:rPr>
+              <w:fldChar w:fldCharType="separate"/>
+            </w:r>
+            <w:r>
+              <w:rPr>
+                <w:noProof/>
+                <w:webHidden/>
+              </w:rPr>
+              <w:t>19</w:t>
+            </w:r>
+            <w:r>
+              <w:rPr>
+                <w:noProof/>
+                <w:webHidden/>
+              </w:rPr>
+              <w:fldChar w:fldCharType="end"/>
+            </w:r>
+          </w:hyperlink>
+        </w:p>
+        <w:p>
+          <w:pPr>
+            <w:pStyle w:val="TOC2"/>
+            <w:tabs>
+              <w:tab w:val="right" w:leader="dot" w:pos="9350"/>
+            </w:tabs>
+            <w:rPr>
+              <w:rFonts w:eastAsiaTheme="minorEastAsia"/>
+              <w:noProof/>
+              <w:kern w:val="2"/>
+              <w:sz w:val="24"/>
+              <w:szCs w:val="24"/>
+              <w:lang w:val="en-KE" w:eastAsia="en-KE"/>
+              <w14:ligatures w14:val="standardContextual"/>
+            </w:rPr>
+          </w:pPr>
+          <w:hyperlink w:anchor="_Toc233319141" w:history="1">
+            <w:r>
+              <w:rPr>
+                <w:rStyle w:val="Hyperlink"/>
+                <w:rFonts w:ascii="Times New Roman" w:hAnsi="Times New Roman" w:cs="Times New Roman"/>
+                <w:noProof/>
+              </w:rPr>
+              <w:t>Fig 1- Installation Output</w:t>
+            </w:r>
+            <w:r>
+              <w:rPr>
+                <w:noProof/>
+                <w:webHidden/>
+              </w:rPr>
+              <w:tab/>
+            </w:r>
+            <w:r>
+              <w:rPr>
+                <w:noProof/>
+                <w:webHidden/>
+              </w:rPr>
+              <w:fldChar w:fldCharType="begin"/>
+            </w:r>
+            <w:r>
+              <w:rPr>
+                <w:noProof/>
+                <w:webHidden/>
+              </w:rPr>
+              <w:instrText xml:space="preserve"> PAGEREF _Toc233319141 \h </w:instrText>
+            </w:r>
+            <w:r>
+              <w:rPr>
+                <w:noProof/>
+                <w:webHidden/>
+              </w:rPr>
+            </w:r>
+            <w:r>
+              <w:rPr>
+                <w:noProof/>
+                <w:webHidden/>
+              </w:rPr>
+              <w:fldChar w:fldCharType="separate"/>
+            </w:r>
+            <w:r>
+              <w:rPr>
+                <w:noProof/>
+                <w:webHidden/>
+              </w:rPr>
+              <w:t>19</w:t>
+            </w:r>
+            <w:r>
+              <w:rPr>
+                <w:noProof/>
+                <w:webHidden/>
+              </w:rPr>
+              <w:fldChar w:fldCharType="end"/>
+            </w:r>
+          </w:hyperlink>
+        </w:p>
+        <w:p>
+          <w:pPr>
+            <w:pStyle w:val="TOC2"/>
+            <w:tabs>
+              <w:tab w:val="right" w:leader="dot" w:pos="9350"/>
+            </w:tabs>
+            <w:rPr>
+              <w:rFonts w:eastAsiaTheme="minorEastAsia"/>
+              <w:noProof/>
+              <w:kern w:val="2"/>
+              <w:sz w:val="24"/>
+              <w:szCs w:val="24"/>
+              <w:lang w:val="en-KE" w:eastAsia="en-KE"/>
+              <w14:ligatures w14:val="standardContextual"/>
+            </w:rPr>
+          </w:pPr>
+          <w:hyperlink w:anchor="_Toc233319142" w:history="1">
+            <w:r>
+              <w:rPr>
+                <w:rStyle w:val="Hyperlink"/>
+                <w:rFonts w:ascii="Times New Roman" w:hAnsi="Times New Roman" w:cs="Times New Roman"/>
+                <w:noProof/>
+              </w:rPr>
+              <w:t>Fig 2- Five Transformer Pipelines</w:t>
+            </w:r>
+            <w:r>
+              <w:rPr>
+                <w:noProof/>
+                <w:webHidden/>
+              </w:rPr>
+              <w:tab/>
+            </w:r>
+            <w:r>
+              <w:rPr>
+                <w:noProof/>
+                <w:webHidden/>
+              </w:rPr>
+              <w:fldChar w:fldCharType="begin"/>
+            </w:r>
+            <w:r>
+              <w:rPr>
+                <w:noProof/>
+                <w:webHidden/>
+              </w:rPr>
+              <w:instrText xml:space="preserve"> PAGEREF _Toc233319142 \h </w:instrText>
+            </w:r>
+            <w:r>
+              <w:rPr>
+                <w:noProof/>
+                <w:webHidden/>
+              </w:rPr>
+            </w:r>
+            <w:r>
+              <w:rPr>
+                <w:noProof/>
+                <w:webHidden/>
+              </w:rPr>
+              <w:fldChar w:fldCharType="separate"/>
+            </w:r>
+            <w:r>
+              <w:rPr>
+                <w:noProof/>
+                <w:webHidden/>
+              </w:rPr>
+              <w:t>20</w:t>
+            </w:r>
+            <w:r>
+              <w:rPr>
+                <w:noProof/>
+                <w:webHidden/>
+              </w:rPr>
+              <w:fldChar w:fldCharType="end"/>
+            </w:r>
+          </w:hyperlink>
+        </w:p>
+        <w:p>
+          <w:pPr>
+            <w:pStyle w:val="TOC2"/>
+            <w:tabs>
+              <w:tab w:val="right" w:leader="dot" w:pos="9350"/>
+            </w:tabs>
+            <w:rPr>
+              <w:rFonts w:eastAsiaTheme="minorEastAsia"/>
+              <w:noProof/>
+              <w:kern w:val="2"/>
+              <w:sz w:val="24"/>
+              <w:szCs w:val="24"/>
+              <w:lang w:val="en-KE" w:eastAsia="en-KE"/>
+              <w14:ligatures w14:val="standardContextual"/>
+            </w:rPr>
+          </w:pPr>
+          <w:hyperlink w:anchor="_Toc233319143" w:history="1">
+            <w:r>
+              <w:rPr>
+                <w:rStyle w:val="Hyperlink"/>
+                <w:rFonts w:ascii="Times New Roman" w:hAnsi="Times New Roman" w:cs="Times New Roman"/>
+                <w:noProof/>
+              </w:rPr>
+              <w:t>Fig 3- BERT vs GPT-2 Comparison</w:t>
+            </w:r>
+            <w:r>
+              <w:rPr>
+                <w:noProof/>
+                <w:webHidden/>
+              </w:rPr>
+              <w:tab/>
+            </w:r>
+            <w:r>
+              <w:rPr>
+                <w:noProof/>
+                <w:webHidden/>
+              </w:rPr>
+              <w:fldChar w:fldCharType="begin"/>
+            </w:r>
+            <w:r>
+              <w:rPr>
+                <w:noProof/>
+                <w:webHidden/>
+              </w:rPr>
+              <w:instrText xml:space="preserve"> PAGEREF _Toc233319143 \h </w:instrText>
+            </w:r>
+            <w:r>
+              <w:rPr>
+                <w:noProof/>
+                <w:webHidden/>
+              </w:rPr>
+            </w:r>
+            <w:r>
+              <w:rPr>
+                <w:noProof/>
+                <w:webHidden/>
+              </w:rPr>
+              <w:fldChar w:fldCharType="separate"/>
+            </w:r>
+            <w:r>
+              <w:rPr>
+                <w:noProof/>
+                <w:webHidden/>
+              </w:rPr>
+              <w:t>22</w:t>
+            </w:r>
+            <w:r>
+              <w:rPr>
+                <w:noProof/>
+                <w:webHidden/>
+              </w:rPr>
+              <w:fldChar w:fldCharType="end"/>
+            </w:r>
+          </w:hyperlink>
+        </w:p>
+        <w:p>
+          <w:pPr>
+            <w:pStyle w:val="TOC2"/>
+            <w:tabs>
+              <w:tab w:val="right" w:leader="dot" w:pos="9350"/>
+            </w:tabs>
+            <w:rPr>
+              <w:rFonts w:eastAsiaTheme="minorEastAsia"/>
+              <w:noProof/>
+              <w:kern w:val="2"/>
+              <w:sz w:val="24"/>
+              <w:szCs w:val="24"/>
+              <w:lang w:val="en-KE" w:eastAsia="en-KE"/>
+              <w14:ligatures w14:val="standardContextual"/>
+            </w:rPr>
+          </w:pPr>
+          <w:hyperlink w:anchor="_Toc233319144" w:history="1">
+            <w:r>
+              <w:rPr>
+                <w:rStyle w:val="Hyperlink"/>
+                <w:rFonts w:ascii="Times New Roman" w:hAnsi="Times New Roman" w:cs="Times New Roman"/>
+                <w:noProof/>
+              </w:rPr>
+              <w:t>Fig 4- Transformer Spam Detection</w:t>
+            </w:r>
+            <w:r>
+              <w:rPr>
+                <w:noProof/>
+                <w:webHidden/>
+              </w:rPr>
+              <w:tab/>
+            </w:r>
+            <w:r>
+              <w:rPr>
+                <w:noProof/>
+                <w:webHidden/>
+              </w:rPr>
+              <w:fldChar w:fldCharType="begin"/>
+            </w:r>
+            <w:r>
+              <w:rPr>
+                <w:noProof/>
+                <w:webHidden/>
+              </w:rPr>
+              <w:instrText xml:space="preserve"> PAGEREF _Toc233319144 \h </w:instrText>
+            </w:r>
+            <w:r>
+              <w:rPr>
+                <w:noProof/>
+                <w:webHidden/>
+              </w:rPr>
+            </w:r>
+            <w:r>
+              <w:rPr>
+                <w:noProof/>
+                <w:webHidden/>
+              </w:rPr>
+              <w:fldChar w:fldCharType="separate"/>
+            </w:r>
+            <w:r>
+              <w:rPr>
+                <w:noProof/>
+                <w:webHidden/>
+              </w:rPr>
+              <w:t>23</w:t>
+            </w:r>
+            <w:r>
+              <w:rPr>
+                <w:noProof/>
+                <w:webHidden/>
+              </w:rPr>
+              <w:fldChar w:fldCharType="end"/>
+            </w:r>
+          </w:hyperlink>
+        </w:p>
+        <w:p>
+          <w:pPr>
+            <w:pStyle w:val="TOC2"/>
+            <w:tabs>
+              <w:tab w:val="right" w:leader="dot" w:pos="9350"/>
+            </w:tabs>
+            <w:rPr>
+              <w:rFonts w:eastAsiaTheme="minorEastAsia"/>
+              <w:noProof/>
+              <w:kern w:val="2"/>
+              <w:sz w:val="24"/>
+              <w:szCs w:val="24"/>
+              <w:lang w:val="en-KE" w:eastAsia="en-KE"/>
+              <w14:ligatures w14:val="standardContextual"/>
+            </w:rPr>
+          </w:pPr>
+          <w:hyperlink w:anchor="_Toc233319145" w:history="1">
+            <w:r>
+              <w:rPr>
+                <w:rStyle w:val="Hyperlink"/>
+                <w:rFonts w:ascii="Times New Roman" w:hAnsi="Times New Roman" w:cs="Times New Roman"/>
+                <w:noProof/>
+              </w:rPr>
+              <w:t>SUMMARY</w:t>
+            </w:r>
+            <w:r>
+              <w:rPr>
+                <w:noProof/>
+                <w:webHidden/>
+              </w:rPr>
+              <w:tab/>
+            </w:r>
+            <w:r>
+              <w:rPr>
+                <w:noProof/>
+                <w:webHidden/>
+              </w:rPr>
+              <w:fldChar w:fldCharType="begin"/>
+            </w:r>
+            <w:r>
+              <w:rPr>
+                <w:noProof/>
+                <w:webHidden/>
+              </w:rPr>
+              <w:instrText xml:space="preserve"> PAGEREF _Toc233319145 \h </w:instrText>
+            </w:r>
+            <w:r>
+              <w:rPr>
+                <w:noProof/>
+                <w:webHidden/>
+              </w:rPr>
+            </w:r>
+            <w:r>
+              <w:rPr>
+                <w:noProof/>
+                <w:webHidden/>
+              </w:rPr>
+              <w:fldChar w:fldCharType="separate"/>
+            </w:r>
+            <w:r>
+              <w:rPr>
+                <w:noProof/>
+                <w:webHidden/>
+              </w:rPr>
+              <w:t>23</w:t>
             </w:r>
             <w:r>
               <w:rPr>
@@ -2703,6 +3155,159 @@
     </w:p>
     <w:p>
       <w:pPr>
+        <w:rPr>
+          <w:rFonts w:ascii="Times New Roman" w:hAnsi="Times New Roman" w:cs="Times New Roman"/>
+          <w:sz w:val="24"/>
+          <w:szCs w:val="24"/>
+        </w:rPr>
+      </w:pPr>
+    </w:p>
+    <w:p>
+      <w:pPr>
+        <w:rPr>
+          <w:rFonts w:ascii="Times New Roman" w:hAnsi="Times New Roman" w:cs="Times New Roman"/>
+          <w:sz w:val="24"/>
+          <w:szCs w:val="24"/>
+        </w:rPr>
+      </w:pPr>
+    </w:p>
+    <w:p>
+      <w:pPr>
+        <w:rPr>
+          <w:rFonts w:ascii="Times New Roman" w:hAnsi="Times New Roman" w:cs="Times New Roman"/>
+          <w:sz w:val="24"/>
+          <w:szCs w:val="24"/>
+        </w:rPr>
+      </w:pPr>
+    </w:p>
+    <w:p>
+      <w:pPr>
+        <w:rPr>
+          <w:rFonts w:ascii="Times New Roman" w:hAnsi="Times New Roman" w:cs="Times New Roman"/>
+          <w:sz w:val="24"/>
+          <w:szCs w:val="24"/>
+        </w:rPr>
+      </w:pPr>
+    </w:p>
+    <w:p>
+      <w:pPr>
+        <w:rPr>
+          <w:rFonts w:ascii="Times New Roman" w:hAnsi="Times New Roman" w:cs="Times New Roman"/>
+          <w:sz w:val="24"/>
+          <w:szCs w:val="24"/>
+        </w:rPr>
+      </w:pPr>
+    </w:p>
+    <w:p>
+      <w:pPr>
+        <w:rPr>
+          <w:rFonts w:ascii="Times New Roman" w:hAnsi="Times New Roman" w:cs="Times New Roman"/>
+          <w:sz w:val="24"/>
+          <w:szCs w:val="24"/>
+        </w:rPr>
+      </w:pPr>
+    </w:p>
+    <w:p>
+      <w:pPr>
+        <w:rPr>
+          <w:rFonts w:ascii="Times New Roman" w:hAnsi="Times New Roman" w:cs="Times New Roman"/>
+          <w:sz w:val="24"/>
+          <w:szCs w:val="24"/>
+        </w:rPr>
+      </w:pPr>
+    </w:p>
+    <w:p>
+      <w:pPr>
+        <w:rPr>
+          <w:rFonts w:ascii="Times New Roman" w:hAnsi="Times New Roman" w:cs="Times New Roman"/>
+          <w:sz w:val="24"/>
+          <w:szCs w:val="24"/>
+        </w:rPr>
+      </w:pPr>
+    </w:p>
+    <w:p>
+      <w:pPr>
+        <w:rPr>
+          <w:rFonts w:ascii="Times New Roman" w:hAnsi="Times New Roman" w:cs="Times New Roman"/>
+          <w:sz w:val="24"/>
+          <w:szCs w:val="24"/>
+        </w:rPr>
+      </w:pPr>
+    </w:p>
+    <w:p>
+      <w:pPr>
+        <w:rPr>
+          <w:rFonts w:ascii="Times New Roman" w:hAnsi="Times New Roman" w:cs="Times New Roman"/>
+          <w:sz w:val="24"/>
+          <w:szCs w:val="24"/>
+        </w:rPr>
+      </w:pPr>
+    </w:p>
+    <w:p>
+      <w:pPr>
+        <w:rPr>
+          <w:rFonts w:ascii="Times New Roman" w:hAnsi="Times New Roman" w:cs="Times New Roman"/>
+          <w:sz w:val="24"/>
+          <w:szCs w:val="24"/>
+        </w:rPr>
+      </w:pPr>
+    </w:p>
+    <w:p>
+      <w:pPr>
+        <w:rPr>
+          <w:rFonts w:ascii="Times New Roman" w:hAnsi="Times New Roman" w:cs="Times New Roman"/>
+          <w:sz w:val="24"/>
+          <w:szCs w:val="24"/>
+        </w:rPr>
+      </w:pPr>
+    </w:p>
+    <w:p>
+      <w:pPr>
+        <w:rPr>
+          <w:rFonts w:ascii="Times New Roman" w:hAnsi="Times New Roman" w:cs="Times New Roman"/>
+          <w:sz w:val="24"/>
+          <w:szCs w:val="24"/>
+        </w:rPr>
+      </w:pPr>
+    </w:p>
+    <w:p>
+      <w:pPr>
+        <w:rPr>
+          <w:rFonts w:ascii="Times New Roman" w:hAnsi="Times New Roman" w:cs="Times New Roman"/>
+          <w:sz w:val="24"/>
+          <w:szCs w:val="24"/>
+        </w:rPr>
+      </w:pPr>
+    </w:p>
+    <w:p>
+      <w:pPr>
+        <w:rPr>
+          <w:rFonts w:ascii="Times New Roman" w:hAnsi="Times New Roman" w:cs="Times New Roman"/>
+          <w:sz w:val="24"/>
+          <w:szCs w:val="24"/>
+        </w:rPr>
+      </w:pPr>
+    </w:p>
+    <w:p>
+      <w:pPr>
+        <w:rPr>
+          <w:rFonts w:ascii="Times New Roman" w:hAnsi="Times New Roman" w:cs="Times New Roman"/>
+          <w:sz w:val="24"/>
+          <w:szCs w:val="24"/>
+        </w:rPr>
+      </w:pPr>
+    </w:p>
+    <w:p>
+      <w:pPr>
+        <w:rPr>
+          <w:rFonts w:ascii="Times New Roman" w:hAnsi="Times New Roman" w:cs="Times New Roman"/>
+          <w:sz w:val="24"/>
+          <w:szCs w:val="24"/>
+        </w:rPr>
+      </w:pPr>
+    </w:p>
+    <w:p>
+      <w:pPr>
         <w:pStyle w:val="Heading1"/>
         <w:rPr>
           <w:rFonts w:ascii="Times New Roman" w:hAnsi="Times New Roman" w:cs="Times New Roman"/>
@@ -2712,7 +3317,7 @@
           <w:szCs w:val="28"/>
         </w:rPr>
       </w:pPr>
-      <w:bookmarkStart w:id="0" w:name="_Toc232646203"/>
+      <w:bookmarkStart w:id="0" w:name="_Toc233319111"/>
       <w:r>
         <w:rPr>
           <w:rFonts w:ascii="Times New Roman" w:hAnsi="Times New Roman" w:cs="Times New Roman"/>
@@ -2721,6 +3326,7 @@
           <w:sz w:val="28"/>
           <w:szCs w:val="28"/>
         </w:rPr>
+        <w:lastRenderedPageBreak/>
         <w:t>EXTRA WORK SECTION 1</w:t>
       </w:r>
       <w:r>
@@ -2806,7 +3412,7 @@
           <w:szCs w:val="24"/>
         </w:rPr>
       </w:pPr>
-      <w:bookmarkStart w:id="1" w:name="_Toc232646204"/>
+      <w:bookmarkStart w:id="1" w:name="_Toc233319112"/>
       <w:r>
         <w:rPr>
           <w:rFonts w:ascii="Times New Roman" w:hAnsi="Times New Roman" w:cs="Times New Roman"/>
@@ -2881,7 +3487,7 @@
           <w:szCs w:val="24"/>
         </w:rPr>
       </w:pPr>
-      <w:bookmarkStart w:id="2" w:name="_Toc232646205"/>
+      <w:bookmarkStart w:id="2" w:name="_Toc233319113"/>
       <w:r>
         <w:rPr>
           <w:rFonts w:ascii="Times New Roman" w:hAnsi="Times New Roman" w:cs="Times New Roman"/>
@@ -2956,7 +3562,7 @@
           <w:szCs w:val="24"/>
         </w:rPr>
       </w:pPr>
-      <w:bookmarkStart w:id="3" w:name="_Toc232646206"/>
+      <w:bookmarkStart w:id="3" w:name="_Toc233319114"/>
       <w:r>
         <w:rPr>
           <w:rFonts w:ascii="Times New Roman" w:hAnsi="Times New Roman" w:cs="Times New Roman"/>
@@ -3030,7 +3636,7 @@
           <w:szCs w:val="24"/>
         </w:rPr>
       </w:pPr>
-      <w:bookmarkStart w:id="4" w:name="_Toc232646207"/>
+      <w:bookmarkStart w:id="4" w:name="_Toc233319115"/>
       <w:r>
         <w:rPr>
           <w:rFonts w:ascii="Times New Roman" w:hAnsi="Times New Roman" w:cs="Times New Roman"/>
@@ -3061,7 +3667,7 @@
           <w:szCs w:val="24"/>
         </w:rPr>
       </w:pPr>
-      <w:bookmarkStart w:id="5" w:name="_Toc232646208"/>
+      <w:bookmarkStart w:id="5" w:name="_Toc233319116"/>
       <w:r>
         <w:rPr>
           <w:rFonts w:ascii="Times New Roman" w:hAnsi="Times New Roman" w:cs="Times New Roman"/>
@@ -3318,7 +3924,7 @@
           <w:szCs w:val="28"/>
         </w:rPr>
       </w:pPr>
-      <w:bookmarkStart w:id="6" w:name="_Toc232646209"/>
+      <w:bookmarkStart w:id="6" w:name="_Toc233319117"/>
       <w:r>
         <w:rPr>
           <w:rFonts w:ascii="Times New Roman" w:hAnsi="Times New Roman" w:cs="Times New Roman"/>
@@ -3404,7 +4010,7 @@
           <w:szCs w:val="24"/>
         </w:rPr>
       </w:pPr>
-      <w:bookmarkStart w:id="7" w:name="_Toc232646210"/>
+      <w:bookmarkStart w:id="7" w:name="_Toc233319118"/>
       <w:r>
         <w:rPr>
           <w:rFonts w:ascii="Times New Roman" w:hAnsi="Times New Roman" w:cs="Times New Roman"/>
@@ -3479,7 +4085,7 @@
           <w:szCs w:val="24"/>
         </w:rPr>
       </w:pPr>
-      <w:bookmarkStart w:id="8" w:name="_Toc232646211"/>
+      <w:bookmarkStart w:id="8" w:name="_Toc233319119"/>
       <w:r>
         <w:rPr>
           <w:rFonts w:ascii="Times New Roman" w:hAnsi="Times New Roman" w:cs="Times New Roman"/>
@@ -3554,7 +4160,7 @@
           <w:szCs w:val="24"/>
         </w:rPr>
       </w:pPr>
-      <w:bookmarkStart w:id="9" w:name="_Toc232646212"/>
+      <w:bookmarkStart w:id="9" w:name="_Toc233319120"/>
       <w:r>
         <w:rPr>
           <w:rFonts w:ascii="Times New Roman" w:hAnsi="Times New Roman" w:cs="Times New Roman"/>
@@ -3628,7 +4234,7 @@
           <w:szCs w:val="24"/>
         </w:rPr>
       </w:pPr>
-      <w:bookmarkStart w:id="10" w:name="_Toc232646213"/>
+      <w:bookmarkStart w:id="10" w:name="_Toc233319121"/>
       <w:r>
         <w:rPr>
           <w:rFonts w:ascii="Times New Roman" w:hAnsi="Times New Roman" w:cs="Times New Roman"/>
@@ -3671,7 +4277,7 @@
           <w:szCs w:val="24"/>
         </w:rPr>
       </w:pPr>
-      <w:bookmarkStart w:id="11" w:name="_Toc232646214"/>
+      <w:bookmarkStart w:id="11" w:name="_Toc233319122"/>
       <w:r>
         <w:rPr>
           <w:rFonts w:ascii="Times New Roman" w:eastAsia="Times New Roman" w:hAnsi="Times New Roman" w:cs="Times New Roman"/>
@@ -3951,7 +4557,7 @@
           <w:szCs w:val="28"/>
         </w:rPr>
       </w:pPr>
-      <w:bookmarkStart w:id="12" w:name="_Toc232646215"/>
+      <w:bookmarkStart w:id="12" w:name="_Toc233319123"/>
       <w:r>
         <w:rPr>
           <w:rFonts w:ascii="Times New Roman" w:eastAsia="Times New Roman" w:hAnsi="Times New Roman" w:cs="Times New Roman"/>
@@ -4039,7 +4645,7 @@
           <w:szCs w:val="24"/>
         </w:rPr>
       </w:pPr>
-      <w:bookmarkStart w:id="13" w:name="_Toc232646216"/>
+      <w:bookmarkStart w:id="13" w:name="_Toc233319124"/>
       <w:r>
         <w:rPr>
           <w:rFonts w:ascii="Times New Roman" w:eastAsia="Times New Roman" w:hAnsi="Times New Roman" w:cs="Times New Roman"/>
@@ -4134,7 +4740,7 @@
           <w:szCs w:val="24"/>
         </w:rPr>
       </w:pPr>
-      <w:bookmarkStart w:id="14" w:name="_Toc232646217"/>
+      <w:bookmarkStart w:id="14" w:name="_Toc233319125"/>
       <w:r>
         <w:rPr>
           <w:rFonts w:ascii="Times New Roman" w:eastAsia="Times New Roman" w:hAnsi="Times New Roman" w:cs="Times New Roman"/>
@@ -4209,7 +4815,7 @@
           <w:szCs w:val="24"/>
         </w:rPr>
       </w:pPr>
-      <w:bookmarkStart w:id="15" w:name="_Toc232646218"/>
+      <w:bookmarkStart w:id="15" w:name="_Toc233319126"/>
       <w:r>
         <w:rPr>
           <w:rFonts w:ascii="Times New Roman" w:hAnsi="Times New Roman" w:cs="Times New Roman"/>
@@ -4218,7 +4824,34 @@
           <w:szCs w:val="24"/>
         </w:rPr>
         <w:lastRenderedPageBreak/>
-        <w:t>Fig 3-Fragmantics understanding intended meaning from context</w:t>
+        <w:t>Fig 3-</w:t>
+      </w:r>
+      <w:r>
+        <w:rPr>
+          <w:rFonts w:ascii="Times New Roman" w:hAnsi="Times New Roman" w:cs="Times New Roman"/>
+          <w:color w:val="auto"/>
+          <w:sz w:val="24"/>
+          <w:szCs w:val="24"/>
+        </w:rPr>
+        <w:t xml:space="preserve"> P</w:t>
+      </w:r>
+      <w:r>
+        <w:rPr>
+          <w:rFonts w:ascii="Times New Roman" w:hAnsi="Times New Roman" w:cs="Times New Roman"/>
+          <w:color w:val="auto"/>
+          <w:sz w:val="24"/>
+          <w:szCs w:val="24"/>
+        </w:rPr>
+        <w:t>ragmatics</w:t>
+      </w:r>
+      <w:r>
+        <w:rPr>
+          <w:rFonts w:ascii="Times New Roman" w:hAnsi="Times New Roman" w:cs="Times New Roman"/>
+          <w:color w:val="auto"/>
+          <w:sz w:val="24"/>
+          <w:szCs w:val="24"/>
+        </w:rPr>
+        <w:t xml:space="preserve"> understanding intended meaning from context</w:t>
       </w:r>
       <w:bookmarkEnd w:id="15"/>
     </w:p>
@@ -4284,7 +4917,7 @@
           <w:szCs w:val="24"/>
         </w:rPr>
       </w:pPr>
-      <w:bookmarkStart w:id="16" w:name="_Toc232646219"/>
+      <w:bookmarkStart w:id="16" w:name="_Toc233319127"/>
       <w:r>
         <w:rPr>
           <w:rFonts w:ascii="Times New Roman" w:hAnsi="Times New Roman" w:cs="Times New Roman"/>
@@ -4294,18 +4927,16 @@
         </w:rPr>
         <w:t xml:space="preserve">Fig 4- Combination and comparison of syntax, semantics and </w:t>
       </w:r>
-      <w:proofErr w:type="spellStart"/>
-      <w:r>
-        <w:rPr>
-          <w:rFonts w:ascii="Times New Roman" w:hAnsi="Times New Roman" w:cs="Times New Roman"/>
-          <w:color w:val="auto"/>
-          <w:sz w:val="24"/>
-          <w:szCs w:val="24"/>
-        </w:rPr>
-        <w:t>Fragmatics</w:t>
+      <w:r>
+        <w:rPr>
+          <w:rFonts w:ascii="Times New Roman" w:hAnsi="Times New Roman" w:cs="Times New Roman"/>
+          <w:color w:val="auto"/>
+          <w:sz w:val="24"/>
+          <w:szCs w:val="24"/>
+        </w:rPr>
+        <w:t>Pragmatics</w:t>
       </w:r>
       <w:bookmarkEnd w:id="16"/>
-      <w:proofErr w:type="spellEnd"/>
     </w:p>
     <w:p>
       <w:pPr>
@@ -4326,7 +4957,7 @@
           <w:szCs w:val="24"/>
         </w:rPr>
       </w:pPr>
-      <w:bookmarkStart w:id="17" w:name="_Toc232646220"/>
+      <w:bookmarkStart w:id="17" w:name="_Toc233319128"/>
       <w:r>
         <w:rPr>
           <w:rFonts w:ascii="Times New Roman" w:hAnsi="Times New Roman" w:cs="Times New Roman"/>
@@ -4402,7 +5033,7 @@
           <w:szCs w:val="28"/>
         </w:rPr>
       </w:pPr>
-      <w:bookmarkStart w:id="18" w:name="_Toc232646221"/>
+      <w:bookmarkStart w:id="18" w:name="_Toc233319129"/>
       <w:r>
         <w:rPr>
           <w:rFonts w:ascii="Times New Roman" w:hAnsi="Times New Roman" w:cs="Times New Roman"/>
@@ -4488,7 +5119,7 @@
           <w:szCs w:val="24"/>
         </w:rPr>
       </w:pPr>
-      <w:bookmarkStart w:id="19" w:name="_Toc232646222"/>
+      <w:bookmarkStart w:id="19" w:name="_Toc233319130"/>
       <w:r>
         <w:rPr>
           <w:rFonts w:ascii="Times New Roman" w:hAnsi="Times New Roman" w:cs="Times New Roman"/>
@@ -4563,7 +5194,7 @@
           <w:szCs w:val="24"/>
         </w:rPr>
       </w:pPr>
-      <w:bookmarkStart w:id="20" w:name="_Toc232646223"/>
+      <w:bookmarkStart w:id="20" w:name="_Toc233319131"/>
       <w:r>
         <w:rPr>
           <w:rFonts w:ascii="Times New Roman" w:hAnsi="Times New Roman" w:cs="Times New Roman"/>
@@ -4638,7 +5269,7 @@
           <w:szCs w:val="24"/>
         </w:rPr>
       </w:pPr>
-      <w:bookmarkStart w:id="21" w:name="_Toc232646224"/>
+      <w:bookmarkStart w:id="21" w:name="_Toc233319132"/>
       <w:r>
         <w:rPr>
           <w:rFonts w:ascii="Times New Roman" w:hAnsi="Times New Roman" w:cs="Times New Roman"/>
@@ -4670,7 +5301,7 @@
           <w:szCs w:val="24"/>
         </w:rPr>
       </w:pPr>
-      <w:bookmarkStart w:id="22" w:name="_Toc232646225"/>
+      <w:bookmarkStart w:id="22" w:name="_Toc233319133"/>
       <w:r>
         <w:rPr>
           <w:rFonts w:ascii="Times New Roman" w:hAnsi="Times New Roman" w:cs="Times New Roman"/>
@@ -4711,7 +5342,7 @@
           <w:szCs w:val="28"/>
         </w:rPr>
       </w:pPr>
-      <w:bookmarkStart w:id="23" w:name="_Toc232646226"/>
+      <w:bookmarkStart w:id="23" w:name="_Toc233319134"/>
       <w:r>
         <w:rPr>
           <w:rFonts w:ascii="Times New Roman" w:hAnsi="Times New Roman" w:cs="Times New Roman"/>
@@ -4749,6 +5380,7 @@
       <w:r>
         <w:rPr>
           <w:rFonts w:ascii="Times New Roman" w:hAnsi="Times New Roman" w:cs="Times New Roman"/>
+          <w:noProof/>
           <w:sz w:val="24"/>
           <w:szCs w:val="24"/>
           <w:lang w:val="en-KE"/>
@@ -4815,6 +5447,7 @@
       <w:r>
         <w:rPr>
           <w:rFonts w:ascii="Times New Roman" w:hAnsi="Times New Roman" w:cs="Times New Roman"/>
+          <w:noProof/>
           <w:sz w:val="24"/>
           <w:szCs w:val="24"/>
           <w:lang w:val="en-KE"/>
@@ -4879,33 +5512,15 @@
           <w:szCs w:val="24"/>
         </w:rPr>
       </w:pPr>
-      <w:bookmarkStart w:id="24" w:name="_Toc232646227"/>
-      <w:r>
-        <w:rPr>
-          <w:rFonts w:ascii="Times New Roman" w:hAnsi="Times New Roman" w:cs="Times New Roman"/>
-          <w:color w:val="auto"/>
-          <w:sz w:val="24"/>
-          <w:szCs w:val="24"/>
-        </w:rPr>
-        <w:t>Fig 1</w:t>
-      </w:r>
-      <w:r>
-        <w:rPr>
-          <w:rFonts w:ascii="Times New Roman" w:hAnsi="Times New Roman" w:cs="Times New Roman"/>
-          <w:color w:val="auto"/>
-          <w:sz w:val="24"/>
-          <w:szCs w:val="24"/>
-        </w:rPr>
-        <w:t>=</w:t>
-      </w:r>
-      <w:r>
-        <w:rPr>
-          <w:rFonts w:ascii="Times New Roman" w:hAnsi="Times New Roman" w:cs="Times New Roman"/>
-          <w:color w:val="auto"/>
-          <w:sz w:val="24"/>
-          <w:szCs w:val="24"/>
-        </w:rPr>
-        <w:t xml:space="preserve"> Word2Vec vs </w:t>
+      <w:bookmarkStart w:id="24" w:name="_Toc233319135"/>
+      <w:r>
+        <w:rPr>
+          <w:rFonts w:ascii="Times New Roman" w:hAnsi="Times New Roman" w:cs="Times New Roman"/>
+          <w:color w:val="auto"/>
+          <w:sz w:val="24"/>
+          <w:szCs w:val="24"/>
+        </w:rPr>
+        <w:t xml:space="preserve">Fig 1= Word2Vec vs </w:t>
       </w:r>
       <w:proofErr w:type="spellStart"/>
       <w:r>
@@ -4935,16 +5550,7 @@
           <w:sz w:val="24"/>
           <w:szCs w:val="24"/>
         </w:rPr>
-        <w:t>GloV</w:t>
-      </w:r>
-      <w:r>
-        <w:rPr>
-          <w:rFonts w:ascii="Times New Roman" w:hAnsi="Times New Roman" w:cs="Times New Roman"/>
-          <w:color w:val="auto"/>
-          <w:sz w:val="24"/>
-          <w:szCs w:val="24"/>
-        </w:rPr>
-        <w:t>e</w:t>
+        <w:t>GloVe</w:t>
       </w:r>
       <w:bookmarkEnd w:id="24"/>
       <w:proofErr w:type="spellEnd"/>
@@ -4961,12 +5567,13 @@
       <w:r>
         <w:rPr>
           <w:rFonts w:ascii="Times New Roman" w:hAnsi="Times New Roman" w:cs="Times New Roman"/>
+          <w:noProof/>
           <w:sz w:val="24"/>
           <w:szCs w:val="24"/>
           <w:lang w:val="en-KE"/>
         </w:rPr>
         <w:drawing>
-          <wp:inline distT="0" distB="0" distL="0" distR="0" wp14:anchorId="79CC6DD5" wp14:editId="5B133CC0">
+          <wp:inline distT="0" distB="0" distL="0" distR="0" wp14:anchorId="79CC6DD5" wp14:editId="34DC88A7">
             <wp:extent cx="5943600" cy="2740660"/>
             <wp:effectExtent l="0" t="0" r="0" b="2540"/>
             <wp:docPr id="1388501270" name="Picture 3"/>
@@ -5025,7 +5632,7 @@
           <w:szCs w:val="24"/>
         </w:rPr>
       </w:pPr>
-      <w:bookmarkStart w:id="25" w:name="_Toc232646228"/>
+      <w:bookmarkStart w:id="25" w:name="_Toc233319136"/>
       <w:r>
         <w:rPr>
           <w:rFonts w:ascii="Times New Roman" w:hAnsi="Times New Roman" w:cs="Times New Roman"/>
@@ -5034,25 +5641,7 @@
           <w:szCs w:val="24"/>
         </w:rPr>
         <w:lastRenderedPageBreak/>
-        <w:t>Fig 2</w:t>
-      </w:r>
-      <w:r>
-        <w:rPr>
-          <w:rFonts w:ascii="Times New Roman" w:hAnsi="Times New Roman" w:cs="Times New Roman"/>
-          <w:color w:val="auto"/>
-          <w:sz w:val="24"/>
-          <w:szCs w:val="24"/>
-        </w:rPr>
-        <w:t>=</w:t>
-      </w:r>
-      <w:r>
-        <w:rPr>
-          <w:rFonts w:ascii="Times New Roman" w:hAnsi="Times New Roman" w:cs="Times New Roman"/>
-          <w:color w:val="auto"/>
-          <w:sz w:val="24"/>
-          <w:szCs w:val="24"/>
-        </w:rPr>
-        <w:t xml:space="preserve"> Word Analogy Output</w:t>
+        <w:t>Fig 2= Word Analogy Output</w:t>
       </w:r>
       <w:bookmarkEnd w:id="25"/>
     </w:p>
@@ -5068,6 +5657,7 @@
       <w:r>
         <w:rPr>
           <w:rFonts w:ascii="Times New Roman" w:hAnsi="Times New Roman" w:cs="Times New Roman"/>
+          <w:noProof/>
           <w:sz w:val="24"/>
           <w:szCs w:val="24"/>
           <w:lang w:val="en-KE"/>
@@ -5132,33 +5722,15 @@
           <w:szCs w:val="24"/>
         </w:rPr>
       </w:pPr>
-      <w:bookmarkStart w:id="26" w:name="_Toc232646229"/>
-      <w:r>
-        <w:rPr>
-          <w:rFonts w:ascii="Times New Roman" w:hAnsi="Times New Roman" w:cs="Times New Roman"/>
-          <w:color w:val="auto"/>
-          <w:sz w:val="24"/>
-          <w:szCs w:val="24"/>
-        </w:rPr>
-        <w:t>Fig 3</w:t>
-      </w:r>
-      <w:r>
-        <w:rPr>
-          <w:rFonts w:ascii="Times New Roman" w:hAnsi="Times New Roman" w:cs="Times New Roman"/>
-          <w:color w:val="auto"/>
-          <w:sz w:val="24"/>
-          <w:szCs w:val="24"/>
-        </w:rPr>
-        <w:t>-</w:t>
-      </w:r>
-      <w:r>
-        <w:rPr>
-          <w:rFonts w:ascii="Times New Roman" w:hAnsi="Times New Roman" w:cs="Times New Roman"/>
-          <w:color w:val="auto"/>
-          <w:sz w:val="24"/>
-          <w:szCs w:val="24"/>
-        </w:rPr>
-        <w:t xml:space="preserve"> Embedding-Based Sentiment Classifier</w:t>
+      <w:bookmarkStart w:id="26" w:name="_Toc233319137"/>
+      <w:r>
+        <w:rPr>
+          <w:rFonts w:ascii="Times New Roman" w:hAnsi="Times New Roman" w:cs="Times New Roman"/>
+          <w:color w:val="auto"/>
+          <w:sz w:val="24"/>
+          <w:szCs w:val="24"/>
+        </w:rPr>
+        <w:t>Fig 3- Embedding-Based Sentiment Classifier</w:t>
       </w:r>
       <w:bookmarkEnd w:id="26"/>
     </w:p>
@@ -5174,12 +5746,13 @@
       <w:r>
         <w:rPr>
           <w:rFonts w:ascii="Times New Roman" w:hAnsi="Times New Roman" w:cs="Times New Roman"/>
+          <w:noProof/>
           <w:sz w:val="24"/>
           <w:szCs w:val="24"/>
           <w:lang w:val="en-KE"/>
         </w:rPr>
         <w:drawing>
-          <wp:inline distT="0" distB="0" distL="0" distR="0" wp14:anchorId="3DD9358D" wp14:editId="22A6262C">
+          <wp:inline distT="0" distB="0" distL="0" distR="0" wp14:anchorId="3DD9358D" wp14:editId="0E24CD16">
             <wp:extent cx="5943600" cy="2533015"/>
             <wp:effectExtent l="0" t="0" r="0" b="635"/>
             <wp:docPr id="825131349" name="Picture 5"/>
@@ -5238,33 +5811,15 @@
           <w:szCs w:val="24"/>
         </w:rPr>
       </w:pPr>
-      <w:bookmarkStart w:id="27" w:name="_Toc232646230"/>
-      <w:r>
-        <w:rPr>
-          <w:rFonts w:ascii="Times New Roman" w:hAnsi="Times New Roman" w:cs="Times New Roman"/>
-          <w:color w:val="auto"/>
-          <w:sz w:val="24"/>
-          <w:szCs w:val="24"/>
-        </w:rPr>
-        <w:t>Fig 4</w:t>
-      </w:r>
-      <w:r>
-        <w:rPr>
-          <w:rFonts w:ascii="Times New Roman" w:hAnsi="Times New Roman" w:cs="Times New Roman"/>
-          <w:color w:val="auto"/>
-          <w:sz w:val="24"/>
-          <w:szCs w:val="24"/>
-        </w:rPr>
-        <w:t>-</w:t>
-      </w:r>
-      <w:r>
-        <w:rPr>
-          <w:rFonts w:ascii="Times New Roman" w:hAnsi="Times New Roman" w:cs="Times New Roman"/>
-          <w:color w:val="auto"/>
-          <w:sz w:val="24"/>
-          <w:szCs w:val="24"/>
-        </w:rPr>
-        <w:t xml:space="preserve"> RNN vs LSTM Comparison</w:t>
+      <w:bookmarkStart w:id="27" w:name="_Toc233319138"/>
+      <w:r>
+        <w:rPr>
+          <w:rFonts w:ascii="Times New Roman" w:hAnsi="Times New Roman" w:cs="Times New Roman"/>
+          <w:color w:val="auto"/>
+          <w:sz w:val="24"/>
+          <w:szCs w:val="24"/>
+        </w:rPr>
+        <w:t>Fig 4- RNN vs LSTM Comparison</w:t>
       </w:r>
       <w:bookmarkEnd w:id="27"/>
     </w:p>
@@ -5287,7 +5842,7 @@
           <w:szCs w:val="24"/>
         </w:rPr>
       </w:pPr>
-      <w:bookmarkStart w:id="28" w:name="_Toc232646231"/>
+      <w:bookmarkStart w:id="28" w:name="_Toc233319139"/>
       <w:r>
         <w:rPr>
           <w:rFonts w:ascii="Times New Roman" w:hAnsi="Times New Roman" w:cs="Times New Roman"/>
@@ -5414,6 +5969,1179 @@
         </w:rPr>
         <w:t xml:space="preserve"> and LSTM were trained side by side, showing how the gating mechanism of LSTMs solves the vanishing gradient problem of simple RNNs.</w:t>
       </w:r>
+    </w:p>
+    <w:p>
+      <w:pPr>
+        <w:rPr>
+          <w:rFonts w:ascii="Times New Roman" w:hAnsi="Times New Roman" w:cs="Times New Roman"/>
+          <w:sz w:val="24"/>
+          <w:szCs w:val="24"/>
+        </w:rPr>
+      </w:pPr>
+    </w:p>
+    <w:p>
+      <w:pPr>
+        <w:rPr>
+          <w:rFonts w:ascii="Times New Roman" w:hAnsi="Times New Roman" w:cs="Times New Roman"/>
+          <w:sz w:val="24"/>
+          <w:szCs w:val="24"/>
+        </w:rPr>
+      </w:pPr>
+    </w:p>
+    <w:p>
+      <w:pPr>
+        <w:rPr>
+          <w:rFonts w:ascii="Times New Roman" w:hAnsi="Times New Roman" w:cs="Times New Roman"/>
+          <w:sz w:val="24"/>
+          <w:szCs w:val="24"/>
+        </w:rPr>
+      </w:pPr>
+    </w:p>
+    <w:p>
+      <w:pPr>
+        <w:rPr>
+          <w:rFonts w:ascii="Times New Roman" w:hAnsi="Times New Roman" w:cs="Times New Roman"/>
+          <w:sz w:val="24"/>
+          <w:szCs w:val="24"/>
+        </w:rPr>
+      </w:pPr>
+    </w:p>
+    <w:p>
+      <w:pPr>
+        <w:rPr>
+          <w:rFonts w:ascii="Times New Roman" w:hAnsi="Times New Roman" w:cs="Times New Roman"/>
+          <w:sz w:val="24"/>
+          <w:szCs w:val="24"/>
+        </w:rPr>
+      </w:pPr>
+    </w:p>
+    <w:p>
+      <w:pPr>
+        <w:rPr>
+          <w:rFonts w:ascii="Times New Roman" w:hAnsi="Times New Roman" w:cs="Times New Roman"/>
+          <w:sz w:val="24"/>
+          <w:szCs w:val="24"/>
+        </w:rPr>
+      </w:pPr>
+    </w:p>
+    <w:p>
+      <w:pPr>
+        <w:rPr>
+          <w:rFonts w:ascii="Times New Roman" w:hAnsi="Times New Roman" w:cs="Times New Roman"/>
+          <w:sz w:val="24"/>
+          <w:szCs w:val="24"/>
+        </w:rPr>
+      </w:pPr>
+    </w:p>
+    <w:p>
+      <w:pPr>
+        <w:rPr>
+          <w:rFonts w:ascii="Times New Roman" w:hAnsi="Times New Roman" w:cs="Times New Roman"/>
+          <w:sz w:val="24"/>
+          <w:szCs w:val="24"/>
+        </w:rPr>
+      </w:pPr>
+    </w:p>
+    <w:p>
+      <w:pPr>
+        <w:rPr>
+          <w:rFonts w:ascii="Times New Roman" w:hAnsi="Times New Roman" w:cs="Times New Roman"/>
+          <w:sz w:val="24"/>
+          <w:szCs w:val="24"/>
+        </w:rPr>
+      </w:pPr>
+    </w:p>
+    <w:p>
+      <w:pPr>
+        <w:rPr>
+          <w:rFonts w:ascii="Times New Roman" w:hAnsi="Times New Roman" w:cs="Times New Roman"/>
+          <w:sz w:val="24"/>
+          <w:szCs w:val="24"/>
+        </w:rPr>
+      </w:pPr>
+    </w:p>
+    <w:p>
+      <w:pPr>
+        <w:rPr>
+          <w:rFonts w:ascii="Times New Roman" w:hAnsi="Times New Roman" w:cs="Times New Roman"/>
+          <w:sz w:val="24"/>
+          <w:szCs w:val="24"/>
+        </w:rPr>
+      </w:pPr>
+    </w:p>
+    <w:p>
+      <w:pPr>
+        <w:rPr>
+          <w:rFonts w:ascii="Times New Roman" w:hAnsi="Times New Roman" w:cs="Times New Roman"/>
+          <w:sz w:val="24"/>
+          <w:szCs w:val="24"/>
+        </w:rPr>
+      </w:pPr>
+    </w:p>
+    <w:p>
+      <w:pPr>
+        <w:rPr>
+          <w:rFonts w:ascii="Times New Roman" w:hAnsi="Times New Roman" w:cs="Times New Roman"/>
+          <w:sz w:val="24"/>
+          <w:szCs w:val="24"/>
+        </w:rPr>
+      </w:pPr>
+    </w:p>
+    <w:p>
+      <w:pPr>
+        <w:rPr>
+          <w:rFonts w:ascii="Times New Roman" w:hAnsi="Times New Roman" w:cs="Times New Roman"/>
+          <w:sz w:val="24"/>
+          <w:szCs w:val="24"/>
+        </w:rPr>
+      </w:pPr>
+    </w:p>
+    <w:p>
+      <w:pPr>
+        <w:rPr>
+          <w:rFonts w:ascii="Times New Roman" w:hAnsi="Times New Roman" w:cs="Times New Roman"/>
+          <w:sz w:val="24"/>
+          <w:szCs w:val="24"/>
+        </w:rPr>
+      </w:pPr>
+    </w:p>
+    <w:p>
+      <w:pPr>
+        <w:rPr>
+          <w:rFonts w:ascii="Times New Roman" w:hAnsi="Times New Roman" w:cs="Times New Roman"/>
+          <w:sz w:val="24"/>
+          <w:szCs w:val="24"/>
+        </w:rPr>
+      </w:pPr>
+    </w:p>
+    <w:p>
+      <w:pPr>
+        <w:rPr>
+          <w:rFonts w:ascii="Times New Roman" w:hAnsi="Times New Roman" w:cs="Times New Roman"/>
+          <w:sz w:val="24"/>
+          <w:szCs w:val="24"/>
+        </w:rPr>
+      </w:pPr>
+    </w:p>
+    <w:p>
+      <w:pPr>
+        <w:rPr>
+          <w:rFonts w:ascii="Times New Roman" w:hAnsi="Times New Roman" w:cs="Times New Roman"/>
+          <w:sz w:val="24"/>
+          <w:szCs w:val="24"/>
+        </w:rPr>
+      </w:pPr>
+    </w:p>
+    <w:p>
+      <w:pPr>
+        <w:rPr>
+          <w:rFonts w:ascii="Times New Roman" w:hAnsi="Times New Roman" w:cs="Times New Roman"/>
+          <w:sz w:val="24"/>
+          <w:szCs w:val="24"/>
+        </w:rPr>
+      </w:pPr>
+    </w:p>
+    <w:p>
+      <w:pPr>
+        <w:rPr>
+          <w:rFonts w:ascii="Times New Roman" w:hAnsi="Times New Roman" w:cs="Times New Roman"/>
+          <w:sz w:val="24"/>
+          <w:szCs w:val="24"/>
+        </w:rPr>
+      </w:pPr>
+    </w:p>
+    <w:p>
+      <w:pPr>
+        <w:rPr>
+          <w:rFonts w:ascii="Times New Roman" w:hAnsi="Times New Roman" w:cs="Times New Roman"/>
+          <w:sz w:val="24"/>
+          <w:szCs w:val="24"/>
+        </w:rPr>
+      </w:pPr>
+    </w:p>
+    <w:p>
+      <w:pPr>
+        <w:rPr>
+          <w:rFonts w:ascii="Times New Roman" w:hAnsi="Times New Roman" w:cs="Times New Roman"/>
+          <w:sz w:val="24"/>
+          <w:szCs w:val="24"/>
+        </w:rPr>
+      </w:pPr>
+    </w:p>
+    <w:p>
+      <w:pPr>
+        <w:rPr>
+          <w:rFonts w:ascii="Times New Roman" w:hAnsi="Times New Roman" w:cs="Times New Roman"/>
+          <w:sz w:val="24"/>
+          <w:szCs w:val="24"/>
+        </w:rPr>
+      </w:pPr>
+    </w:p>
+    <w:p>
+      <w:pPr>
+        <w:rPr>
+          <w:rFonts w:ascii="Times New Roman" w:hAnsi="Times New Roman" w:cs="Times New Roman"/>
+          <w:sz w:val="24"/>
+          <w:szCs w:val="24"/>
+        </w:rPr>
+      </w:pPr>
+    </w:p>
+    <w:p>
+      <w:pPr>
+        <w:rPr>
+          <w:rFonts w:ascii="Times New Roman" w:hAnsi="Times New Roman" w:cs="Times New Roman"/>
+          <w:sz w:val="24"/>
+          <w:szCs w:val="24"/>
+        </w:rPr>
+      </w:pPr>
+    </w:p>
+    <w:p>
+      <w:pPr>
+        <w:pStyle w:val="Heading1"/>
+        <w:rPr>
+          <w:rFonts w:ascii="Times New Roman" w:hAnsi="Times New Roman" w:cs="Times New Roman"/>
+          <w:b/>
+          <w:bCs/>
+          <w:color w:val="auto"/>
+          <w:sz w:val="28"/>
+          <w:szCs w:val="28"/>
+        </w:rPr>
+      </w:pPr>
+      <w:bookmarkStart w:id="29" w:name="_Toc233319140"/>
+      <w:r>
+        <w:rPr>
+          <w:rFonts w:ascii="Times New Roman" w:hAnsi="Times New Roman" w:cs="Times New Roman"/>
+          <w:b/>
+          <w:bCs/>
+          <w:color w:val="auto"/>
+          <w:sz w:val="28"/>
+          <w:szCs w:val="28"/>
+        </w:rPr>
+        <w:lastRenderedPageBreak/>
+        <w:t>EXTRA WORK SECTION 6 WEEK 8</w:t>
+      </w:r>
+      <w:bookmarkEnd w:id="29"/>
+    </w:p>
+    <w:p>
+      <w:pPr>
+        <w:rPr>
+          <w:rFonts w:ascii="Times New Roman" w:hAnsi="Times New Roman" w:cs="Times New Roman"/>
+          <w:sz w:val="24"/>
+          <w:szCs w:val="24"/>
+          <w:lang w:val="en-KE"/>
+        </w:rPr>
+      </w:pPr>
+      <w:r>
+        <w:rPr>
+          <w:rFonts w:ascii="Times New Roman" w:hAnsi="Times New Roman" w:cs="Times New Roman"/>
+          <w:noProof/>
+          <w:sz w:val="24"/>
+          <w:szCs w:val="24"/>
+          <w:lang w:val="en-KE"/>
+        </w:rPr>
+        <w:drawing>
+          <wp:inline distT="0" distB="0" distL="0" distR="0" wp14:anchorId="250A45FE" wp14:editId="397BC6E0">
+            <wp:extent cx="5943600" cy="1729105"/>
+            <wp:effectExtent l="0" t="0" r="0" b="4445"/>
+            <wp:docPr id="742513365" name="Picture 1"/>
+            <wp:cNvGraphicFramePr>
+              <a:graphicFrameLocks xmlns:a="http://schemas.openxmlformats.org/drawingml/2006/main" noChangeAspect="1"/>
+            </wp:cNvGraphicFramePr>
+            <a:graphic xmlns:a="http://schemas.openxmlformats.org/drawingml/2006/main">
+              <a:graphicData uri="http://schemas.openxmlformats.org/drawingml/2006/picture">
+                <pic:pic xmlns:pic="http://schemas.openxmlformats.org/drawingml/2006/picture">
+                  <pic:nvPicPr>
+                    <pic:cNvPr id="0" name="Picture 1"/>
+                    <pic:cNvPicPr>
+                      <a:picLocks noChangeAspect="1" noChangeArrowheads="1"/>
+                    </pic:cNvPicPr>
+                  </pic:nvPicPr>
+                  <pic:blipFill>
+                    <a:blip r:embed="rId26">
+                      <a:extLst>
+                        <a:ext uri="{28A0092B-C50C-407E-A947-70E740481C1C}">
+                          <a14:useLocalDpi xmlns:a14="http://schemas.microsoft.com/office/drawing/2010/main" val="0"/>
+                        </a:ext>
+                      </a:extLst>
+                    </a:blip>
+                    <a:srcRect/>
+                    <a:stretch>
+                      <a:fillRect/>
+                    </a:stretch>
+                  </pic:blipFill>
+                  <pic:spPr bwMode="auto">
+                    <a:xfrm>
+                      <a:off x="0" y="0"/>
+                      <a:ext cx="5943600" cy="1729105"/>
+                    </a:xfrm>
+                    <a:prstGeom prst="rect">
+                      <a:avLst/>
+                    </a:prstGeom>
+                    <a:noFill/>
+                    <a:ln>
+                      <a:noFill/>
+                    </a:ln>
+                  </pic:spPr>
+                </pic:pic>
+              </a:graphicData>
+            </a:graphic>
+          </wp:inline>
+        </w:drawing>
+      </w:r>
+    </w:p>
+    <w:p>
+      <w:pPr>
+        <w:pStyle w:val="Heading2"/>
+        <w:rPr>
+          <w:rFonts w:ascii="Times New Roman" w:hAnsi="Times New Roman" w:cs="Times New Roman"/>
+          <w:color w:val="auto"/>
+          <w:sz w:val="24"/>
+          <w:szCs w:val="24"/>
+        </w:rPr>
+      </w:pPr>
+      <w:bookmarkStart w:id="30" w:name="_Toc233319141"/>
+      <w:r>
+        <w:rPr>
+          <w:rFonts w:ascii="Times New Roman" w:hAnsi="Times New Roman" w:cs="Times New Roman"/>
+          <w:color w:val="auto"/>
+          <w:sz w:val="24"/>
+          <w:szCs w:val="24"/>
+        </w:rPr>
+        <w:t>Fig 1- Installation Output</w:t>
+      </w:r>
+      <w:bookmarkEnd w:id="30"/>
+    </w:p>
+    <w:p>
+      <w:pPr>
+        <w:rPr>
+          <w:rFonts w:ascii="Times New Roman" w:hAnsi="Times New Roman" w:cs="Times New Roman"/>
+          <w:sz w:val="24"/>
+          <w:szCs w:val="24"/>
+          <w:lang w:val="en-KE"/>
+        </w:rPr>
+      </w:pPr>
+      <w:r>
+        <w:rPr>
+          <w:rFonts w:ascii="Times New Roman" w:hAnsi="Times New Roman" w:cs="Times New Roman"/>
+          <w:noProof/>
+          <w:sz w:val="24"/>
+          <w:szCs w:val="24"/>
+          <w:lang w:val="en-KE"/>
+        </w:rPr>
+        <w:drawing>
+          <wp:inline distT="0" distB="0" distL="0" distR="0" wp14:anchorId="1811618D" wp14:editId="39CCB231">
+            <wp:extent cx="5943600" cy="3594735"/>
+            <wp:effectExtent l="0" t="0" r="0" b="5715"/>
+            <wp:docPr id="317346511" name="Picture 2"/>
+            <wp:cNvGraphicFramePr>
+              <a:graphicFrameLocks xmlns:a="http://schemas.openxmlformats.org/drawingml/2006/main" noChangeAspect="1"/>
+            </wp:cNvGraphicFramePr>
+            <a:graphic xmlns:a="http://schemas.openxmlformats.org/drawingml/2006/main">
+              <a:graphicData uri="http://schemas.openxmlformats.org/drawingml/2006/picture">
+                <pic:pic xmlns:pic="http://schemas.openxmlformats.org/drawingml/2006/picture">
+                  <pic:nvPicPr>
+                    <pic:cNvPr id="0" name="Picture 3"/>
+                    <pic:cNvPicPr>
+                      <a:picLocks noChangeAspect="1" noChangeArrowheads="1"/>
+                    </pic:cNvPicPr>
+                  </pic:nvPicPr>
+                  <pic:blipFill>
+                    <a:blip r:embed="rId27">
+                      <a:extLst>
+                        <a:ext uri="{28A0092B-C50C-407E-A947-70E740481C1C}">
+                          <a14:useLocalDpi xmlns:a14="http://schemas.microsoft.com/office/drawing/2010/main" val="0"/>
+                        </a:ext>
+                      </a:extLst>
+                    </a:blip>
+                    <a:srcRect/>
+                    <a:stretch>
+                      <a:fillRect/>
+                    </a:stretch>
+                  </pic:blipFill>
+                  <pic:spPr bwMode="auto">
+                    <a:xfrm>
+                      <a:off x="0" y="0"/>
+                      <a:ext cx="5943600" cy="3594735"/>
+                    </a:xfrm>
+                    <a:prstGeom prst="rect">
+                      <a:avLst/>
+                    </a:prstGeom>
+                    <a:noFill/>
+                    <a:ln>
+                      <a:noFill/>
+                    </a:ln>
+                  </pic:spPr>
+                </pic:pic>
+              </a:graphicData>
+            </a:graphic>
+          </wp:inline>
+        </w:drawing>
+      </w:r>
+    </w:p>
+    <w:p>
+      <w:pPr>
+        <w:rPr>
+          <w:rFonts w:ascii="Times New Roman" w:hAnsi="Times New Roman" w:cs="Times New Roman"/>
+          <w:sz w:val="24"/>
+          <w:szCs w:val="24"/>
+        </w:rPr>
+      </w:pPr>
+    </w:p>
+    <w:p>
+      <w:pPr>
+        <w:rPr>
+          <w:rFonts w:ascii="Times New Roman" w:hAnsi="Times New Roman" w:cs="Times New Roman"/>
+          <w:sz w:val="24"/>
+          <w:szCs w:val="24"/>
+          <w:lang w:val="en-KE"/>
+        </w:rPr>
+      </w:pPr>
+      <w:r>
+        <w:rPr>
+          <w:rFonts w:ascii="Times New Roman" w:hAnsi="Times New Roman" w:cs="Times New Roman"/>
+          <w:noProof/>
+          <w:sz w:val="24"/>
+          <w:szCs w:val="24"/>
+          <w:lang w:val="en-KE"/>
+        </w:rPr>
+        <w:lastRenderedPageBreak/>
+        <w:drawing>
+          <wp:inline distT="0" distB="0" distL="0" distR="0" wp14:anchorId="50F5C81F" wp14:editId="58D47DDE">
+            <wp:extent cx="5943600" cy="3374390"/>
+            <wp:effectExtent l="0" t="0" r="0" b="0"/>
+            <wp:docPr id="826391195" name="Picture 3"/>
+            <wp:cNvGraphicFramePr>
+              <a:graphicFrameLocks xmlns:a="http://schemas.openxmlformats.org/drawingml/2006/main" noChangeAspect="1"/>
+            </wp:cNvGraphicFramePr>
+            <a:graphic xmlns:a="http://schemas.openxmlformats.org/drawingml/2006/main">
+              <a:graphicData uri="http://schemas.openxmlformats.org/drawingml/2006/picture">
+                <pic:pic xmlns:pic="http://schemas.openxmlformats.org/drawingml/2006/picture">
+                  <pic:nvPicPr>
+                    <pic:cNvPr id="0" name="Picture 5"/>
+                    <pic:cNvPicPr>
+                      <a:picLocks noChangeAspect="1" noChangeArrowheads="1"/>
+                    </pic:cNvPicPr>
+                  </pic:nvPicPr>
+                  <pic:blipFill>
+                    <a:blip r:embed="rId28">
+                      <a:extLst>
+                        <a:ext uri="{28A0092B-C50C-407E-A947-70E740481C1C}">
+                          <a14:useLocalDpi xmlns:a14="http://schemas.microsoft.com/office/drawing/2010/main" val="0"/>
+                        </a:ext>
+                      </a:extLst>
+                    </a:blip>
+                    <a:srcRect/>
+                    <a:stretch>
+                      <a:fillRect/>
+                    </a:stretch>
+                  </pic:blipFill>
+                  <pic:spPr bwMode="auto">
+                    <a:xfrm>
+                      <a:off x="0" y="0"/>
+                      <a:ext cx="5943600" cy="3374390"/>
+                    </a:xfrm>
+                    <a:prstGeom prst="rect">
+                      <a:avLst/>
+                    </a:prstGeom>
+                    <a:noFill/>
+                    <a:ln>
+                      <a:noFill/>
+                    </a:ln>
+                  </pic:spPr>
+                </pic:pic>
+              </a:graphicData>
+            </a:graphic>
+          </wp:inline>
+        </w:drawing>
+      </w:r>
+    </w:p>
+    <w:p>
+      <w:pPr>
+        <w:pStyle w:val="Heading2"/>
+        <w:rPr>
+          <w:rFonts w:ascii="Times New Roman" w:hAnsi="Times New Roman" w:cs="Times New Roman"/>
+          <w:color w:val="auto"/>
+          <w:sz w:val="24"/>
+          <w:szCs w:val="24"/>
+        </w:rPr>
+      </w:pPr>
+      <w:bookmarkStart w:id="31" w:name="_Toc233319142"/>
+      <w:r>
+        <w:rPr>
+          <w:rFonts w:ascii="Times New Roman" w:hAnsi="Times New Roman" w:cs="Times New Roman"/>
+          <w:color w:val="auto"/>
+          <w:sz w:val="24"/>
+          <w:szCs w:val="24"/>
+        </w:rPr>
+        <w:t>Fig 2- Five Transformer Pipelines</w:t>
+      </w:r>
+      <w:bookmarkEnd w:id="31"/>
+    </w:p>
+    <w:p>
+      <w:pPr>
+        <w:rPr>
+          <w:rFonts w:ascii="Times New Roman" w:hAnsi="Times New Roman" w:cs="Times New Roman"/>
+          <w:sz w:val="24"/>
+          <w:szCs w:val="24"/>
+          <w:lang w:val="en-KE"/>
+        </w:rPr>
+      </w:pPr>
+      <w:r>
+        <w:rPr>
+          <w:rFonts w:ascii="Times New Roman" w:hAnsi="Times New Roman" w:cs="Times New Roman"/>
+          <w:noProof/>
+          <w:sz w:val="24"/>
+          <w:szCs w:val="24"/>
+          <w:lang w:val="en-KE"/>
+        </w:rPr>
+        <w:drawing>
+          <wp:inline distT="0" distB="0" distL="0" distR="0" wp14:anchorId="31E45138" wp14:editId="0332CAB5">
+            <wp:extent cx="5943600" cy="3717925"/>
+            <wp:effectExtent l="0" t="0" r="0" b="0"/>
+            <wp:docPr id="1283617330" name="Picture 4"/>
+            <wp:cNvGraphicFramePr>
+              <a:graphicFrameLocks xmlns:a="http://schemas.openxmlformats.org/drawingml/2006/main" noChangeAspect="1"/>
+            </wp:cNvGraphicFramePr>
+            <a:graphic xmlns:a="http://schemas.openxmlformats.org/drawingml/2006/main">
+              <a:graphicData uri="http://schemas.openxmlformats.org/drawingml/2006/picture">
+                <pic:pic xmlns:pic="http://schemas.openxmlformats.org/drawingml/2006/picture">
+                  <pic:nvPicPr>
+                    <pic:cNvPr id="0" name="Picture 7"/>
+                    <pic:cNvPicPr>
+                      <a:picLocks noChangeAspect="1" noChangeArrowheads="1"/>
+                    </pic:cNvPicPr>
+                  </pic:nvPicPr>
+                  <pic:blipFill>
+                    <a:blip r:embed="rId29">
+                      <a:extLst>
+                        <a:ext uri="{28A0092B-C50C-407E-A947-70E740481C1C}">
+                          <a14:useLocalDpi xmlns:a14="http://schemas.microsoft.com/office/drawing/2010/main" val="0"/>
+                        </a:ext>
+                      </a:extLst>
+                    </a:blip>
+                    <a:srcRect/>
+                    <a:stretch>
+                      <a:fillRect/>
+                    </a:stretch>
+                  </pic:blipFill>
+                  <pic:spPr bwMode="auto">
+                    <a:xfrm>
+                      <a:off x="0" y="0"/>
+                      <a:ext cx="5943600" cy="3717925"/>
+                    </a:xfrm>
+                    <a:prstGeom prst="rect">
+                      <a:avLst/>
+                    </a:prstGeom>
+                    <a:noFill/>
+                    <a:ln>
+                      <a:noFill/>
+                    </a:ln>
+                  </pic:spPr>
+                </pic:pic>
+              </a:graphicData>
+            </a:graphic>
+          </wp:inline>
+        </w:drawing>
+      </w:r>
+    </w:p>
+    <w:p>
+      <w:pPr>
+        <w:rPr>
+          <w:rFonts w:ascii="Times New Roman" w:hAnsi="Times New Roman" w:cs="Times New Roman"/>
+          <w:sz w:val="24"/>
+          <w:szCs w:val="24"/>
+        </w:rPr>
+      </w:pPr>
+    </w:p>
+    <w:p>
+      <w:pPr>
+        <w:rPr>
+          <w:rFonts w:ascii="Times New Roman" w:hAnsi="Times New Roman" w:cs="Times New Roman"/>
+          <w:sz w:val="24"/>
+          <w:szCs w:val="24"/>
+          <w:lang w:val="en-KE"/>
+        </w:rPr>
+      </w:pPr>
+      <w:r>
+        <w:rPr>
+          <w:rFonts w:ascii="Times New Roman" w:hAnsi="Times New Roman" w:cs="Times New Roman"/>
+          <w:noProof/>
+          <w:sz w:val="24"/>
+          <w:szCs w:val="24"/>
+          <w:lang w:val="en-KE"/>
+        </w:rPr>
+        <w:lastRenderedPageBreak/>
+        <w:drawing>
+          <wp:inline distT="0" distB="0" distL="0" distR="0" wp14:anchorId="1E925DC2" wp14:editId="1733B923">
+            <wp:extent cx="5943600" cy="2847975"/>
+            <wp:effectExtent l="0" t="0" r="0" b="9525"/>
+            <wp:docPr id="1834415677" name="Picture 5"/>
+            <wp:cNvGraphicFramePr>
+              <a:graphicFrameLocks xmlns:a="http://schemas.openxmlformats.org/drawingml/2006/main" noChangeAspect="1"/>
+            </wp:cNvGraphicFramePr>
+            <a:graphic xmlns:a="http://schemas.openxmlformats.org/drawingml/2006/main">
+              <a:graphicData uri="http://schemas.openxmlformats.org/drawingml/2006/picture">
+                <pic:pic xmlns:pic="http://schemas.openxmlformats.org/drawingml/2006/picture">
+                  <pic:nvPicPr>
+                    <pic:cNvPr id="0" name="Picture 9"/>
+                    <pic:cNvPicPr>
+                      <a:picLocks noChangeAspect="1" noChangeArrowheads="1"/>
+                    </pic:cNvPicPr>
+                  </pic:nvPicPr>
+                  <pic:blipFill>
+                    <a:blip r:embed="rId30">
+                      <a:extLst>
+                        <a:ext uri="{28A0092B-C50C-407E-A947-70E740481C1C}">
+                          <a14:useLocalDpi xmlns:a14="http://schemas.microsoft.com/office/drawing/2010/main" val="0"/>
+                        </a:ext>
+                      </a:extLst>
+                    </a:blip>
+                    <a:srcRect/>
+                    <a:stretch>
+                      <a:fillRect/>
+                    </a:stretch>
+                  </pic:blipFill>
+                  <pic:spPr bwMode="auto">
+                    <a:xfrm>
+                      <a:off x="0" y="0"/>
+                      <a:ext cx="5943600" cy="2847975"/>
+                    </a:xfrm>
+                    <a:prstGeom prst="rect">
+                      <a:avLst/>
+                    </a:prstGeom>
+                    <a:noFill/>
+                    <a:ln>
+                      <a:noFill/>
+                    </a:ln>
+                  </pic:spPr>
+                </pic:pic>
+              </a:graphicData>
+            </a:graphic>
+          </wp:inline>
+        </w:drawing>
+      </w:r>
+    </w:p>
+    <w:p>
+      <w:pPr>
+        <w:rPr>
+          <w:rFonts w:ascii="Times New Roman" w:hAnsi="Times New Roman" w:cs="Times New Roman"/>
+          <w:sz w:val="24"/>
+          <w:szCs w:val="24"/>
+        </w:rPr>
+      </w:pPr>
+    </w:p>
+    <w:p>
+      <w:pPr>
+        <w:rPr>
+          <w:rFonts w:ascii="Times New Roman" w:hAnsi="Times New Roman" w:cs="Times New Roman"/>
+          <w:sz w:val="24"/>
+          <w:szCs w:val="24"/>
+          <w:lang w:val="en-KE"/>
+        </w:rPr>
+      </w:pPr>
+      <w:r>
+        <w:rPr>
+          <w:rFonts w:ascii="Times New Roman" w:hAnsi="Times New Roman" w:cs="Times New Roman"/>
+          <w:noProof/>
+          <w:sz w:val="24"/>
+          <w:szCs w:val="24"/>
+          <w:lang w:val="en-KE"/>
+        </w:rPr>
+        <w:drawing>
+          <wp:inline distT="0" distB="0" distL="0" distR="0" wp14:anchorId="031E8D3F" wp14:editId="5AA52FBA">
+            <wp:extent cx="5943600" cy="2239010"/>
+            <wp:effectExtent l="0" t="0" r="0" b="8890"/>
+            <wp:docPr id="1942605220" name="Picture 6"/>
+            <wp:cNvGraphicFramePr>
+              <a:graphicFrameLocks xmlns:a="http://schemas.openxmlformats.org/drawingml/2006/main" noChangeAspect="1"/>
+            </wp:cNvGraphicFramePr>
+            <a:graphic xmlns:a="http://schemas.openxmlformats.org/drawingml/2006/main">
+              <a:graphicData uri="http://schemas.openxmlformats.org/drawingml/2006/picture">
+                <pic:pic xmlns:pic="http://schemas.openxmlformats.org/drawingml/2006/picture">
+                  <pic:nvPicPr>
+                    <pic:cNvPr id="0" name="Picture 11"/>
+                    <pic:cNvPicPr>
+                      <a:picLocks noChangeAspect="1" noChangeArrowheads="1"/>
+                    </pic:cNvPicPr>
+                  </pic:nvPicPr>
+                  <pic:blipFill>
+                    <a:blip r:embed="rId31" cstate="print">
+                      <a:extLst>
+                        <a:ext uri="{28A0092B-C50C-407E-A947-70E740481C1C}">
+                          <a14:useLocalDpi xmlns:a14="http://schemas.microsoft.com/office/drawing/2010/main" val="0"/>
+                        </a:ext>
+                      </a:extLst>
+                    </a:blip>
+                    <a:srcRect/>
+                    <a:stretch>
+                      <a:fillRect/>
+                    </a:stretch>
+                  </pic:blipFill>
+                  <pic:spPr bwMode="auto">
+                    <a:xfrm>
+                      <a:off x="0" y="0"/>
+                      <a:ext cx="5943600" cy="2239010"/>
+                    </a:xfrm>
+                    <a:prstGeom prst="rect">
+                      <a:avLst/>
+                    </a:prstGeom>
+                    <a:noFill/>
+                    <a:ln>
+                      <a:noFill/>
+                    </a:ln>
+                  </pic:spPr>
+                </pic:pic>
+              </a:graphicData>
+            </a:graphic>
+          </wp:inline>
+        </w:drawing>
+      </w:r>
+    </w:p>
+    <w:p>
+      <w:pPr>
+        <w:rPr>
+          <w:rFonts w:ascii="Times New Roman" w:hAnsi="Times New Roman" w:cs="Times New Roman"/>
+          <w:sz w:val="24"/>
+          <w:szCs w:val="24"/>
+        </w:rPr>
+      </w:pPr>
+    </w:p>
+    <w:p>
+      <w:pPr>
+        <w:rPr>
+          <w:rFonts w:ascii="Times New Roman" w:hAnsi="Times New Roman" w:cs="Times New Roman"/>
+          <w:sz w:val="24"/>
+          <w:szCs w:val="24"/>
+          <w:lang w:val="en-KE"/>
+        </w:rPr>
+      </w:pPr>
+      <w:r>
+        <w:rPr>
+          <w:rFonts w:ascii="Times New Roman" w:hAnsi="Times New Roman" w:cs="Times New Roman"/>
+          <w:noProof/>
+          <w:sz w:val="24"/>
+          <w:szCs w:val="24"/>
+          <w:lang w:val="en-KE"/>
+        </w:rPr>
+        <w:lastRenderedPageBreak/>
+        <w:drawing>
+          <wp:inline distT="0" distB="0" distL="0" distR="0" wp14:anchorId="140B9E46" wp14:editId="29C73767">
+            <wp:extent cx="5943600" cy="2336800"/>
+            <wp:effectExtent l="0" t="0" r="0" b="6350"/>
+            <wp:docPr id="1123701233" name="Picture 7"/>
+            <wp:cNvGraphicFramePr>
+              <a:graphicFrameLocks xmlns:a="http://schemas.openxmlformats.org/drawingml/2006/main" noChangeAspect="1"/>
+            </wp:cNvGraphicFramePr>
+            <a:graphic xmlns:a="http://schemas.openxmlformats.org/drawingml/2006/main">
+              <a:graphicData uri="http://schemas.openxmlformats.org/drawingml/2006/picture">
+                <pic:pic xmlns:pic="http://schemas.openxmlformats.org/drawingml/2006/picture">
+                  <pic:nvPicPr>
+                    <pic:cNvPr id="0" name="Picture 13"/>
+                    <pic:cNvPicPr>
+                      <a:picLocks noChangeAspect="1" noChangeArrowheads="1"/>
+                    </pic:cNvPicPr>
+                  </pic:nvPicPr>
+                  <pic:blipFill>
+                    <a:blip r:embed="rId32" cstate="print">
+                      <a:extLst>
+                        <a:ext uri="{28A0092B-C50C-407E-A947-70E740481C1C}">
+                          <a14:useLocalDpi xmlns:a14="http://schemas.microsoft.com/office/drawing/2010/main" val="0"/>
+                        </a:ext>
+                      </a:extLst>
+                    </a:blip>
+                    <a:srcRect/>
+                    <a:stretch>
+                      <a:fillRect/>
+                    </a:stretch>
+                  </pic:blipFill>
+                  <pic:spPr bwMode="auto">
+                    <a:xfrm>
+                      <a:off x="0" y="0"/>
+                      <a:ext cx="5943600" cy="2336800"/>
+                    </a:xfrm>
+                    <a:prstGeom prst="rect">
+                      <a:avLst/>
+                    </a:prstGeom>
+                    <a:noFill/>
+                    <a:ln>
+                      <a:noFill/>
+                    </a:ln>
+                  </pic:spPr>
+                </pic:pic>
+              </a:graphicData>
+            </a:graphic>
+          </wp:inline>
+        </w:drawing>
+      </w:r>
+    </w:p>
+    <w:p>
+      <w:pPr>
+        <w:pStyle w:val="Heading2"/>
+        <w:rPr>
+          <w:rFonts w:ascii="Times New Roman" w:hAnsi="Times New Roman" w:cs="Times New Roman"/>
+          <w:color w:val="auto"/>
+          <w:sz w:val="24"/>
+          <w:szCs w:val="24"/>
+        </w:rPr>
+      </w:pPr>
+      <w:bookmarkStart w:id="32" w:name="_Toc233319143"/>
+      <w:r>
+        <w:rPr>
+          <w:rFonts w:ascii="Times New Roman" w:hAnsi="Times New Roman" w:cs="Times New Roman"/>
+          <w:color w:val="auto"/>
+          <w:sz w:val="24"/>
+          <w:szCs w:val="24"/>
+        </w:rPr>
+        <w:t>Fig 3- BERT vs GPT-2 Comparison</w:t>
+      </w:r>
+      <w:bookmarkEnd w:id="32"/>
+    </w:p>
+    <w:p>
+      <w:pPr>
+        <w:rPr>
+          <w:rFonts w:ascii="Times New Roman" w:hAnsi="Times New Roman" w:cs="Times New Roman"/>
+          <w:sz w:val="24"/>
+          <w:szCs w:val="24"/>
+          <w:lang w:val="en-KE"/>
+        </w:rPr>
+      </w:pPr>
+      <w:r>
+        <w:rPr>
+          <w:rFonts w:ascii="Times New Roman" w:hAnsi="Times New Roman" w:cs="Times New Roman"/>
+          <w:noProof/>
+          <w:sz w:val="24"/>
+          <w:szCs w:val="24"/>
+          <w:lang w:val="en-KE"/>
+        </w:rPr>
+        <w:drawing>
+          <wp:inline distT="0" distB="0" distL="0" distR="0" wp14:anchorId="282150D5" wp14:editId="3CA890C9">
+            <wp:extent cx="5943600" cy="2111375"/>
+            <wp:effectExtent l="0" t="0" r="0" b="3175"/>
+            <wp:docPr id="2024802357" name="Picture 8"/>
+            <wp:cNvGraphicFramePr>
+              <a:graphicFrameLocks xmlns:a="http://schemas.openxmlformats.org/drawingml/2006/main" noChangeAspect="1"/>
+            </wp:cNvGraphicFramePr>
+            <a:graphic xmlns:a="http://schemas.openxmlformats.org/drawingml/2006/main">
+              <a:graphicData uri="http://schemas.openxmlformats.org/drawingml/2006/picture">
+                <pic:pic xmlns:pic="http://schemas.openxmlformats.org/drawingml/2006/picture">
+                  <pic:nvPicPr>
+                    <pic:cNvPr id="0" name="Picture 15"/>
+                    <pic:cNvPicPr>
+                      <a:picLocks noChangeAspect="1" noChangeArrowheads="1"/>
+                    </pic:cNvPicPr>
+                  </pic:nvPicPr>
+                  <pic:blipFill>
+                    <a:blip r:embed="rId33" cstate="print">
+                      <a:extLst>
+                        <a:ext uri="{28A0092B-C50C-407E-A947-70E740481C1C}">
+                          <a14:useLocalDpi xmlns:a14="http://schemas.microsoft.com/office/drawing/2010/main" val="0"/>
+                        </a:ext>
+                      </a:extLst>
+                    </a:blip>
+                    <a:srcRect/>
+                    <a:stretch>
+                      <a:fillRect/>
+                    </a:stretch>
+                  </pic:blipFill>
+                  <pic:spPr bwMode="auto">
+                    <a:xfrm>
+                      <a:off x="0" y="0"/>
+                      <a:ext cx="5943600" cy="2111375"/>
+                    </a:xfrm>
+                    <a:prstGeom prst="rect">
+                      <a:avLst/>
+                    </a:prstGeom>
+                    <a:noFill/>
+                    <a:ln>
+                      <a:noFill/>
+                    </a:ln>
+                  </pic:spPr>
+                </pic:pic>
+              </a:graphicData>
+            </a:graphic>
+          </wp:inline>
+        </w:drawing>
+      </w:r>
+    </w:p>
+    <w:p>
+      <w:pPr>
+        <w:rPr>
+          <w:rFonts w:ascii="Times New Roman" w:hAnsi="Times New Roman" w:cs="Times New Roman"/>
+          <w:sz w:val="24"/>
+          <w:szCs w:val="24"/>
+        </w:rPr>
+      </w:pPr>
+    </w:p>
+    <w:p>
+      <w:pPr>
+        <w:rPr>
+          <w:rFonts w:ascii="Times New Roman" w:hAnsi="Times New Roman" w:cs="Times New Roman"/>
+          <w:sz w:val="24"/>
+          <w:szCs w:val="24"/>
+          <w:lang w:val="en-KE"/>
+        </w:rPr>
+      </w:pPr>
+      <w:r>
+        <w:rPr>
+          <w:rFonts w:ascii="Times New Roman" w:hAnsi="Times New Roman" w:cs="Times New Roman"/>
+          <w:noProof/>
+          <w:sz w:val="24"/>
+          <w:szCs w:val="24"/>
+          <w:lang w:val="en-KE"/>
+        </w:rPr>
+        <w:drawing>
+          <wp:inline distT="0" distB="0" distL="0" distR="0" wp14:anchorId="77247AAF" wp14:editId="23F5273F">
+            <wp:extent cx="5943600" cy="2400935"/>
+            <wp:effectExtent l="0" t="0" r="0" b="0"/>
+            <wp:docPr id="1765205765" name="Picture 9"/>
+            <wp:cNvGraphicFramePr>
+              <a:graphicFrameLocks xmlns:a="http://schemas.openxmlformats.org/drawingml/2006/main" noChangeAspect="1"/>
+            </wp:cNvGraphicFramePr>
+            <a:graphic xmlns:a="http://schemas.openxmlformats.org/drawingml/2006/main">
+              <a:graphicData uri="http://schemas.openxmlformats.org/drawingml/2006/picture">
+                <pic:pic xmlns:pic="http://schemas.openxmlformats.org/drawingml/2006/picture">
+                  <pic:nvPicPr>
+                    <pic:cNvPr id="0" name="Picture 17"/>
+                    <pic:cNvPicPr>
+                      <a:picLocks noChangeAspect="1" noChangeArrowheads="1"/>
+                    </pic:cNvPicPr>
+                  </pic:nvPicPr>
+                  <pic:blipFill>
+                    <a:blip r:embed="rId34" cstate="print">
+                      <a:extLst>
+                        <a:ext uri="{28A0092B-C50C-407E-A947-70E740481C1C}">
+                          <a14:useLocalDpi xmlns:a14="http://schemas.microsoft.com/office/drawing/2010/main" val="0"/>
+                        </a:ext>
+                      </a:extLst>
+                    </a:blip>
+                    <a:srcRect/>
+                    <a:stretch>
+                      <a:fillRect/>
+                    </a:stretch>
+                  </pic:blipFill>
+                  <pic:spPr bwMode="auto">
+                    <a:xfrm>
+                      <a:off x="0" y="0"/>
+                      <a:ext cx="5943600" cy="2400935"/>
+                    </a:xfrm>
+                    <a:prstGeom prst="rect">
+                      <a:avLst/>
+                    </a:prstGeom>
+                    <a:noFill/>
+                    <a:ln>
+                      <a:noFill/>
+                    </a:ln>
+                  </pic:spPr>
+                </pic:pic>
+              </a:graphicData>
+            </a:graphic>
+          </wp:inline>
+        </w:drawing>
+      </w:r>
+    </w:p>
+    <w:p>
+      <w:pPr>
+        <w:rPr>
+          <w:rFonts w:ascii="Times New Roman" w:hAnsi="Times New Roman" w:cs="Times New Roman"/>
+          <w:sz w:val="24"/>
+          <w:szCs w:val="24"/>
+        </w:rPr>
+      </w:pPr>
+    </w:p>
+    <w:p>
+      <w:pPr>
+        <w:rPr>
+          <w:rFonts w:ascii="Times New Roman" w:hAnsi="Times New Roman" w:cs="Times New Roman"/>
+          <w:sz w:val="24"/>
+          <w:szCs w:val="24"/>
+          <w:lang w:val="en-KE"/>
+        </w:rPr>
+      </w:pPr>
+      <w:r>
+        <w:rPr>
+          <w:rFonts w:ascii="Times New Roman" w:hAnsi="Times New Roman" w:cs="Times New Roman"/>
+          <w:noProof/>
+          <w:sz w:val="24"/>
+          <w:szCs w:val="24"/>
+          <w:lang w:val="en-KE"/>
+        </w:rPr>
+        <w:lastRenderedPageBreak/>
+        <w:drawing>
+          <wp:inline distT="0" distB="0" distL="0" distR="0" wp14:anchorId="727A049D" wp14:editId="1E568BB3">
+            <wp:extent cx="5943600" cy="1852295"/>
+            <wp:effectExtent l="0" t="0" r="0" b="0"/>
+            <wp:docPr id="1803302753" name="Picture 10"/>
+            <wp:cNvGraphicFramePr>
+              <a:graphicFrameLocks xmlns:a="http://schemas.openxmlformats.org/drawingml/2006/main" noChangeAspect="1"/>
+            </wp:cNvGraphicFramePr>
+            <a:graphic xmlns:a="http://schemas.openxmlformats.org/drawingml/2006/main">
+              <a:graphicData uri="http://schemas.openxmlformats.org/drawingml/2006/picture">
+                <pic:pic xmlns:pic="http://schemas.openxmlformats.org/drawingml/2006/picture">
+                  <pic:nvPicPr>
+                    <pic:cNvPr id="0" name="Picture 19"/>
+                    <pic:cNvPicPr>
+                      <a:picLocks noChangeAspect="1" noChangeArrowheads="1"/>
+                    </pic:cNvPicPr>
+                  </pic:nvPicPr>
+                  <pic:blipFill>
+                    <a:blip r:embed="rId35">
+                      <a:extLst>
+                        <a:ext uri="{28A0092B-C50C-407E-A947-70E740481C1C}">
+                          <a14:useLocalDpi xmlns:a14="http://schemas.microsoft.com/office/drawing/2010/main" val="0"/>
+                        </a:ext>
+                      </a:extLst>
+                    </a:blip>
+                    <a:srcRect/>
+                    <a:stretch>
+                      <a:fillRect/>
+                    </a:stretch>
+                  </pic:blipFill>
+                  <pic:spPr bwMode="auto">
+                    <a:xfrm>
+                      <a:off x="0" y="0"/>
+                      <a:ext cx="5943600" cy="1852295"/>
+                    </a:xfrm>
+                    <a:prstGeom prst="rect">
+                      <a:avLst/>
+                    </a:prstGeom>
+                    <a:noFill/>
+                    <a:ln>
+                      <a:noFill/>
+                    </a:ln>
+                  </pic:spPr>
+                </pic:pic>
+              </a:graphicData>
+            </a:graphic>
+          </wp:inline>
+        </w:drawing>
+      </w:r>
+    </w:p>
+    <w:p>
+      <w:pPr>
+        <w:pStyle w:val="Heading2"/>
+        <w:rPr>
+          <w:rFonts w:ascii="Times New Roman" w:hAnsi="Times New Roman" w:cs="Times New Roman"/>
+          <w:color w:val="auto"/>
+          <w:sz w:val="24"/>
+          <w:szCs w:val="24"/>
+        </w:rPr>
+      </w:pPr>
+      <w:bookmarkStart w:id="33" w:name="_Toc233319144"/>
+      <w:r>
+        <w:rPr>
+          <w:rFonts w:ascii="Times New Roman" w:hAnsi="Times New Roman" w:cs="Times New Roman"/>
+          <w:color w:val="auto"/>
+          <w:sz w:val="24"/>
+          <w:szCs w:val="24"/>
+        </w:rPr>
+        <w:t>Fig 4- Transformer Spam Detection</w:t>
+      </w:r>
+      <w:bookmarkEnd w:id="33"/>
+    </w:p>
+    <w:p>
+      <w:pPr>
+        <w:rPr>
+          <w:rFonts w:ascii="Times New Roman" w:hAnsi="Times New Roman" w:cs="Times New Roman"/>
+          <w:sz w:val="24"/>
+          <w:szCs w:val="24"/>
+        </w:rPr>
+      </w:pPr>
+    </w:p>
+    <w:p>
+      <w:pPr>
+        <w:pStyle w:val="Heading2"/>
+        <w:rPr>
+          <w:rFonts w:ascii="Times New Roman" w:hAnsi="Times New Roman" w:cs="Times New Roman"/>
+          <w:color w:val="auto"/>
+          <w:sz w:val="24"/>
+          <w:szCs w:val="24"/>
+        </w:rPr>
+      </w:pPr>
+      <w:bookmarkStart w:id="34" w:name="_Toc233319145"/>
+      <w:r>
+        <w:rPr>
+          <w:rFonts w:ascii="Times New Roman" w:hAnsi="Times New Roman" w:cs="Times New Roman"/>
+          <w:color w:val="auto"/>
+          <w:sz w:val="24"/>
+          <w:szCs w:val="24"/>
+        </w:rPr>
+        <w:t>SUMMARY</w:t>
+      </w:r>
+      <w:bookmarkEnd w:id="34"/>
+    </w:p>
+    <w:p>
+      <w:pPr>
+        <w:rPr>
+          <w:rFonts w:ascii="Times New Roman" w:hAnsi="Times New Roman" w:cs="Times New Roman"/>
+          <w:sz w:val="24"/>
+          <w:szCs w:val="24"/>
+        </w:rPr>
+      </w:pPr>
+      <w:r>
+        <w:rPr>
+          <w:rFonts w:ascii="Times New Roman" w:hAnsi="Times New Roman" w:cs="Times New Roman"/>
+          <w:sz w:val="24"/>
+          <w:szCs w:val="24"/>
+        </w:rPr>
+        <w:t>In Extra Work 1, five different pipelines for sentiment analysis, NER, summarization, question answering</w:t>
+      </w:r>
+      <w:r>
+        <w:rPr>
+          <w:rFonts w:ascii="Times New Roman" w:hAnsi="Times New Roman" w:cs="Times New Roman"/>
+          <w:sz w:val="24"/>
+          <w:szCs w:val="24"/>
+        </w:rPr>
+        <w:t xml:space="preserve"> </w:t>
+      </w:r>
+      <w:r>
+        <w:rPr>
+          <w:rFonts w:ascii="Times New Roman" w:hAnsi="Times New Roman" w:cs="Times New Roman"/>
+          <w:sz w:val="24"/>
+          <w:szCs w:val="24"/>
+        </w:rPr>
+        <w:t>and zero-shot classification of text were implemented using a Hugging Face library to show that one library could be used for nearly all the NLP tasks studied so far this semester. In Extra Work 2, BERT and GPT-2 were compared as two different architectures</w:t>
+      </w:r>
+      <w:r>
+        <w:rPr>
+          <w:rFonts w:ascii="Times New Roman" w:hAnsi="Times New Roman" w:cs="Times New Roman"/>
+          <w:sz w:val="24"/>
+          <w:szCs w:val="24"/>
+        </w:rPr>
+        <w:t>,</w:t>
+      </w:r>
+      <w:r>
+        <w:rPr>
+          <w:rFonts w:ascii="Times New Roman" w:hAnsi="Times New Roman" w:cs="Times New Roman"/>
+          <w:sz w:val="24"/>
+          <w:szCs w:val="24"/>
+        </w:rPr>
+        <w:t xml:space="preserve"> encoder and decoder; the latter generates text in the "left to right" direction while the former understands text "left to right". Extra Work 3 compared Transformer performance against Naive Bayes baseline</w:t>
+      </w:r>
+      <w:r>
+        <w:rPr>
+          <w:rFonts w:ascii="Times New Roman" w:hAnsi="Times New Roman" w:cs="Times New Roman"/>
+          <w:sz w:val="24"/>
+          <w:szCs w:val="24"/>
+        </w:rPr>
+        <w:t xml:space="preserve"> </w:t>
+      </w:r>
+      <w:r>
+        <w:rPr>
+          <w:rFonts w:ascii="Times New Roman" w:hAnsi="Times New Roman" w:cs="Times New Roman"/>
+          <w:sz w:val="24"/>
+          <w:szCs w:val="24"/>
+        </w:rPr>
+        <w:t>and concretely explained why BERT understands text bidirectionally, whereas GPT-2 generates it "left to right". Extra Work 3 applied zero-shot Transformer classification to the same SMS messages from Project 1, comparing Transformer performance against Naive Bayes baseline and explaining the trade-offs between lightweight traditional models and powerful but computationally expensive Transformer approaches.</w:t>
+      </w:r>
+    </w:p>
+    <w:p>
+      <w:pPr>
+        <w:rPr>
+          <w:rFonts w:ascii="Times New Roman" w:hAnsi="Times New Roman" w:cs="Times New Roman"/>
+          <w:sz w:val="24"/>
+          <w:szCs w:val="24"/>
+        </w:rPr>
+      </w:pPr>
     </w:p>
     <w:sectPr>
       <w:pgSz w:w="12240" w:h="15840"/>
@@ -5871,6 +7599,7 @@
   <w:style w:type="character" w:default="1" w:styleId="DefaultParagraphFont">
     <w:name w:val="Default Paragraph Font"/>
     <w:uiPriority w:val="1"/>
+    <w:semiHidden/>
     <w:unhideWhenUsed/>
   </w:style>
   <w:style w:type="table" w:default="1" w:styleId="TableNormal">

</xml_diff>